<commit_message>
Add ArtCommissionApp complaint themes and art brief labor costs
Co-Authored-By: Claude Opus 5 <noreply@anthropic.com>
</commit_message>
<xml_diff>
--- a/10_ArtCommissionApp/ResearchAgents/ArtCommissionApp_Research.docx
+++ b/10_ArtCommissionApp/ResearchAgents/ArtCommissionApp_Research.docx
@@ -71,6 +71,17 @@
       </w:pPr>
       <w:r>
         <w:t xml:space="preserve">Section 1 — Opportunity Scan: who has the art-commissioning problem, how many, what they use today, complaints about current tools, and what AI actually changed. *(Added Sept 22, 2026)*</w:t>
+      </w:r>
+    </w:p>
+    <w:p>
+      <w:pPr>
+        <w:numPr>
+          <w:ilvl w:val="0"/>
+          <w:numId w:val="1"/>
+        </w:numPr>
+      </w:pPr>
+      <w:r>
+        <w:t xml:space="preserve">Section 2 — Complaint Themes &amp; What Humans Are Paid: six themes from 390 feature-analog reviews, plus what art advisors and producers charge to compile a brief. *(Added Sept 22, 2026)*</w:t>
       </w:r>
     </w:p>
     <w:p>
@@ -4362,6 +4373,2941 @@
                 <w:sz w:val="18"/>
               </w:rPr>
               <w:t xml:space="preserve"> sales; hybrid and dealer-website sales are counted elsewhere, so this is not the whole of "art sold online."</w:t>
+            </w:r>
+          </w:p>
+        </w:tc>
+      </w:tr>
+    </w:tbl>
+    <w:p>
+      <w:pPr>
+        <w:spacing w:after="0"/>
+      </w:pPr>
+    </w:p>
+    <w:p>
+      <w:r>
+        <w:br w:type="page"/>
+      </w:r>
+    </w:p>
+    <w:p>
+      <w:pPr>
+        <w:pStyle w:val="Title"/>
+      </w:pPr>
+      <w:r>
+        <w:t xml:space="preserve">Complaint Themes &amp; What Humans Are Paid to Compile Art Briefs</w:t>
+      </w:r>
+    </w:p>
+    <w:p>
+      <w:r>
+        <w:rPr>
+          <w:b/>
+        </w:rPr>
+        <w:t xml:space="preserve">Prepared:</w:t>
+      </w:r>
+      <w:r>
+        <w:t xml:space="preserve"> September 22, 2026</w:t>
+      </w:r>
+    </w:p>
+    <w:p>
+      <w:r>
+        <w:rPr>
+          <w:b/>
+        </w:rPr>
+        <w:t xml:space="preserve">Scope:</w:t>
+      </w:r>
+      <w:r>
+        <w:t xml:space="preserve"> Complaints from the last 18 months (since March 22, 2025) about apps offering your feature set — photograph the space, choose size/color/theme/texture, upload inspiration, vetted artists, AI-generated brief with a human making the final work — plus what companies pay humans to do that briefing work.</w:t>
+      </w:r>
+    </w:p>
+    <w:p>
+      <w:pPr>
+        <w:ind w:left="360"/>
+        <w:pBdr>
+          <w:left w:val="single" w:sz="18" w:space="8" w:color="9AA0A6"/>
+        </w:pBdr>
+      </w:pPr>
+      <w:r>
+        <w:rPr>
+          <w:b/>
+        </w:rPr>
+        <w:t xml:space="preserve">Access note.</w:t>
+      </w:r>
+      <w:r>
+        <w:t xml:space="preserve"> Reddit is blocked (the biggest gap in this dossier — commission culture lives there). G2 is blocked. Capterra covers gallery-management software sold to galleries, not these tools. Evidence is </w:t>
+      </w:r>
+      <w:r>
+        <w:rPr>
+          <w:b/>
+        </w:rPr>
+        <w:t xml:space="preserve">390 critical (≤3★) App Store reviews since March 22, 2025, across 13 apps</w:t>
+      </w:r>
+      <w:r>
+        <w:t xml:space="preserve">. Complaints are paraphrased with app, rating, date and handle; originals are in </w:t>
+      </w:r>
+      <w:hyperlink r:id="rHl30">
+        <w:r>
+          <w:rPr>
+            <w:rStyle w:val="Hyperlink"/>
+          </w:rPr>
+          <w:t xml:space="preserve">appstore-reviews-18mo.json</w:t>
+        </w:r>
+      </w:hyperlink>
+      <w:r>
+        <w:t xml:space="preserve">.</w:t>
+      </w:r>
+    </w:p>
+    <w:p>
+      <w:pPr>
+        <w:pBdr>
+          <w:bottom w:val="single" w:sz="6" w:space="6" w:color="C9CCD1"/>
+        </w:pBdr>
+      </w:pPr>
+    </w:p>
+    <w:p>
+      <w:pPr>
+        <w:pStyle w:val="Heading1"/>
+      </w:pPr>
+      <w:r>
+        <w:t xml:space="preserve">No app has all these features — so this uses four analog groups</w:t>
+      </w:r>
+    </w:p>
+    <w:p>
+      <w:r>
+        <w:t xml:space="preserve">I could not find a single product combining room capture, size/palette/theme selection, inspiration upload, credential-vetted artists and AI-brief-to-human-painting. </w:t>
+      </w:r>
+      <w:r>
+        <w:rPr>
+          <w:b/>
+        </w:rPr>
+        <w:t xml:space="preserve">The combined product does not exist.</w:t>
+      </w:r>
+      <w:r>
+        <w:t xml:space="preserve"> So the complaint evidence is grouped by the feature each analog actually ships:</w:t>
+      </w:r>
+    </w:p>
+    <w:tbl>
+      <w:tblPr>
+        <w:tblW w:w="10080" w:type="dxa"/>
+        <w:tblBorders>
+          <w:top w:val="single" w:sz="4" w:space="0" w:color="C9CCD1"/>
+          <w:left w:val="single" w:sz="4" w:space="0" w:color="C9CCD1"/>
+          <w:bottom w:val="single" w:sz="4" w:space="0" w:color="C9CCD1"/>
+          <w:right w:val="single" w:sz="4" w:space="0" w:color="C9CCD1"/>
+          <w:insideH w:val="single" w:sz="4" w:space="0" w:color="C9CCD1"/>
+          <w:insideV w:val="single" w:sz="4" w:space="0" w:color="C9CCD1"/>
+        </w:tblBorders>
+        <w:tblLayout w:type="fixed"/>
+      </w:tblPr>
+      <w:tblGrid>
+        <w:gridCol w:w="3360"/>
+        <w:gridCol w:w="3360"/>
+        <w:gridCol w:w="3360"/>
+      </w:tblGrid>
+      <w:tr>
+        <w:trPr>
+          <w:tblHeader/>
+        </w:trPr>
+        <w:tc>
+          <w:tcPr>
+            <w:tcW w:w="3360" w:type="dxa"/>
+            <w:shd w:val="clear" w:color="auto" w:fill="EFF1F3"/>
+          </w:tcPr>
+          <w:p>
+            <w:pPr>
+              <w:spacing w:before="40" w:after="40"/>
+            </w:pPr>
+            <w:r>
+              <w:rPr>
+                <w:b/>
+                <w:sz w:val="18"/>
+              </w:rPr>
+              <w:t xml:space="preserve">Feature in your spec</w:t>
+            </w:r>
+          </w:p>
+        </w:tc>
+        <w:tc>
+          <w:tcPr>
+            <w:tcW w:w="3360" w:type="dxa"/>
+            <w:shd w:val="clear" w:color="auto" w:fill="EFF1F3"/>
+          </w:tcPr>
+          <w:p>
+            <w:pPr>
+              <w:spacing w:before="40" w:after="40"/>
+            </w:pPr>
+            <w:r>
+              <w:rPr>
+                <w:b/>
+                <w:sz w:val="18"/>
+              </w:rPr>
+              <w:t xml:space="preserve">Analog apps used</w:t>
+            </w:r>
+          </w:p>
+        </w:tc>
+        <w:tc>
+          <w:tcPr>
+            <w:tcW w:w="3360" w:type="dxa"/>
+            <w:shd w:val="clear" w:color="auto" w:fill="EFF1F3"/>
+          </w:tcPr>
+          <w:p>
+            <w:pPr>
+              <w:spacing w:before="40" w:after="40"/>
+            </w:pPr>
+            <w:r>
+              <w:rPr>
+                <w:b/>
+                <w:sz w:val="18"/>
+              </w:rPr>
+              <w:t xml:space="preserve">Critical reviews in window</w:t>
+            </w:r>
+          </w:p>
+        </w:tc>
+      </w:tr>
+      <w:tr>
+        <w:tc>
+          <w:tcPr>
+            <w:tcW w:w="3360" w:type="dxa"/>
+          </w:tcPr>
+          <w:p>
+            <w:pPr>
+              <w:spacing w:before="40" w:after="40"/>
+            </w:pPr>
+            <w:r>
+              <w:rPr>
+                <w:b/>
+                <w:sz w:val="18"/>
+              </w:rPr>
+              <w:t xml:space="preserve">Photograph the space + AI transforms it</w:t>
+            </w:r>
+          </w:p>
+        </w:tc>
+        <w:tc>
+          <w:tcPr>
+            <w:tcW w:w="3360" w:type="dxa"/>
+          </w:tcPr>
+          <w:p>
+            <w:pPr>
+              <w:spacing w:before="40" w:after="40"/>
+            </w:pPr>
+            <w:r>
+              <w:rPr>
+                <w:sz w:val="18"/>
+              </w:rPr>
+              <w:t xml:space="preserve">Renovate AI, Home AI, Paint AI</w:t>
+            </w:r>
+          </w:p>
+        </w:tc>
+        <w:tc>
+          <w:tcPr>
+            <w:tcW w:w="3360" w:type="dxa"/>
+          </w:tcPr>
+          <w:p>
+            <w:pPr>
+              <w:spacing w:before="40" w:after="40"/>
+            </w:pPr>
+            <w:r>
+              <w:rPr>
+                <w:b/>
+                <w:sz w:val="18"/>
+              </w:rPr>
+              <w:t xml:space="preserve">174</w:t>
+            </w:r>
+          </w:p>
+        </w:tc>
+      </w:tr>
+      <w:tr>
+        <w:tc>
+          <w:tcPr>
+            <w:tcW w:w="3360" w:type="dxa"/>
+          </w:tcPr>
+          <w:p>
+            <w:pPr>
+              <w:spacing w:before="40" w:after="40"/>
+            </w:pPr>
+            <w:r>
+              <w:rPr>
+                <w:b/>
+                <w:sz w:val="18"/>
+              </w:rPr>
+              <w:t xml:space="preserve">See art at the right size on your wall</w:t>
+            </w:r>
+          </w:p>
+        </w:tc>
+        <w:tc>
+          <w:tcPr>
+            <w:tcW w:w="3360" w:type="dxa"/>
+          </w:tcPr>
+          <w:p>
+            <w:pPr>
+              <w:spacing w:before="40" w:after="40"/>
+            </w:pPr>
+            <w:r>
+              <w:rPr>
+                <w:sz w:val="18"/>
+              </w:rPr>
+              <w:t xml:space="preserve">Smartist, Artrooms, ArtStage</w:t>
+            </w:r>
+          </w:p>
+        </w:tc>
+        <w:tc>
+          <w:tcPr>
+            <w:tcW w:w="3360" w:type="dxa"/>
+          </w:tcPr>
+          <w:p>
+            <w:pPr>
+              <w:spacing w:before="40" w:after="40"/>
+            </w:pPr>
+            <w:r>
+              <w:rPr>
+                <w:b/>
+                <w:sz w:val="18"/>
+              </w:rPr>
+              <w:t xml:space="preserve">63</w:t>
+            </w:r>
+          </w:p>
+        </w:tc>
+      </w:tr>
+      <w:tr>
+        <w:tc>
+          <w:tcPr>
+            <w:tcW w:w="3360" w:type="dxa"/>
+          </w:tcPr>
+          <w:p>
+            <w:pPr>
+              <w:spacing w:before="40" w:after="40"/>
+            </w:pPr>
+            <w:r>
+              <w:rPr>
+                <w:b/>
+                <w:sz w:val="18"/>
+              </w:rPr>
+              <w:t xml:space="preserve">Commission a vetted human + escrow</w:t>
+            </w:r>
+          </w:p>
+        </w:tc>
+        <w:tc>
+          <w:tcPr>
+            <w:tcW w:w="3360" w:type="dxa"/>
+          </w:tcPr>
+          <w:p>
+            <w:pPr>
+              <w:spacing w:before="40" w:after="40"/>
+            </w:pPr>
+            <w:r>
+              <w:rPr>
+                <w:sz w:val="18"/>
+              </w:rPr>
+              <w:t xml:space="preserve">Fiverr</w:t>
+            </w:r>
+          </w:p>
+        </w:tc>
+        <w:tc>
+          <w:tcPr>
+            <w:tcW w:w="3360" w:type="dxa"/>
+          </w:tcPr>
+          <w:p>
+            <w:pPr>
+              <w:spacing w:before="40" w:after="40"/>
+            </w:pPr>
+            <w:r>
+              <w:rPr>
+                <w:b/>
+                <w:sz w:val="18"/>
+              </w:rPr>
+              <w:t xml:space="preserve">70</w:t>
+            </w:r>
+          </w:p>
+        </w:tc>
+      </w:tr>
+      <w:tr>
+        <w:tc>
+          <w:tcPr>
+            <w:tcW w:w="3360" w:type="dxa"/>
+          </w:tcPr>
+          <w:p>
+            <w:pPr>
+              <w:spacing w:before="40" w:after="40"/>
+            </w:pPr>
+            <w:r>
+              <w:rPr>
+                <w:b/>
+                <w:sz w:val="18"/>
+              </w:rPr>
+              <w:t xml:space="preserve">Artist community / AI-generated imagery / art as investment</w:t>
+            </w:r>
+          </w:p>
+        </w:tc>
+        <w:tc>
+          <w:tcPr>
+            <w:tcW w:w="3360" w:type="dxa"/>
+          </w:tcPr>
+          <w:p>
+            <w:pPr>
+              <w:spacing w:before="40" w:after="40"/>
+            </w:pPr>
+            <w:r>
+              <w:rPr>
+                <w:sz w:val="18"/>
+              </w:rPr>
+              <w:t xml:space="preserve">ArtStation, Artfol, Artist.ai, Peggy, Singulart, Masterworks</w:t>
+            </w:r>
+          </w:p>
+        </w:tc>
+        <w:tc>
+          <w:tcPr>
+            <w:tcW w:w="3360" w:type="dxa"/>
+          </w:tcPr>
+          <w:p>
+            <w:pPr>
+              <w:spacing w:before="40" w:after="40"/>
+            </w:pPr>
+            <w:r>
+              <w:rPr>
+                <w:b/>
+                <w:sz w:val="18"/>
+              </w:rPr>
+              <w:t xml:space="preserve">83</w:t>
+            </w:r>
+          </w:p>
+        </w:tc>
+      </w:tr>
+    </w:tbl>
+    <w:p>
+      <w:pPr>
+        <w:spacing w:after="0"/>
+      </w:pPr>
+    </w:p>
+    <w:p>
+      <w:pPr>
+        <w:pBdr>
+          <w:bottom w:val="single" w:sz="6" w:space="6" w:color="C9CCD1"/>
+        </w:pBdr>
+      </w:pPr>
+    </w:p>
+    <w:p>
+      <w:pPr>
+        <w:pStyle w:val="Heading1"/>
+      </w:pPr>
+      <w:r>
+        <w:t xml:space="preserve">The themes</w:t>
+      </w:r>
+    </w:p>
+    <w:tbl>
+      <w:tblPr>
+        <w:tblW w:w="10080" w:type="dxa"/>
+        <w:tblBorders>
+          <w:top w:val="single" w:sz="4" w:space="0" w:color="C9CCD1"/>
+          <w:left w:val="single" w:sz="4" w:space="0" w:color="C9CCD1"/>
+          <w:bottom w:val="single" w:sz="4" w:space="0" w:color="C9CCD1"/>
+          <w:right w:val="single" w:sz="4" w:space="0" w:color="C9CCD1"/>
+          <w:insideH w:val="single" w:sz="4" w:space="0" w:color="C9CCD1"/>
+          <w:insideV w:val="single" w:sz="4" w:space="0" w:color="C9CCD1"/>
+        </w:tblBorders>
+        <w:tblLayout w:type="fixed"/>
+      </w:tblPr>
+      <w:tblGrid>
+        <w:gridCol w:w="2016"/>
+        <w:gridCol w:w="2016"/>
+        <w:gridCol w:w="2016"/>
+        <w:gridCol w:w="2016"/>
+        <w:gridCol w:w="2016"/>
+      </w:tblGrid>
+      <w:tr>
+        <w:trPr>
+          <w:tblHeader/>
+        </w:trPr>
+        <w:tc>
+          <w:tcPr>
+            <w:tcW w:w="2016" w:type="dxa"/>
+            <w:shd w:val="clear" w:color="auto" w:fill="EFF1F3"/>
+          </w:tcPr>
+          <w:p>
+            <w:pPr>
+              <w:spacing w:before="40" w:after="40"/>
+            </w:pPr>
+            <w:r>
+              <w:rPr>
+                <w:b/>
+                <w:sz w:val="18"/>
+              </w:rPr>
+              <w:t xml:space="preserve">#</w:t>
+            </w:r>
+          </w:p>
+        </w:tc>
+        <w:tc>
+          <w:tcPr>
+            <w:tcW w:w="2016" w:type="dxa"/>
+            <w:shd w:val="clear" w:color="auto" w:fill="EFF1F3"/>
+          </w:tcPr>
+          <w:p>
+            <w:pPr>
+              <w:spacing w:before="40" w:after="40"/>
+            </w:pPr>
+            <w:r>
+              <w:rPr>
+                <w:b/>
+                <w:sz w:val="18"/>
+              </w:rPr>
+              <w:t xml:space="preserve">Theme</w:t>
+            </w:r>
+          </w:p>
+        </w:tc>
+        <w:tc>
+          <w:tcPr>
+            <w:tcW w:w="2016" w:type="dxa"/>
+            <w:shd w:val="clear" w:color="auto" w:fill="EFF1F3"/>
+          </w:tcPr>
+          <w:p>
+            <w:pPr>
+              <w:spacing w:before="40" w:after="40"/>
+            </w:pPr>
+            <w:r>
+              <w:rPr>
+                <w:b/>
+                <w:sz w:val="18"/>
+              </w:rPr>
+              <w:t xml:space="preserve">Count</w:t>
+            </w:r>
+          </w:p>
+        </w:tc>
+        <w:tc>
+          <w:tcPr>
+            <w:tcW w:w="2016" w:type="dxa"/>
+            <w:shd w:val="clear" w:color="auto" w:fill="EFF1F3"/>
+          </w:tcPr>
+          <w:p>
+            <w:pPr>
+              <w:spacing w:before="40" w:after="40"/>
+            </w:pPr>
+            <w:r>
+              <w:rPr>
+                <w:b/>
+                <w:sz w:val="18"/>
+              </w:rPr>
+              <w:t xml:space="preserve">Share</w:t>
+            </w:r>
+          </w:p>
+        </w:tc>
+        <w:tc>
+          <w:tcPr>
+            <w:tcW w:w="2016" w:type="dxa"/>
+            <w:shd w:val="clear" w:color="auto" w:fill="EFF1F3"/>
+          </w:tcPr>
+          <w:p>
+            <w:pPr>
+              <w:spacing w:before="40" w:after="40"/>
+            </w:pPr>
+            <w:r>
+              <w:rPr>
+                <w:b/>
+                <w:sz w:val="18"/>
+              </w:rPr>
+              <w:t xml:space="preserve">Type</w:t>
+            </w:r>
+          </w:p>
+        </w:tc>
+      </w:tr>
+      <w:tr>
+        <w:tc>
+          <w:tcPr>
+            <w:tcW w:w="2016" w:type="dxa"/>
+          </w:tcPr>
+          <w:p>
+            <w:pPr>
+              <w:spacing w:before="40" w:after="40"/>
+            </w:pPr>
+            <w:r>
+              <w:rPr>
+                <w:sz w:val="18"/>
+              </w:rPr>
+              <w:t xml:space="preserve">1</w:t>
+            </w:r>
+          </w:p>
+        </w:tc>
+        <w:tc>
+          <w:tcPr>
+            <w:tcW w:w="2016" w:type="dxa"/>
+          </w:tcPr>
+          <w:p>
+            <w:pPr>
+              <w:spacing w:before="40" w:after="40"/>
+            </w:pPr>
+            <w:r>
+              <w:rPr>
+                <w:b/>
+                <w:sz w:val="18"/>
+              </w:rPr>
+              <w:t xml:space="preserve">AI output quality</w:t>
+            </w:r>
+            <w:r>
+              <w:rPr>
+                <w:sz w:val="18"/>
+              </w:rPr>
+              <w:t xml:space="preserve"> — results look wrong, fake, degraded</w:t>
+            </w:r>
+          </w:p>
+        </w:tc>
+        <w:tc>
+          <w:tcPr>
+            <w:tcW w:w="2016" w:type="dxa"/>
+          </w:tcPr>
+          <w:p>
+            <w:pPr>
+              <w:spacing w:before="40" w:after="40"/>
+            </w:pPr>
+            <w:r>
+              <w:rPr>
+                <w:b/>
+                <w:sz w:val="18"/>
+              </w:rPr>
+              <w:t xml:space="preserve">148</w:t>
+            </w:r>
+          </w:p>
+        </w:tc>
+        <w:tc>
+          <w:tcPr>
+            <w:tcW w:w="2016" w:type="dxa"/>
+          </w:tcPr>
+          <w:p>
+            <w:pPr>
+              <w:spacing w:before="40" w:after="40"/>
+            </w:pPr>
+            <w:r>
+              <w:rPr>
+                <w:b/>
+                <w:sz w:val="18"/>
+              </w:rPr>
+              <w:t xml:space="preserve">38%</w:t>
+            </w:r>
+          </w:p>
+        </w:tc>
+        <w:tc>
+          <w:tcPr>
+            <w:tcW w:w="2016" w:type="dxa"/>
+          </w:tcPr>
+          <w:p>
+            <w:pPr>
+              <w:spacing w:before="40" w:after="40"/>
+            </w:pPr>
+            <w:r>
+              <w:rPr>
+                <w:sz w:val="18"/>
+              </w:rPr>
+              <w:t xml:space="preserve">Product</w:t>
+            </w:r>
+          </w:p>
+        </w:tc>
+      </w:tr>
+      <w:tr>
+        <w:tc>
+          <w:tcPr>
+            <w:tcW w:w="2016" w:type="dxa"/>
+          </w:tcPr>
+          <w:p>
+            <w:pPr>
+              <w:spacing w:before="40" w:after="40"/>
+            </w:pPr>
+            <w:r>
+              <w:rPr>
+                <w:sz w:val="18"/>
+              </w:rPr>
+              <w:t xml:space="preserve">2</w:t>
+            </w:r>
+          </w:p>
+        </w:tc>
+        <w:tc>
+          <w:tcPr>
+            <w:tcW w:w="2016" w:type="dxa"/>
+          </w:tcPr>
+          <w:p>
+            <w:pPr>
+              <w:spacing w:before="40" w:after="40"/>
+            </w:pPr>
+            <w:r>
+              <w:rPr>
+                <w:b/>
+                <w:sz w:val="18"/>
+              </w:rPr>
+              <w:t xml:space="preserve">Pricing</w:t>
+            </w:r>
+            <w:r>
+              <w:rPr>
+                <w:sz w:val="18"/>
+              </w:rPr>
+              <w:t xml:space="preserve"> — subscriptions, trials, refusal to refund</w:t>
+            </w:r>
+          </w:p>
+        </w:tc>
+        <w:tc>
+          <w:tcPr>
+            <w:tcW w:w="2016" w:type="dxa"/>
+          </w:tcPr>
+          <w:p>
+            <w:pPr>
+              <w:spacing w:before="40" w:after="40"/>
+            </w:pPr>
+            <w:r>
+              <w:rPr>
+                <w:b/>
+                <w:sz w:val="18"/>
+              </w:rPr>
+              <w:t xml:space="preserve">139</w:t>
+            </w:r>
+          </w:p>
+        </w:tc>
+        <w:tc>
+          <w:tcPr>
+            <w:tcW w:w="2016" w:type="dxa"/>
+          </w:tcPr>
+          <w:p>
+            <w:pPr>
+              <w:spacing w:before="40" w:after="40"/>
+            </w:pPr>
+            <w:r>
+              <w:rPr>
+                <w:b/>
+                <w:sz w:val="18"/>
+              </w:rPr>
+              <w:t xml:space="preserve">36%</w:t>
+            </w:r>
+          </w:p>
+        </w:tc>
+        <w:tc>
+          <w:tcPr>
+            <w:tcW w:w="2016" w:type="dxa"/>
+          </w:tcPr>
+          <w:p>
+            <w:pPr>
+              <w:spacing w:before="40" w:after="40"/>
+            </w:pPr>
+            <w:r>
+              <w:rPr>
+                <w:b/>
+                <w:sz w:val="18"/>
+              </w:rPr>
+              <w:t xml:space="preserve">Pricing</w:t>
+            </w:r>
+          </w:p>
+        </w:tc>
+      </w:tr>
+      <w:tr>
+        <w:tc>
+          <w:tcPr>
+            <w:tcW w:w="2016" w:type="dxa"/>
+          </w:tcPr>
+          <w:p>
+            <w:pPr>
+              <w:spacing w:before="40" w:after="40"/>
+            </w:pPr>
+            <w:r>
+              <w:rPr>
+                <w:sz w:val="18"/>
+              </w:rPr>
+              <w:t xml:space="preserve">3</w:t>
+            </w:r>
+          </w:p>
+        </w:tc>
+        <w:tc>
+          <w:tcPr>
+            <w:tcW w:w="2016" w:type="dxa"/>
+          </w:tcPr>
+          <w:p>
+            <w:pPr>
+              <w:spacing w:before="40" w:after="40"/>
+            </w:pPr>
+            <w:r>
+              <w:rPr>
+                <w:sz w:val="18"/>
+              </w:rPr>
+              <w:t xml:space="preserve">App broken — crashes, freezes, won't load</w:t>
+            </w:r>
+          </w:p>
+        </w:tc>
+        <w:tc>
+          <w:tcPr>
+            <w:tcW w:w="2016" w:type="dxa"/>
+          </w:tcPr>
+          <w:p>
+            <w:pPr>
+              <w:spacing w:before="40" w:after="40"/>
+            </w:pPr>
+            <w:r>
+              <w:rPr>
+                <w:sz w:val="18"/>
+              </w:rPr>
+              <w:t xml:space="preserve">93</w:t>
+            </w:r>
+          </w:p>
+        </w:tc>
+        <w:tc>
+          <w:tcPr>
+            <w:tcW w:w="2016" w:type="dxa"/>
+          </w:tcPr>
+          <w:p>
+            <w:pPr>
+              <w:spacing w:before="40" w:after="40"/>
+            </w:pPr>
+            <w:r>
+              <w:rPr>
+                <w:sz w:val="18"/>
+              </w:rPr>
+              <w:t xml:space="preserve">24%</w:t>
+            </w:r>
+          </w:p>
+        </w:tc>
+        <w:tc>
+          <w:tcPr>
+            <w:tcW w:w="2016" w:type="dxa"/>
+          </w:tcPr>
+          <w:p>
+            <w:pPr>
+              <w:spacing w:before="40" w:after="40"/>
+            </w:pPr>
+            <w:r>
+              <w:rPr>
+                <w:sz w:val="18"/>
+              </w:rPr>
+              <w:t xml:space="preserve">Product</w:t>
+            </w:r>
+          </w:p>
+        </w:tc>
+      </w:tr>
+      <w:tr>
+        <w:tc>
+          <w:tcPr>
+            <w:tcW w:w="2016" w:type="dxa"/>
+          </w:tcPr>
+          <w:p>
+            <w:pPr>
+              <w:spacing w:before="40" w:after="40"/>
+            </w:pPr>
+            <w:r>
+              <w:rPr>
+                <w:sz w:val="18"/>
+              </w:rPr>
+              <w:t xml:space="preserve">4</w:t>
+            </w:r>
+          </w:p>
+        </w:tc>
+        <w:tc>
+          <w:tcPr>
+            <w:tcW w:w="2016" w:type="dxa"/>
+          </w:tcPr>
+          <w:p>
+            <w:pPr>
+              <w:spacing w:before="40" w:after="40"/>
+            </w:pPr>
+            <w:r>
+              <w:rPr>
+                <w:sz w:val="18"/>
+              </w:rPr>
+              <w:t xml:space="preserve">Trust and scams — vetting failures, fake sellers</w:t>
+            </w:r>
+          </w:p>
+        </w:tc>
+        <w:tc>
+          <w:tcPr>
+            <w:tcW w:w="2016" w:type="dxa"/>
+          </w:tcPr>
+          <w:p>
+            <w:pPr>
+              <w:spacing w:before="40" w:after="40"/>
+            </w:pPr>
+            <w:r>
+              <w:rPr>
+                <w:sz w:val="18"/>
+              </w:rPr>
+              <w:t xml:space="preserve">56</w:t>
+            </w:r>
+          </w:p>
+        </w:tc>
+        <w:tc>
+          <w:tcPr>
+            <w:tcW w:w="2016" w:type="dxa"/>
+          </w:tcPr>
+          <w:p>
+            <w:pPr>
+              <w:spacing w:before="40" w:after="40"/>
+            </w:pPr>
+            <w:r>
+              <w:rPr>
+                <w:sz w:val="18"/>
+              </w:rPr>
+              <w:t xml:space="preserve">14%</w:t>
+            </w:r>
+          </w:p>
+        </w:tc>
+        <w:tc>
+          <w:tcPr>
+            <w:tcW w:w="2016" w:type="dxa"/>
+          </w:tcPr>
+          <w:p>
+            <w:pPr>
+              <w:spacing w:before="40" w:after="40"/>
+            </w:pPr>
+            <w:r>
+              <w:rPr>
+                <w:sz w:val="18"/>
+              </w:rPr>
+              <w:t xml:space="preserve">Product</w:t>
+            </w:r>
+          </w:p>
+        </w:tc>
+      </w:tr>
+      <w:tr>
+        <w:tc>
+          <w:tcPr>
+            <w:tcW w:w="2016" w:type="dxa"/>
+          </w:tcPr>
+          <w:p>
+            <w:pPr>
+              <w:spacing w:before="40" w:after="40"/>
+            </w:pPr>
+            <w:r>
+              <w:rPr>
+                <w:sz w:val="18"/>
+              </w:rPr>
+              <w:t xml:space="preserve">5</w:t>
+            </w:r>
+          </w:p>
+        </w:tc>
+        <w:tc>
+          <w:tcPr>
+            <w:tcW w:w="2016" w:type="dxa"/>
+          </w:tcPr>
+          <w:p>
+            <w:pPr>
+              <w:spacing w:before="40" w:after="40"/>
+            </w:pPr>
+            <w:r>
+              <w:rPr>
+                <w:sz w:val="18"/>
+              </w:rPr>
+              <w:t xml:space="preserve">Discovery / reach for artists</w:t>
+            </w:r>
+          </w:p>
+        </w:tc>
+        <w:tc>
+          <w:tcPr>
+            <w:tcW w:w="2016" w:type="dxa"/>
+          </w:tcPr>
+          <w:p>
+            <w:pPr>
+              <w:spacing w:before="40" w:after="40"/>
+            </w:pPr>
+            <w:r>
+              <w:rPr>
+                <w:sz w:val="18"/>
+              </w:rPr>
+              <w:t xml:space="preserve">30</w:t>
+            </w:r>
+          </w:p>
+        </w:tc>
+        <w:tc>
+          <w:tcPr>
+            <w:tcW w:w="2016" w:type="dxa"/>
+          </w:tcPr>
+          <w:p>
+            <w:pPr>
+              <w:spacing w:before="40" w:after="40"/>
+            </w:pPr>
+            <w:r>
+              <w:rPr>
+                <w:sz w:val="18"/>
+              </w:rPr>
+              <w:t xml:space="preserve">8%</w:t>
+            </w:r>
+          </w:p>
+        </w:tc>
+        <w:tc>
+          <w:tcPr>
+            <w:tcW w:w="2016" w:type="dxa"/>
+          </w:tcPr>
+          <w:p>
+            <w:pPr>
+              <w:spacing w:before="40" w:after="40"/>
+            </w:pPr>
+            <w:r>
+              <w:rPr>
+                <w:sz w:val="18"/>
+              </w:rPr>
+              <w:t xml:space="preserve">Product</w:t>
+            </w:r>
+          </w:p>
+        </w:tc>
+      </w:tr>
+      <w:tr>
+        <w:tc>
+          <w:tcPr>
+            <w:tcW w:w="2016" w:type="dxa"/>
+          </w:tcPr>
+          <w:p>
+            <w:pPr>
+              <w:spacing w:before="40" w:after="40"/>
+            </w:pPr>
+            <w:r>
+              <w:rPr>
+                <w:sz w:val="18"/>
+              </w:rPr>
+              <w:t xml:space="preserve">6</w:t>
+            </w:r>
+          </w:p>
+        </w:tc>
+        <w:tc>
+          <w:tcPr>
+            <w:tcW w:w="2016" w:type="dxa"/>
+          </w:tcPr>
+          <w:p>
+            <w:pPr>
+              <w:spacing w:before="40" w:after="40"/>
+            </w:pPr>
+            <w:r>
+              <w:rPr>
+                <w:b/>
+                <w:sz w:val="18"/>
+              </w:rPr>
+              <w:t xml:space="preserve">Scale and dimension accuracy</w:t>
+            </w:r>
+          </w:p>
+        </w:tc>
+        <w:tc>
+          <w:tcPr>
+            <w:tcW w:w="2016" w:type="dxa"/>
+          </w:tcPr>
+          <w:p>
+            <w:pPr>
+              <w:spacing w:before="40" w:after="40"/>
+            </w:pPr>
+            <w:r>
+              <w:rPr>
+                <w:sz w:val="18"/>
+              </w:rPr>
+              <w:t xml:space="preserve">24</w:t>
+            </w:r>
+          </w:p>
+        </w:tc>
+        <w:tc>
+          <w:tcPr>
+            <w:tcW w:w="2016" w:type="dxa"/>
+          </w:tcPr>
+          <w:p>
+            <w:pPr>
+              <w:spacing w:before="40" w:after="40"/>
+            </w:pPr>
+            <w:r>
+              <w:rPr>
+                <w:sz w:val="18"/>
+              </w:rPr>
+              <w:t xml:space="preserve">6%</w:t>
+            </w:r>
+          </w:p>
+        </w:tc>
+        <w:tc>
+          <w:tcPr>
+            <w:tcW w:w="2016" w:type="dxa"/>
+          </w:tcPr>
+          <w:p>
+            <w:pPr>
+              <w:spacing w:before="40" w:after="40"/>
+            </w:pPr>
+            <w:r>
+              <w:rPr>
+                <w:sz w:val="18"/>
+              </w:rPr>
+              <w:t xml:space="preserve">Product</w:t>
+            </w:r>
+          </w:p>
+        </w:tc>
+      </w:tr>
+    </w:tbl>
+    <w:p>
+      <w:pPr>
+        <w:spacing w:after="0"/>
+      </w:pPr>
+    </w:p>
+    <w:p>
+      <w:r>
+        <w:rPr>
+          <w:b/>
+        </w:rPr>
+        <w:t xml:space="preserve">Split: ~64% product, ~36% pricing.</w:t>
+      </w:r>
+    </w:p>
+    <w:p>
+      <w:pPr>
+        <w:pBdr>
+          <w:bottom w:val="single" w:sz="6" w:space="6" w:color="C9CCD1"/>
+        </w:pBdr>
+      </w:pPr>
+    </w:p>
+    <w:p>
+      <w:pPr>
+        <w:pStyle w:val="Heading2"/>
+      </w:pPr>
+      <w:r>
+        <w:t xml:space="preserve">Theme 1 — AI output quality — 148 (38%) — </w:t>
+      </w:r>
+      <w:r>
+        <w:rPr>
+          <w:b/>
+        </w:rPr>
+        <w:t xml:space="preserve">PRODUCT problem</w:t>
+      </w:r>
+    </w:p>
+    <w:p>
+      <w:r>
+        <w:t xml:space="preserve">The largest theme, and the one aimed squarely at your core feature.</w:t>
+      </w:r>
+    </w:p>
+    <w:p>
+      <w:r>
+        <w:t xml:space="preserve">1. **Home AI, 2★, Sept 18 2026 (*Alder89*)</w:t>
+      </w:r>
+      <w:r>
+        <w:rPr>
+          <w:b/>
+        </w:rPr>
+        <w:t xml:space="preserve"> — the entire review is that </w:t>
+      </w:r>
+      <w:r>
+        <w:t xml:space="preserve">Gemini does the job far better than the dedicated app**. (</w:t>
+      </w:r>
+      <w:hyperlink r:id="rHl31">
+        <w:r>
+          <w:rPr>
+            <w:rStyle w:val="Hyperlink"/>
+          </w:rPr>
+          <w:t xml:space="preserve">App Store</w:t>
+        </w:r>
+      </w:hyperlink>
+      <w:r>
+        <w:t xml:space="preserve">)</w:t>
+      </w:r>
+    </w:p>
+    <w:p>
+      <w:r>
+        <w:t xml:space="preserve">2. **Renovate AI, 1★, Jul 30 2026 (*'W*)</w:t>
+      </w:r>
+      <w:r>
+        <w:rPr>
+          <w:b/>
+        </w:rPr>
+        <w:t xml:space="preserve"> — the app </w:t>
+      </w:r>
+      <w:r>
+        <w:t xml:space="preserve">degrades the image every time you make an edit**; envisioning a remodel means watching quality fall with each change. Echoed Aug 3 2026 (*Dotdotdotkkk*): after an update everything comes out blurry with no way to fix it. (</w:t>
+      </w:r>
+      <w:hyperlink r:id="rHl32">
+        <w:r>
+          <w:rPr>
+            <w:rStyle w:val="Hyperlink"/>
+          </w:rPr>
+          <w:t xml:space="preserve">App Store</w:t>
+        </w:r>
+      </w:hyperlink>
+      <w:r>
+        <w:t xml:space="preserve">)</w:t>
+      </w:r>
+    </w:p>
+    <w:p>
+      <w:r>
+        <w:t xml:space="preserve">3. **Home AI, 1★, Sept 18 2026 (*Not A Big App Gamer*)</w:t>
+      </w:r>
+      <w:r>
+        <w:rPr>
+          <w:b/>
+        </w:rPr>
+        <w:t xml:space="preserve"> — most generated images are bad, and in some cases </w:t>
+      </w:r>
+      <w:r>
+        <w:t xml:space="preserve">the output doesn't even look like the same room**. (</w:t>
+      </w:r>
+      <w:hyperlink r:id="rHl31">
+        <w:r>
+          <w:rPr>
+            <w:rStyle w:val="Hyperlink"/>
+          </w:rPr>
+          <w:t xml:space="preserve">App Store</w:t>
+        </w:r>
+      </w:hyperlink>
+      <w:r>
+        <w:t xml:space="preserve">)</w:t>
+      </w:r>
+    </w:p>
+    <w:p>
+      <w:pPr>
+        <w:ind w:left="360"/>
+        <w:pBdr>
+          <w:left w:val="single" w:sz="18" w:space="8" w:color="9AA0A6"/>
+        </w:pBdr>
+      </w:pPr>
+      <w:r>
+        <w:rPr>
+          <w:b/>
+        </w:rPr>
+        <w:t xml:space="preserve">Also:</w:t>
+      </w:r>
+      <w:r>
+        <w:t xml:space="preserve"> Renovate AI, 2★, Sept 4 2026 (*Grl4tidr*) — </w:t>
+      </w:r>
+      <w:r>
+        <w:rPr>
+          <w:b/>
+        </w:rPr>
+        <w:t xml:space="preserve">one photo can't capture a whole space</w:t>
+      </w:r>
+      <w:r>
+        <w:t xml:space="preserve">, so suggestions use areas that aren't usable. Artist.ai, 1★, Sept 2 2026 (*Jxrdnonly*) — bad at generating from </w:t>
+      </w:r>
+      <w:r>
+        <w:rPr>
+          <w:b/>
+        </w:rPr>
+        <w:t xml:space="preserve">reference images</w:t>
+      </w:r>
+      <w:r>
+        <w:t xml:space="preserve">, which is exactly your "upload inspiration" feature. Artist.ai, 3★, Jul 8 2026 (*Mercs_Fubah*) — anatomy errors: animals with two heads, a bird with three wings.</w:t>
+      </w:r>
+    </w:p>
+    <w:p>
+      <w:r>
+        <w:rPr>
+          <w:b/>
+        </w:rPr>
+        <w:t xml:space="preserve">Why this matters most:</w:t>
+      </w:r>
+      <w:r>
+        <w:t xml:space="preserve"> your product depends on a buyer looking at an AI-rendered impression of art in their room and trusting it enough to commission a real painting. </w:t>
+      </w:r>
+      <w:r>
+        <w:rPr>
+          <w:b/>
+        </w:rPr>
+        <w:t xml:space="preserve">The apps doing the visual half today are being told their output looks fake, degrades on edit, and is beaten by a free general-purpose assistant.</w:t>
+      </w:r>
+    </w:p>
+    <w:p>
+      <w:pPr>
+        <w:pBdr>
+          <w:bottom w:val="single" w:sz="6" w:space="6" w:color="C9CCD1"/>
+        </w:pBdr>
+      </w:pPr>
+    </w:p>
+    <w:p>
+      <w:pPr>
+        <w:pStyle w:val="Heading2"/>
+      </w:pPr>
+      <w:r>
+        <w:t xml:space="preserve">Theme 2 — Pricing, trials and refunds — 139 (36%) — </w:t>
+      </w:r>
+      <w:r>
+        <w:rPr>
+          <w:b/>
+        </w:rPr>
+        <w:t xml:space="preserve">PRICING problem</w:t>
+      </w:r>
+    </w:p>
+    <w:p>
+      <w:r>
+        <w:t xml:space="preserve">1. **Renovate AI, 1★, Aug 13 2026 (*RK !!!!*)** — paid a full year on a "cancel anytime" promise, never received a refund, and says the app doesn't acknowledge the payment. (</w:t>
+      </w:r>
+      <w:hyperlink r:id="rHl32">
+        <w:r>
+          <w:rPr>
+            <w:rStyle w:val="Hyperlink"/>
+          </w:rPr>
+          <w:t xml:space="preserve">App Store</w:t>
+        </w:r>
+      </w:hyperlink>
+      <w:r>
+        <w:t xml:space="preserve">)</w:t>
+      </w:r>
+    </w:p>
+    <w:p>
+      <w:r>
+        <w:t xml:space="preserve">2. **Home AI, 1★, Sept 18 2026 (*Not A Big App Gamer*)</w:t>
+      </w:r>
+      <w:r>
+        <w:rPr>
+          <w:b/>
+        </w:rPr>
+        <w:t xml:space="preserve"> — incredulous that the app asks </w:t>
+      </w:r>
+      <w:r>
+        <w:t xml:space="preserve">$14.99 per week**. (</w:t>
+      </w:r>
+      <w:hyperlink r:id="rHl31">
+        <w:r>
+          <w:rPr>
+            <w:rStyle w:val="Hyperlink"/>
+          </w:rPr>
+          <w:t xml:space="preserve">App Store</w:t>
+        </w:r>
+      </w:hyperlink>
+      <w:r>
+        <w:t xml:space="preserve">)</w:t>
+      </w:r>
+    </w:p>
+    <w:p>
+      <w:r>
+        <w:t xml:space="preserve">3. **Smartist, 3★, Jul 15 2026 (*Mattier555*)** — a paying artist calls it "a very expensive product" and expects more accuracy than artwork that disappears. (</w:t>
+      </w:r>
+      <w:hyperlink r:id="rHl16">
+        <w:r>
+          <w:rPr>
+            <w:rStyle w:val="Hyperlink"/>
+          </w:rPr>
+          <w:t xml:space="preserve">App Store</w:t>
+        </w:r>
+      </w:hyperlink>
+      <w:r>
+        <w:t xml:space="preserve">)</w:t>
+      </w:r>
+    </w:p>
+    <w:p>
+      <w:pPr>
+        <w:ind w:left="360"/>
+        <w:pBdr>
+          <w:left w:val="single" w:sz="18" w:space="8" w:color="9AA0A6"/>
+        </w:pBdr>
+      </w:pPr>
+      <w:r>
+        <w:rPr>
+          <w:b/>
+        </w:rPr>
+        <w:t xml:space="preserve">Also:</w:t>
+      </w:r>
+      <w:r>
+        <w:t xml:space="preserve"> Artist.ai, 1★, Aug 21 2026 (*True pink*) — paid annually, the paid feature crashes, then the app stopped working entirely. Renovate AI, 3★, Aug 5 2026 (*hbjb99*) — does a good job, simply too expensive to use.</w:t>
+      </w:r>
+    </w:p>
+    <w:p>
+      <w:pPr>
+        <w:pBdr>
+          <w:bottom w:val="single" w:sz="6" w:space="6" w:color="C9CCD1"/>
+        </w:pBdr>
+      </w:pPr>
+    </w:p>
+    <w:p>
+      <w:pPr>
+        <w:pStyle w:val="Heading2"/>
+      </w:pPr>
+      <w:r>
+        <w:t xml:space="preserve">Theme 3 — Broken apps — 93 (24%) — </w:t>
+      </w:r>
+      <w:r>
+        <w:rPr>
+          <w:b/>
+        </w:rPr>
+        <w:t xml:space="preserve">PRODUCT problem</w:t>
+      </w:r>
+    </w:p>
+    <w:p>
+      <w:r>
+        <w:t xml:space="preserve">1. **ArtStation, 1★, Apr 13 2026 (*Z_aqqa_z*)** — crashes 75% of the time, notifications permanently blank, unusable for years. (</w:t>
+      </w:r>
+      <w:hyperlink r:id="rHl33">
+        <w:r>
+          <w:rPr>
+            <w:rStyle w:val="Hyperlink"/>
+          </w:rPr>
+          <w:t xml:space="preserve">App Store</w:t>
+        </w:r>
+      </w:hyperlink>
+      <w:r>
+        <w:t xml:space="preserve">)</w:t>
+      </w:r>
+    </w:p>
+    <w:p>
+      <w:r>
+        <w:t xml:space="preserve">2. **ArtStation, 1★, Apr 24 2026 (*Elexis07*)** — images stopped loading, then the app froze on every launch, for about a year. (</w:t>
+      </w:r>
+      <w:hyperlink r:id="rHl33">
+        <w:r>
+          <w:rPr>
+            <w:rStyle w:val="Hyperlink"/>
+          </w:rPr>
+          <w:t xml:space="preserve">App Store</w:t>
+        </w:r>
+      </w:hyperlink>
+      <w:r>
+        <w:t xml:space="preserve">)</w:t>
+      </w:r>
+    </w:p>
+    <w:p>
+      <w:r>
+        <w:t xml:space="preserve">3. **Artist.ai, 1★, Jun 28 2026 (*Sippi335433*)</w:t>
+      </w:r>
+      <w:r>
+        <w:rPr>
+          <w:b/>
+        </w:rPr>
+        <w:t xml:space="preserve"> — a paying subscriber says all saved artwork has been deleted </w:t>
+      </w:r>
+      <w:r>
+        <w:t xml:space="preserve">six times**, reported each time, never fixed. (</w:t>
+      </w:r>
+      <w:hyperlink r:id="rHl34">
+        <w:r>
+          <w:rPr>
+            <w:rStyle w:val="Hyperlink"/>
+          </w:rPr>
+          <w:t xml:space="preserve">App Store</w:t>
+        </w:r>
+      </w:hyperlink>
+      <w:r>
+        <w:t xml:space="preserve">)</w:t>
+      </w:r>
+    </w:p>
+    <w:p>
+      <w:pPr>
+        <w:pBdr>
+          <w:bottom w:val="single" w:sz="6" w:space="6" w:color="C9CCD1"/>
+        </w:pBdr>
+      </w:pPr>
+    </w:p>
+    <w:p>
+      <w:pPr>
+        <w:pStyle w:val="Heading2"/>
+      </w:pPr>
+      <w:r>
+        <w:t xml:space="preserve">Theme 4 — Trust, vetting and scams — 56 (14%) — </w:t>
+      </w:r>
+      <w:r>
+        <w:rPr>
+          <w:b/>
+        </w:rPr>
+        <w:t xml:space="preserve">PRODUCT problem</w:t>
+      </w:r>
+    </w:p>
+    <w:p>
+      <w:r>
+        <w:t xml:space="preserve">This theme is the direct test of your credential-vetting feature.</w:t>
+      </w:r>
+    </w:p>
+    <w:p>
+      <w:r>
+        <w:t xml:space="preserve">1. **Fiverr, 1★, Sept 14 2026 (*Ryan.Forist*)</w:t>
+      </w:r>
+      <w:r>
+        <w:rPr>
+          <w:b/>
+        </w:rPr>
+        <w:t xml:space="preserve"> — </w:t>
+      </w:r>
+      <w:r>
+        <w:t xml:space="preserve">$600 lost because they trusted the platform to vet its sellers**, even one with high ratings; says the platform did nothing. (</w:t>
+      </w:r>
+      <w:hyperlink r:id="rHl35">
+        <w:r>
+          <w:rPr>
+            <w:rStyle w:val="Hyperlink"/>
+          </w:rPr>
+          <w:t xml:space="preserve">App Store</w:t>
+        </w:r>
+      </w:hyperlink>
+      <w:r>
+        <w:t xml:space="preserve">)</w:t>
+      </w:r>
+    </w:p>
+    <w:p>
+      <w:r>
+        <w:t xml:space="preserve">2. **Fiverr, 1★, Sept 21 2026 (*Pris9674*)** — scammed by a seller, provided proof, got ticket runaround, going to the bank instead. (</w:t>
+      </w:r>
+      <w:hyperlink r:id="rHl35">
+        <w:r>
+          <w:rPr>
+            <w:rStyle w:val="Hyperlink"/>
+          </w:rPr>
+          <w:t xml:space="preserve">App Store</w:t>
+        </w:r>
+      </w:hyperlink>
+      <w:r>
+        <w:t xml:space="preserve">)</w:t>
+      </w:r>
+    </w:p>
+    <w:p>
+      <w:r>
+        <w:t xml:space="preserve">3. </w:t>
+      </w:r>
+      <w:r>
+        <w:rPr>
+          <w:b/>
+        </w:rPr>
+        <w:t xml:space="preserve">Peggy, 2★ (buyer)</w:t>
+      </w:r>
+      <w:r>
+        <w:t xml:space="preserve"> — won a bid at the artist's $150 asking price, then the artist raised the ask to $750 and the bid was voided; the platform said that was allowed. (</w:t>
+      </w:r>
+      <w:hyperlink r:id="rHl18">
+        <w:r>
+          <w:rPr>
+            <w:rStyle w:val="Hyperlink"/>
+          </w:rPr>
+          <w:t xml:space="preserve">App Store</w:t>
+        </w:r>
+      </w:hyperlink>
+      <w:r>
+        <w:t xml:space="preserve">)</w:t>
+      </w:r>
+    </w:p>
+    <w:p>
+      <w:pPr>
+        <w:ind w:left="360"/>
+        <w:pBdr>
+          <w:left w:val="single" w:sz="18" w:space="8" w:color="9AA0A6"/>
+        </w:pBdr>
+      </w:pPr>
+      <w:r>
+        <w:rPr>
+          <w:b/>
+        </w:rPr>
+        <w:t xml:space="preserve">The lesson for your vetting feature:</w:t>
+      </w:r>
+      <w:r>
+        <w:t xml:space="preserve"> Fiverr already vets, rates and escrows — and 14% of its recent complaints are still about being defrauded. </w:t>
+      </w:r>
+      <w:r>
+        <w:rPr>
+          <w:b/>
+        </w:rPr>
+        <w:t xml:space="preserve">Buyers do not experience "vetted" as a promise about taste or credentials; they experience it as a promise that they won't lose their money.</w:t>
+      </w:r>
+      <w:r>
+        <w:t xml:space="preserve"> A degree filter does not address that, and if you advertise vetting you will own the failures.</w:t>
+      </w:r>
+    </w:p>
+    <w:p>
+      <w:pPr>
+        <w:pBdr>
+          <w:bottom w:val="single" w:sz="6" w:space="6" w:color="C9CCD1"/>
+        </w:pBdr>
+      </w:pPr>
+    </w:p>
+    <w:p>
+      <w:pPr>
+        <w:pStyle w:val="Heading2"/>
+      </w:pPr>
+      <w:r>
+        <w:t xml:space="preserve">Theme 5 — Artist discovery and reach — 30 (8%) — </w:t>
+      </w:r>
+      <w:r>
+        <w:rPr>
+          <w:b/>
+        </w:rPr>
+        <w:t xml:space="preserve">PRODUCT problem</w:t>
+      </w:r>
+    </w:p>
+    <w:p>
+      <w:r>
+        <w:t xml:space="preserve">Artist-side complaints about being invisible: ArtStation reviewers report broken notifications and feeds; Peggy artists report listings stuck in review for six days with no response, and minimal traction; Artfol users report crashes that block posting entirely.</w:t>
+      </w:r>
+    </w:p>
+    <w:p>
+      <w:pPr>
+        <w:pBdr>
+          <w:bottom w:val="single" w:sz="6" w:space="6" w:color="C9CCD1"/>
+        </w:pBdr>
+      </w:pPr>
+    </w:p>
+    <w:p>
+      <w:pPr>
+        <w:pStyle w:val="Heading2"/>
+      </w:pPr>
+      <w:r>
+        <w:t xml:space="preserve">Theme 6 — Scale and dimension accuracy — 24 (6%) — </w:t>
+      </w:r>
+      <w:r>
+        <w:rPr>
+          <w:b/>
+        </w:rPr>
+        <w:t xml:space="preserve">PRODUCT problem</w:t>
+      </w:r>
+    </w:p>
+    <w:p>
+      <w:r>
+        <w:t xml:space="preserve">Small in count, disqualifying in effect. Reviewers of the wall-preview apps report the </w:t>
+      </w:r>
+      <w:r>
+        <w:rPr>
+          <w:b/>
+        </w:rPr>
+        <w:t xml:space="preserve">scale is simply wrong</w:t>
+      </w:r>
+      <w:r>
+        <w:t xml:space="preserve"> — art shown at the wrong size against a real wall despite calibration (Section 1, iArtView). </w:t>
+      </w:r>
+      <w:r>
+        <w:rPr>
+          <w:b/>
+        </w:rPr>
+        <w:t xml:space="preserve">If the buyer commissions a 48×36 canvas because your preview lied about how it reads on the wall, you own a custom, non-returnable, four-figure mistake.</w:t>
+      </w:r>
+    </w:p>
+    <w:p>
+      <w:pPr>
+        <w:pBdr>
+          <w:bottom w:val="single" w:sz="6" w:space="6" w:color="C9CCD1"/>
+        </w:pBdr>
+      </w:pPr>
+    </w:p>
+    <w:p>
+      <w:pPr>
+        <w:pStyle w:val="Heading1"/>
+      </w:pPr>
+      <w:r>
+        <w:t xml:space="preserve">What companies pay humans to compile art briefs</w:t>
+      </w:r>
+    </w:p>
+    <w:p>
+      <w:r>
+        <w:t xml:space="preserve">This work exists as a paid profession, in three shapes.</w:t>
+      </w:r>
+    </w:p>
+    <w:p>
+      <w:pPr>
+        <w:pStyle w:val="Heading2"/>
+      </w:pPr>
+      <w:r>
+        <w:t xml:space="preserve">Job A — Percentage of the artwork (the art advisor / consultant model)</w:t>
+      </w:r>
+    </w:p>
+    <w:tbl>
+      <w:tblPr>
+        <w:tblW w:w="10080" w:type="dxa"/>
+        <w:tblBorders>
+          <w:top w:val="single" w:sz="4" w:space="0" w:color="C9CCD1"/>
+          <w:left w:val="single" w:sz="4" w:space="0" w:color="C9CCD1"/>
+          <w:bottom w:val="single" w:sz="4" w:space="0" w:color="C9CCD1"/>
+          <w:right w:val="single" w:sz="4" w:space="0" w:color="C9CCD1"/>
+          <w:insideH w:val="single" w:sz="4" w:space="0" w:color="C9CCD1"/>
+          <w:insideV w:val="single" w:sz="4" w:space="0" w:color="C9CCD1"/>
+        </w:tblBorders>
+        <w:tblLayout w:type="fixed"/>
+      </w:tblPr>
+      <w:tblGrid>
+        <w:gridCol w:w="3360"/>
+        <w:gridCol w:w="3360"/>
+        <w:gridCol w:w="3360"/>
+      </w:tblGrid>
+      <w:tr>
+        <w:trPr>
+          <w:tblHeader/>
+        </w:trPr>
+        <w:tc>
+          <w:tcPr>
+            <w:tcW w:w="3360" w:type="dxa"/>
+            <w:shd w:val="clear" w:color="auto" w:fill="EFF1F3"/>
+          </w:tcPr>
+          <w:p>
+            <w:pPr>
+              <w:spacing w:before="40" w:after="40"/>
+            </w:pPr>
+            <w:r>
+              <w:rPr>
+                <w:b/>
+                <w:sz w:val="18"/>
+              </w:rPr>
+              <w:t xml:space="preserve">Model</w:t>
+            </w:r>
+          </w:p>
+        </w:tc>
+        <w:tc>
+          <w:tcPr>
+            <w:tcW w:w="3360" w:type="dxa"/>
+            <w:shd w:val="clear" w:color="auto" w:fill="EFF1F3"/>
+          </w:tcPr>
+          <w:p>
+            <w:pPr>
+              <w:spacing w:before="40" w:after="40"/>
+            </w:pPr>
+            <w:r>
+              <w:rPr>
+                <w:b/>
+                <w:sz w:val="18"/>
+              </w:rPr>
+              <w:t xml:space="preserve">Fee</w:t>
+            </w:r>
+          </w:p>
+        </w:tc>
+        <w:tc>
+          <w:tcPr>
+            <w:tcW w:w="3360" w:type="dxa"/>
+            <w:shd w:val="clear" w:color="auto" w:fill="EFF1F3"/>
+          </w:tcPr>
+          <w:p>
+            <w:pPr>
+              <w:spacing w:before="40" w:after="40"/>
+            </w:pPr>
+            <w:r>
+              <w:rPr>
+                <w:b/>
+                <w:sz w:val="18"/>
+              </w:rPr>
+              <w:t xml:space="preserve">Source</w:t>
+            </w:r>
+          </w:p>
+        </w:tc>
+      </w:tr>
+      <w:tr>
+        <w:tc>
+          <w:tcPr>
+            <w:tcW w:w="3360" w:type="dxa"/>
+          </w:tcPr>
+          <w:p>
+            <w:pPr>
+              <w:spacing w:before="40" w:after="40"/>
+            </w:pPr>
+            <w:r>
+              <w:rPr>
+                <w:sz w:val="18"/>
+              </w:rPr>
+              <w:t xml:space="preserve">Art consulting firms</w:t>
+            </w:r>
+          </w:p>
+        </w:tc>
+        <w:tc>
+          <w:tcPr>
+            <w:tcW w:w="3360" w:type="dxa"/>
+          </w:tcPr>
+          <w:p>
+            <w:pPr>
+              <w:spacing w:before="40" w:after="40"/>
+            </w:pPr>
+            <w:r>
+              <w:rPr>
+                <w:b/>
+                <w:sz w:val="18"/>
+              </w:rPr>
+              <w:t xml:space="preserve">5%–20% of purchase price</w:t>
+            </w:r>
+            <w:r>
+              <w:rPr>
+                <w:sz w:val="18"/>
+              </w:rPr>
+              <w:t xml:space="preserve">, sliding down as value rises</w:t>
+            </w:r>
+          </w:p>
+        </w:tc>
+        <w:tc>
+          <w:tcPr>
+            <w:tcW w:w="3360" w:type="dxa"/>
+          </w:tcPr>
+          <w:p>
+            <w:pPr>
+              <w:spacing w:before="40" w:after="40"/>
+            </w:pPr>
+            <w:hyperlink r:id="rHl36">
+              <w:r>
+                <w:rPr>
+                  <w:rStyle w:val="Hyperlink"/>
+                  <w:sz w:val="18"/>
+                </w:rPr>
+                <w:t xml:space="preserve">TurningArt</w:t>
+              </w:r>
+            </w:hyperlink>
+          </w:p>
+        </w:tc>
+      </w:tr>
+      <w:tr>
+        <w:tc>
+          <w:tcPr>
+            <w:tcW w:w="3360" w:type="dxa"/>
+          </w:tcPr>
+          <w:p>
+            <w:pPr>
+              <w:spacing w:before="40" w:after="40"/>
+            </w:pPr>
+            <w:r>
+              <w:rPr>
+                <w:sz w:val="18"/>
+              </w:rPr>
+              <w:t xml:space="preserve">Typical advisory commission</w:t>
+            </w:r>
+          </w:p>
+        </w:tc>
+        <w:tc>
+          <w:tcPr>
+            <w:tcW w:w="3360" w:type="dxa"/>
+          </w:tcPr>
+          <w:p>
+            <w:pPr>
+              <w:spacing w:before="40" w:after="40"/>
+            </w:pPr>
+            <w:r>
+              <w:rPr>
+                <w:b/>
+                <w:sz w:val="18"/>
+              </w:rPr>
+              <w:t xml:space="preserve">~10%</w:t>
+            </w:r>
+            <w:r>
+              <w:rPr>
+                <w:sz w:val="18"/>
+              </w:rPr>
+              <w:t xml:space="preserve"> on works up to about $5M; as low as 5% above $1M; up to </w:t>
+            </w:r>
+            <w:r>
+              <w:rPr>
+                <w:b/>
+                <w:sz w:val="18"/>
+              </w:rPr>
+              <w:t xml:space="preserve">20% under $100,000</w:t>
+            </w:r>
+          </w:p>
+        </w:tc>
+        <w:tc>
+          <w:tcPr>
+            <w:tcW w:w="3360" w:type="dxa"/>
+          </w:tcPr>
+          <w:p>
+            <w:pPr>
+              <w:spacing w:before="40" w:after="40"/>
+            </w:pPr>
+            <w:hyperlink r:id="rHl37">
+              <w:r>
+                <w:rPr>
+                  <w:rStyle w:val="Hyperlink"/>
+                  <w:sz w:val="18"/>
+                </w:rPr>
+                <w:t xml:space="preserve">Mason Lane Art Advisory</w:t>
+              </w:r>
+            </w:hyperlink>
+          </w:p>
+        </w:tc>
+      </w:tr>
+      <w:tr>
+        <w:tc>
+          <w:tcPr>
+            <w:tcW w:w="3360" w:type="dxa"/>
+          </w:tcPr>
+          <w:p>
+            <w:pPr>
+              <w:spacing w:before="40" w:after="40"/>
+            </w:pPr>
+            <w:r>
+              <w:rPr>
+                <w:sz w:val="18"/>
+              </w:rPr>
+              <w:t xml:space="preserve">Hourly alternative</w:t>
+            </w:r>
+          </w:p>
+        </w:tc>
+        <w:tc>
+          <w:tcPr>
+            <w:tcW w:w="3360" w:type="dxa"/>
+          </w:tcPr>
+          <w:p>
+            <w:pPr>
+              <w:spacing w:before="40" w:after="40"/>
+            </w:pPr>
+            <w:r>
+              <w:rPr>
+                <w:b/>
+                <w:sz w:val="18"/>
+              </w:rPr>
+              <w:t xml:space="preserve">$150–$500+/hour</w:t>
+            </w:r>
+            <w:r>
+              <w:rPr>
+                <w:sz w:val="18"/>
+              </w:rPr>
+              <w:t xml:space="preserve">, though hourly is falling out of favor</w:t>
+            </w:r>
+          </w:p>
+        </w:tc>
+        <w:tc>
+          <w:tcPr>
+            <w:tcW w:w="3360" w:type="dxa"/>
+          </w:tcPr>
+          <w:p>
+            <w:pPr>
+              <w:spacing w:before="40" w:after="40"/>
+            </w:pPr>
+            <w:hyperlink r:id="rHl38">
+              <w:r>
+                <w:rPr>
+                  <w:rStyle w:val="Hyperlink"/>
+                  <w:sz w:val="18"/>
+                </w:rPr>
+                <w:t xml:space="preserve">Art Services Network</w:t>
+              </w:r>
+            </w:hyperlink>
+          </w:p>
+        </w:tc>
+      </w:tr>
+    </w:tbl>
+    <w:p>
+      <w:pPr>
+        <w:spacing w:after="0"/>
+      </w:pPr>
+    </w:p>
+    <w:p>
+      <w:r>
+        <w:rPr>
+          <w:b/>
+        </w:rPr>
+        <w:t xml:space="preserve">Worked example:</w:t>
+      </w:r>
+      <w:r>
+        <w:t xml:space="preserve"> on a </w:t>
+      </w:r>
+      <w:r>
+        <w:rPr>
+          <w:b/>
+        </w:rPr>
+        <w:t xml:space="preserve">$5,000 commissioned painting</w:t>
+      </w:r>
+      <w:r>
+        <w:t xml:space="preserve">, a 10–20% advisory fee is </w:t>
+      </w:r>
+      <w:r>
+        <w:rPr>
+          <w:b/>
+        </w:rPr>
+        <w:t xml:space="preserve">$500–$1,000</w:t>
+      </w:r>
+      <w:r>
+        <w:t xml:space="preserve"> for exactly the work your app proposes to automate — understanding the space, the client's taste, and translating it into a brief an artist can execute.</w:t>
+      </w:r>
+    </w:p>
+    <w:p>
+      <w:pPr>
+        <w:pStyle w:val="Heading2"/>
+      </w:pPr>
+      <w:r>
+        <w:t xml:space="preserve">Job B — Salaried brief-compilers</w:t>
+      </w:r>
+    </w:p>
+    <w:tbl>
+      <w:tblPr>
+        <w:tblW w:w="10080" w:type="dxa"/>
+        <w:tblBorders>
+          <w:top w:val="single" w:sz="4" w:space="0" w:color="C9CCD1"/>
+          <w:left w:val="single" w:sz="4" w:space="0" w:color="C9CCD1"/>
+          <w:bottom w:val="single" w:sz="4" w:space="0" w:color="C9CCD1"/>
+          <w:right w:val="single" w:sz="4" w:space="0" w:color="C9CCD1"/>
+          <w:insideH w:val="single" w:sz="4" w:space="0" w:color="C9CCD1"/>
+          <w:insideV w:val="single" w:sz="4" w:space="0" w:color="C9CCD1"/>
+        </w:tblBorders>
+        <w:tblLayout w:type="fixed"/>
+      </w:tblPr>
+      <w:tblGrid>
+        <w:gridCol w:w="3360"/>
+        <w:gridCol w:w="3360"/>
+        <w:gridCol w:w="3360"/>
+      </w:tblGrid>
+      <w:tr>
+        <w:trPr>
+          <w:tblHeader/>
+        </w:trPr>
+        <w:tc>
+          <w:tcPr>
+            <w:tcW w:w="3360" w:type="dxa"/>
+            <w:shd w:val="clear" w:color="auto" w:fill="EFF1F3"/>
+          </w:tcPr>
+          <w:p>
+            <w:pPr>
+              <w:spacing w:before="40" w:after="40"/>
+            </w:pPr>
+            <w:r>
+              <w:rPr>
+                <w:b/>
+                <w:sz w:val="18"/>
+              </w:rPr>
+              <w:t xml:space="preserve">Role</w:t>
+            </w:r>
+          </w:p>
+        </w:tc>
+        <w:tc>
+          <w:tcPr>
+            <w:tcW w:w="3360" w:type="dxa"/>
+            <w:shd w:val="clear" w:color="auto" w:fill="EFF1F3"/>
+          </w:tcPr>
+          <w:p>
+            <w:pPr>
+              <w:spacing w:before="40" w:after="40"/>
+            </w:pPr>
+            <w:r>
+              <w:rPr>
+                <w:b/>
+                <w:sz w:val="18"/>
+              </w:rPr>
+              <w:t xml:space="preserve">Pay</w:t>
+            </w:r>
+          </w:p>
+        </w:tc>
+        <w:tc>
+          <w:tcPr>
+            <w:tcW w:w="3360" w:type="dxa"/>
+            <w:shd w:val="clear" w:color="auto" w:fill="EFF1F3"/>
+          </w:tcPr>
+          <w:p>
+            <w:pPr>
+              <w:spacing w:before="40" w:after="40"/>
+            </w:pPr>
+            <w:r>
+              <w:rPr>
+                <w:b/>
+                <w:sz w:val="18"/>
+              </w:rPr>
+              <w:t xml:space="preserve">Source</w:t>
+            </w:r>
+          </w:p>
+        </w:tc>
+      </w:tr>
+      <w:tr>
+        <w:tc>
+          <w:tcPr>
+            <w:tcW w:w="3360" w:type="dxa"/>
+          </w:tcPr>
+          <w:p>
+            <w:pPr>
+              <w:spacing w:before="40" w:after="40"/>
+            </w:pPr>
+            <w:r>
+              <w:rPr>
+                <w:b/>
+                <w:sz w:val="18"/>
+              </w:rPr>
+              <w:t xml:space="preserve">Art buyer</w:t>
+            </w:r>
+            <w:r>
+              <w:rPr>
+                <w:sz w:val="18"/>
+              </w:rPr>
+              <w:t xml:space="preserve"> (agency/corporate — sources artwork, works with artists, negotiates)</w:t>
+            </w:r>
+          </w:p>
+        </w:tc>
+        <w:tc>
+          <w:tcPr>
+            <w:tcW w:w="3360" w:type="dxa"/>
+          </w:tcPr>
+          <w:p>
+            <w:pPr>
+              <w:spacing w:before="40" w:after="40"/>
+            </w:pPr>
+            <w:r>
+              <w:rPr>
+                <w:b/>
+                <w:sz w:val="18"/>
+              </w:rPr>
+              <w:t xml:space="preserve">$74,277 avg</w:t>
+            </w:r>
+            <w:r>
+              <w:rPr>
+                <w:sz w:val="18"/>
+              </w:rPr>
+              <w:t xml:space="preserve">; $59,044–$94,703 typical; up to $116,992</w:t>
+            </w:r>
+          </w:p>
+        </w:tc>
+        <w:tc>
+          <w:tcPr>
+            <w:tcW w:w="3360" w:type="dxa"/>
+          </w:tcPr>
+          <w:p>
+            <w:pPr>
+              <w:spacing w:before="40" w:after="40"/>
+            </w:pPr>
+            <w:hyperlink r:id="rHl39">
+              <w:r>
+                <w:rPr>
+                  <w:rStyle w:val="Hyperlink"/>
+                  <w:sz w:val="18"/>
+                </w:rPr>
+                <w:t xml:space="preserve">Glassdoor</w:t>
+              </w:r>
+            </w:hyperlink>
+          </w:p>
+        </w:tc>
+      </w:tr>
+      <w:tr>
+        <w:tc>
+          <w:tcPr>
+            <w:tcW w:w="3360" w:type="dxa"/>
+          </w:tcPr>
+          <w:p>
+            <w:pPr>
+              <w:spacing w:before="40" w:after="40"/>
+            </w:pPr>
+            <w:r>
+              <w:rPr>
+                <w:b/>
+                <w:sz w:val="18"/>
+              </w:rPr>
+              <w:t xml:space="preserve">Corporate art buyer</w:t>
+            </w:r>
+          </w:p>
+        </w:tc>
+        <w:tc>
+          <w:tcPr>
+            <w:tcW w:w="3360" w:type="dxa"/>
+          </w:tcPr>
+          <w:p>
+            <w:pPr>
+              <w:spacing w:before="40" w:after="40"/>
+            </w:pPr>
+            <w:r>
+              <w:rPr>
+                <w:b/>
+                <w:sz w:val="18"/>
+              </w:rPr>
+              <w:t xml:space="preserve">$72,133 avg</w:t>
+            </w:r>
+            <w:r>
+              <w:rPr>
+                <w:sz w:val="18"/>
+              </w:rPr>
+              <w:t xml:space="preserve">; $57,500–$89,000</w:t>
+            </w:r>
+          </w:p>
+        </w:tc>
+        <w:tc>
+          <w:tcPr>
+            <w:tcW w:w="3360" w:type="dxa"/>
+          </w:tcPr>
+          <w:p>
+            <w:pPr>
+              <w:spacing w:before="40" w:after="40"/>
+            </w:pPr>
+            <w:hyperlink r:id="rHl40">
+              <w:r>
+                <w:rPr>
+                  <w:rStyle w:val="Hyperlink"/>
+                  <w:sz w:val="18"/>
+                </w:rPr>
+                <w:t xml:space="preserve">ZipRecruiter</w:t>
+              </w:r>
+            </w:hyperlink>
+          </w:p>
+        </w:tc>
+      </w:tr>
+      <w:tr>
+        <w:tc>
+          <w:tcPr>
+            <w:tcW w:w="3360" w:type="dxa"/>
+          </w:tcPr>
+          <w:p>
+            <w:pPr>
+              <w:spacing w:before="40" w:after="40"/>
+            </w:pPr>
+            <w:r>
+              <w:rPr>
+                <w:b/>
+                <w:sz w:val="18"/>
+              </w:rPr>
+              <w:t xml:space="preserve">Art producer</w:t>
+            </w:r>
+            <w:r>
+              <w:rPr>
+                <w:sz w:val="18"/>
+              </w:rPr>
+              <w:t xml:space="preserve"> (commissions and manages artwork production)</w:t>
+            </w:r>
+          </w:p>
+        </w:tc>
+        <w:tc>
+          <w:tcPr>
+            <w:tcW w:w="3360" w:type="dxa"/>
+          </w:tcPr>
+          <w:p>
+            <w:pPr>
+              <w:spacing w:before="40" w:after="40"/>
+            </w:pPr>
+            <w:r>
+              <w:rPr>
+                <w:b/>
+                <w:sz w:val="18"/>
+              </w:rPr>
+              <w:t xml:space="preserve">$81,354 avg</w:t>
+            </w:r>
+            <w:r>
+              <w:rPr>
+                <w:sz w:val="18"/>
+              </w:rPr>
+              <w:t xml:space="preserve">; $61,639–$108,292</w:t>
+            </w:r>
+          </w:p>
+        </w:tc>
+        <w:tc>
+          <w:tcPr>
+            <w:tcW w:w="3360" w:type="dxa"/>
+          </w:tcPr>
+          <w:p>
+            <w:pPr>
+              <w:spacing w:before="40" w:after="40"/>
+            </w:pPr>
+            <w:hyperlink r:id="rHl41">
+              <w:r>
+                <w:rPr>
+                  <w:rStyle w:val="Hyperlink"/>
+                  <w:sz w:val="18"/>
+                </w:rPr>
+                <w:t xml:space="preserve">Glassdoor</w:t>
+              </w:r>
+            </w:hyperlink>
+          </w:p>
+        </w:tc>
+      </w:tr>
+      <w:tr>
+        <w:tc>
+          <w:tcPr>
+            <w:tcW w:w="3360" w:type="dxa"/>
+          </w:tcPr>
+          <w:p>
+            <w:pPr>
+              <w:spacing w:before="40" w:after="40"/>
+            </w:pPr>
+            <w:r>
+              <w:rPr>
+                <w:b/>
+                <w:sz w:val="18"/>
+              </w:rPr>
+              <w:t xml:space="preserve">Creative producer</w:t>
+            </w:r>
+          </w:p>
+        </w:tc>
+        <w:tc>
+          <w:tcPr>
+            <w:tcW w:w="3360" w:type="dxa"/>
+          </w:tcPr>
+          <w:p>
+            <w:pPr>
+              <w:spacing w:before="40" w:after="40"/>
+            </w:pPr>
+            <w:r>
+              <w:rPr>
+                <w:b/>
+                <w:sz w:val="18"/>
+              </w:rPr>
+              <w:t xml:space="preserve">$92,269–$98,215 avg</w:t>
+            </w:r>
+            <w:r>
+              <w:rPr>
+                <w:sz w:val="18"/>
+              </w:rPr>
+              <w:t xml:space="preserve">; up to $158,287</w:t>
+            </w:r>
+          </w:p>
+        </w:tc>
+        <w:tc>
+          <w:tcPr>
+            <w:tcW w:w="3360" w:type="dxa"/>
+          </w:tcPr>
+          <w:p>
+            <w:pPr>
+              <w:spacing w:before="40" w:after="40"/>
+            </w:pPr>
+            <w:hyperlink r:id="rHl42">
+              <w:r>
+                <w:rPr>
+                  <w:rStyle w:val="Hyperlink"/>
+                  <w:sz w:val="18"/>
+                </w:rPr>
+                <w:t xml:space="preserve">Glassdoor</w:t>
+              </w:r>
+            </w:hyperlink>
+            <w:r>
+              <w:rPr>
+                <w:sz w:val="18"/>
+              </w:rPr>
+              <w:t xml:space="preserve">; </w:t>
+            </w:r>
+            <w:hyperlink r:id="rHl43">
+              <w:r>
+                <w:rPr>
+                  <w:rStyle w:val="Hyperlink"/>
+                  <w:sz w:val="18"/>
+                </w:rPr>
+                <w:t xml:space="preserve">ZipRecruiter</w:t>
+              </w:r>
+            </w:hyperlink>
+          </w:p>
+        </w:tc>
+      </w:tr>
+      <w:tr>
+        <w:tc>
+          <w:tcPr>
+            <w:tcW w:w="3360" w:type="dxa"/>
+          </w:tcPr>
+          <w:p>
+            <w:pPr>
+              <w:spacing w:before="40" w:after="40"/>
+            </w:pPr>
+            <w:r>
+              <w:rPr>
+                <w:b/>
+                <w:sz w:val="18"/>
+              </w:rPr>
+              <w:t xml:space="preserve">Gallery director</w:t>
+            </w:r>
+          </w:p>
+        </w:tc>
+        <w:tc>
+          <w:tcPr>
+            <w:tcW w:w="3360" w:type="dxa"/>
+          </w:tcPr>
+          <w:p>
+            <w:pPr>
+              <w:spacing w:before="40" w:after="40"/>
+            </w:pPr>
+            <w:r>
+              <w:rPr>
+                <w:b/>
+                <w:sz w:val="18"/>
+              </w:rPr>
+              <w:t xml:space="preserve">$72,850–$82,904 avg</w:t>
+            </w:r>
+            <w:r>
+              <w:rPr>
+                <w:sz w:val="18"/>
+              </w:rPr>
+              <w:t xml:space="preserve">; up to $142,034</w:t>
+            </w:r>
+          </w:p>
+        </w:tc>
+        <w:tc>
+          <w:tcPr>
+            <w:tcW w:w="3360" w:type="dxa"/>
+          </w:tcPr>
+          <w:p>
+            <w:pPr>
+              <w:spacing w:before="40" w:after="40"/>
+            </w:pPr>
+            <w:hyperlink r:id="rHl44">
+              <w:r>
+                <w:rPr>
+                  <w:rStyle w:val="Hyperlink"/>
+                  <w:sz w:val="18"/>
+                </w:rPr>
+                <w:t xml:space="preserve">Glassdoor</w:t>
+              </w:r>
+            </w:hyperlink>
+          </w:p>
+        </w:tc>
+      </w:tr>
+      <w:tr>
+        <w:tc>
+          <w:tcPr>
+            <w:tcW w:w="3360" w:type="dxa"/>
+          </w:tcPr>
+          <w:p>
+            <w:pPr>
+              <w:spacing w:before="40" w:after="40"/>
+            </w:pPr>
+            <w:r>
+              <w:rPr>
+                <w:b/>
+                <w:sz w:val="18"/>
+              </w:rPr>
+              <w:t xml:space="preserve">Interior designer</w:t>
+            </w:r>
+            <w:r>
+              <w:rPr>
+                <w:sz w:val="18"/>
+              </w:rPr>
+              <w:t xml:space="preserve"> (BLS, the largest group doing this work)</w:t>
+            </w:r>
+          </w:p>
+        </w:tc>
+        <w:tc>
+          <w:tcPr>
+            <w:tcW w:w="3360" w:type="dxa"/>
+          </w:tcPr>
+          <w:p>
+            <w:pPr>
+              <w:spacing w:before="40" w:after="40"/>
+            </w:pPr>
+            <w:r>
+              <w:rPr>
+                <w:b/>
+                <w:sz w:val="18"/>
+              </w:rPr>
+              <w:t xml:space="preserve">median $63,490</w:t>
+            </w:r>
+            <w:r>
+              <w:rPr>
+                <w:sz w:val="18"/>
+              </w:rPr>
+              <w:t xml:space="preserve"> (May 2024); </w:t>
+            </w:r>
+            <w:r>
+              <w:rPr>
+                <w:b/>
+                <w:sz w:val="18"/>
+              </w:rPr>
+              <w:t xml:space="preserve">87,100 jobs</w:t>
+            </w:r>
+          </w:p>
+        </w:tc>
+        <w:tc>
+          <w:tcPr>
+            <w:tcW w:w="3360" w:type="dxa"/>
+          </w:tcPr>
+          <w:p>
+            <w:pPr>
+              <w:spacing w:before="40" w:after="40"/>
+            </w:pPr>
+            <w:hyperlink r:id="rHl11">
+              <w:r>
+                <w:rPr>
+                  <w:rStyle w:val="Hyperlink"/>
+                  <w:sz w:val="18"/>
+                </w:rPr>
+                <w:t xml:space="preserve">BLS</w:t>
+              </w:r>
+            </w:hyperlink>
+          </w:p>
+        </w:tc>
+      </w:tr>
+    </w:tbl>
+    <w:p>
+      <w:pPr>
+        <w:spacing w:after="0"/>
+      </w:pPr>
+    </w:p>
+    <w:p>
+      <w:pPr>
+        <w:pStyle w:val="Heading2"/>
+      </w:pPr>
+      <w:r>
+        <w:t xml:space="preserve">What this says about the product</w:t>
+      </w:r>
+    </w:p>
+    <w:p>
+      <w:r>
+        <w:rPr>
+          <w:b/>
+        </w:rPr>
+        <w:t xml:space="preserve">The brief-compiling job is real, professional, and priced two ways at once:</w:t>
+      </w:r>
+    </w:p>
+    <w:p>
+      <w:pPr>
+        <w:numPr>
+          <w:ilvl w:val="0"/>
+          <w:numId w:val="1"/>
+        </w:numPr>
+      </w:pPr>
+      <w:r>
+        <w:rPr>
+          <w:b/>
+        </w:rPr>
+        <w:t xml:space="preserve">As labor:</w:t>
+      </w:r>
+      <w:r>
+        <w:t xml:space="preserve"> $63,000–$98,000 a year — roughly </w:t>
+      </w:r>
+      <w:r>
+        <w:rPr>
+          <w:b/>
+        </w:rPr>
+        <w:t xml:space="preserve">$30–$47 an hour</w:t>
+      </w:r>
+      <w:r>
+        <w:t xml:space="preserve"> for the person who turns a space and a taste into an artwork specification.</w:t>
+      </w:r>
+    </w:p>
+    <w:p>
+      <w:pPr>
+        <w:numPr>
+          <w:ilvl w:val="0"/>
+          <w:numId w:val="1"/>
+        </w:numPr>
+      </w:pPr>
+      <w:r>
+        <w:rPr>
+          <w:b/>
+        </w:rPr>
+        <w:t xml:space="preserve">As a transaction fee:</w:t>
+      </w:r>
+      <w:r>
+        <w:t xml:space="preserve"> </w:t>
+      </w:r>
+      <w:r>
+        <w:rPr>
+          <w:b/>
+        </w:rPr>
+        <w:t xml:space="preserve">5–20% of the artwork</w:t>
+      </w:r>
+      <w:r>
+        <w:t xml:space="preserve">, which is *lower* than the gallery's 30–50% your premise is attacking. </w:t>
+      </w:r>
+      <w:r>
+        <w:rPr>
+          <w:b/>
+        </w:rPr>
+        <w:t xml:space="preserve">Art advisors already undercut galleries.</w:t>
+      </w:r>
+      <w:r>
+        <w:t xml:space="preserve"> You are not entering an unpriced market; you're entering one where the incumbent middleman charges 10% and the premium middleman charges 50%.</w:t>
+      </w:r>
+    </w:p>
+    <w:p>
+      <w:r>
+        <w:rPr>
+          <w:b/>
+        </w:rPr>
+        <w:t xml:space="preserve">The strategic read:</w:t>
+      </w:r>
+      <w:r>
+        <w:t xml:space="preserve"> at 10–20% of a $5,000 commission, your app's natural price is </w:t>
+      </w:r>
+      <w:r>
+        <w:rPr>
+          <w:b/>
+        </w:rPr>
+        <w:t xml:space="preserve">$500–$1,000 per successful commission</w:t>
+      </w:r>
+      <w:r>
+        <w:t xml:space="preserve">, not a monthly subscription. That is a transaction-fee business — which also means you only get paid when a commission actually completes, and every complaint in Theme 4 above is about what happens when it doesn't.</w:t>
+      </w:r>
+    </w:p>
+    <w:p>
+      <w:pPr>
+        <w:pBdr>
+          <w:bottom w:val="single" w:sz="6" w:space="6" w:color="C9CCD1"/>
+        </w:pBdr>
+      </w:pPr>
+    </w:p>
+    <w:p>
+      <w:pPr>
+        <w:pStyle w:val="Heading1"/>
+      </w:pPr>
+      <w:r>
+        <w:t xml:space="preserve">Flags</w:t>
+      </w:r>
+    </w:p>
+    <w:tbl>
+      <w:tblPr>
+        <w:tblW w:w="10080" w:type="dxa"/>
+        <w:tblBorders>
+          <w:top w:val="single" w:sz="4" w:space="0" w:color="C9CCD1"/>
+          <w:left w:val="single" w:sz="4" w:space="0" w:color="C9CCD1"/>
+          <w:bottom w:val="single" w:sz="4" w:space="0" w:color="C9CCD1"/>
+          <w:right w:val="single" w:sz="4" w:space="0" w:color="C9CCD1"/>
+          <w:insideH w:val="single" w:sz="4" w:space="0" w:color="C9CCD1"/>
+          <w:insideV w:val="single" w:sz="4" w:space="0" w:color="C9CCD1"/>
+        </w:tblBorders>
+        <w:tblLayout w:type="fixed"/>
+      </w:tblPr>
+      <w:tblGrid>
+        <w:gridCol w:w="5040"/>
+        <w:gridCol w:w="5040"/>
+      </w:tblGrid>
+      <w:tr>
+        <w:trPr>
+          <w:tblHeader/>
+        </w:trPr>
+        <w:tc>
+          <w:tcPr>
+            <w:tcW w:w="5040" w:type="dxa"/>
+            <w:shd w:val="clear" w:color="auto" w:fill="EFF1F3"/>
+          </w:tcPr>
+          <w:p>
+            <w:pPr>
+              <w:spacing w:before="40" w:after="40"/>
+            </w:pPr>
+            <w:r>
+              <w:rPr>
+                <w:b/>
+                <w:sz w:val="18"/>
+              </w:rPr>
+              <w:t xml:space="preserve">Item</w:t>
+            </w:r>
+          </w:p>
+        </w:tc>
+        <w:tc>
+          <w:tcPr>
+            <w:tcW w:w="5040" w:type="dxa"/>
+            <w:shd w:val="clear" w:color="auto" w:fill="EFF1F3"/>
+          </w:tcPr>
+          <w:p>
+            <w:pPr>
+              <w:spacing w:before="40" w:after="40"/>
+            </w:pPr>
+            <w:r>
+              <w:rPr>
+                <w:b/>
+                <w:sz w:val="18"/>
+              </w:rPr>
+              <w:t xml:space="preserve">Status</w:t>
+            </w:r>
+          </w:p>
+        </w:tc>
+      </w:tr>
+      <w:tr>
+        <w:tc>
+          <w:tcPr>
+            <w:tcW w:w="5040" w:type="dxa"/>
+          </w:tcPr>
+          <w:p>
+            <w:pPr>
+              <w:spacing w:before="40" w:after="40"/>
+            </w:pPr>
+            <w:r>
+              <w:rPr>
+                <w:b/>
+                <w:sz w:val="18"/>
+              </w:rPr>
+              <w:t xml:space="preserve">The combined product doesn't exist</w:t>
+            </w:r>
+          </w:p>
+        </w:tc>
+        <w:tc>
+          <w:tcPr>
+            <w:tcW w:w="5040" w:type="dxa"/>
+          </w:tcPr>
+          <w:p>
+            <w:pPr>
+              <w:spacing w:before="40" w:after="40"/>
+            </w:pPr>
+            <w:r>
+              <w:rPr>
+                <w:sz w:val="18"/>
+              </w:rPr>
+              <w:t xml:space="preserve">⚠️ No app ships your full feature set. All 390 reviews are </w:t>
+            </w:r>
+            <w:r>
+              <w:rPr>
+                <w:b/>
+                <w:sz w:val="18"/>
+              </w:rPr>
+              <w:t xml:space="preserve">feature analogs</w:t>
+            </w:r>
+            <w:r>
+              <w:rPr>
+                <w:sz w:val="18"/>
+              </w:rPr>
+              <w:t xml:space="preserve">, not competitors. Treat them as a risk model.</w:t>
+            </w:r>
+          </w:p>
+        </w:tc>
+      </w:tr>
+      <w:tr>
+        <w:tc>
+          <w:tcPr>
+            <w:tcW w:w="5040" w:type="dxa"/>
+          </w:tcPr>
+          <w:p>
+            <w:pPr>
+              <w:spacing w:before="40" w:after="40"/>
+            </w:pPr>
+            <w:r>
+              <w:rPr>
+                <w:b/>
+                <w:sz w:val="18"/>
+              </w:rPr>
+              <w:t xml:space="preserve">Reddit</w:t>
+            </w:r>
+          </w:p>
+        </w:tc>
+        <w:tc>
+          <w:tcPr>
+            <w:tcW w:w="5040" w:type="dxa"/>
+          </w:tcPr>
+          <w:p>
+            <w:pPr>
+              <w:spacing w:before="40" w:after="40"/>
+            </w:pPr>
+            <w:r>
+              <w:rPr>
+                <w:sz w:val="18"/>
+              </w:rPr>
+              <w:t xml:space="preserve">❌ Blocked — the largest evidence gap here, since commission disputes are discussed there and almost nowhere else I can reach.</w:t>
+            </w:r>
+          </w:p>
+        </w:tc>
+      </w:tr>
+      <w:tr>
+        <w:tc>
+          <w:tcPr>
+            <w:tcW w:w="5040" w:type="dxa"/>
+          </w:tcPr>
+          <w:p>
+            <w:pPr>
+              <w:spacing w:before="40" w:after="40"/>
+            </w:pPr>
+            <w:r>
+              <w:rPr>
+                <w:b/>
+                <w:sz w:val="18"/>
+              </w:rPr>
+              <w:t xml:space="preserve">G2 / Capterra</w:t>
+            </w:r>
+          </w:p>
+        </w:tc>
+        <w:tc>
+          <w:tcPr>
+            <w:tcW w:w="5040" w:type="dxa"/>
+          </w:tcPr>
+          <w:p>
+            <w:pPr>
+              <w:spacing w:before="40" w:after="40"/>
+            </w:pPr>
+            <w:r>
+              <w:rPr>
+                <w:sz w:val="18"/>
+              </w:rPr>
+              <w:t xml:space="preserve">❌ G2 blocked; Capterra's art category is gallery-management software for galleries.</w:t>
+            </w:r>
+          </w:p>
+        </w:tc>
+      </w:tr>
+      <w:tr>
+        <w:tc>
+          <w:tcPr>
+            <w:tcW w:w="5040" w:type="dxa"/>
+          </w:tcPr>
+          <w:p>
+            <w:pPr>
+              <w:spacing w:before="40" w:after="40"/>
+            </w:pPr>
+            <w:r>
+              <w:rPr>
+                <w:b/>
+                <w:sz w:val="18"/>
+              </w:rPr>
+              <w:t xml:space="preserve">Verbatim quotes</w:t>
+            </w:r>
+          </w:p>
+        </w:tc>
+        <w:tc>
+          <w:tcPr>
+            <w:tcW w:w="5040" w:type="dxa"/>
+          </w:tcPr>
+          <w:p>
+            <w:pPr>
+              <w:spacing w:before="40" w:after="40"/>
+            </w:pPr>
+            <w:r>
+              <w:rPr>
+                <w:sz w:val="18"/>
+              </w:rPr>
+              <w:t xml:space="preserve">⚠️ Paraphrased with app, rating, date and handle; originals in the JSON beside this file.</w:t>
+            </w:r>
+          </w:p>
+        </w:tc>
+      </w:tr>
+      <w:tr>
+        <w:tc>
+          <w:tcPr>
+            <w:tcW w:w="5040" w:type="dxa"/>
+          </w:tcPr>
+          <w:p>
+            <w:pPr>
+              <w:spacing w:before="40" w:after="40"/>
+            </w:pPr>
+            <w:r>
+              <w:rPr>
+                <w:b/>
+                <w:sz w:val="18"/>
+              </w:rPr>
+              <w:t xml:space="preserve">Analog bias</w:t>
+            </w:r>
+          </w:p>
+        </w:tc>
+        <w:tc>
+          <w:tcPr>
+            <w:tcW w:w="5040" w:type="dxa"/>
+          </w:tcPr>
+          <w:p>
+            <w:pPr>
+              <w:spacing w:before="40" w:after="40"/>
+            </w:pPr>
+            <w:r>
+              <w:rPr>
+                <w:sz w:val="18"/>
+              </w:rPr>
+              <w:t xml:space="preserve">⚠️ Renovate AI and Home AI are </w:t>
+            </w:r>
+            <w:r>
+              <w:rPr>
+                <w:b/>
+                <w:sz w:val="18"/>
+              </w:rPr>
+              <w:t xml:space="preserve">interior-design</w:t>
+            </w:r>
+            <w:r>
+              <w:rPr>
+                <w:sz w:val="18"/>
+              </w:rPr>
+              <w:t xml:space="preserve"> apps, not art apps. They're the best available proxy for "photograph your room, let AI change it," but their users want renovations, not paintings.</w:t>
+            </w:r>
+          </w:p>
+        </w:tc>
+      </w:tr>
+      <w:tr>
+        <w:tc>
+          <w:tcPr>
+            <w:tcW w:w="5040" w:type="dxa"/>
+          </w:tcPr>
+          <w:p>
+            <w:pPr>
+              <w:spacing w:before="40" w:after="40"/>
+            </w:pPr>
+            <w:r>
+              <w:rPr>
+                <w:b/>
+                <w:sz w:val="18"/>
+              </w:rPr>
+              <w:t xml:space="preserve">Fiverr as a vetting proxy</w:t>
+            </w:r>
+          </w:p>
+        </w:tc>
+        <w:tc>
+          <w:tcPr>
+            <w:tcW w:w="5040" w:type="dxa"/>
+          </w:tcPr>
+          <w:p>
+            <w:pPr>
+              <w:spacing w:before="40" w:after="40"/>
+            </w:pPr>
+            <w:r>
+              <w:rPr>
+                <w:sz w:val="18"/>
+              </w:rPr>
+              <w:t xml:space="preserve">⚠️ Fiverr spans all freelance services; its scam complaints are not specific to art commissions.</w:t>
+            </w:r>
+          </w:p>
+        </w:tc>
+      </w:tr>
+      <w:tr>
+        <w:tc>
+          <w:tcPr>
+            <w:tcW w:w="5040" w:type="dxa"/>
+          </w:tcPr>
+          <w:p>
+            <w:pPr>
+              <w:spacing w:before="40" w:after="40"/>
+            </w:pPr>
+            <w:r>
+              <w:rPr>
+                <w:b/>
+                <w:sz w:val="18"/>
+              </w:rPr>
+              <w:t xml:space="preserve">Theme counts</w:t>
+            </w:r>
+          </w:p>
+        </w:tc>
+        <w:tc>
+          <w:tcPr>
+            <w:tcW w:w="5040" w:type="dxa"/>
+          </w:tcPr>
+          <w:p>
+            <w:pPr>
+              <w:spacing w:before="40" w:after="40"/>
+            </w:pPr>
+            <w:r>
+              <w:rPr>
+                <w:sz w:val="18"/>
+              </w:rPr>
+              <w:t xml:space="preserve">⚠️ Keyword matching over review text, spot-checked by reading. Magnitudes, not precision; reviews can count in several themes.</w:t>
+            </w:r>
+          </w:p>
+        </w:tc>
+      </w:tr>
+      <w:tr>
+        <w:tc>
+          <w:tcPr>
+            <w:tcW w:w="5040" w:type="dxa"/>
+          </w:tcPr>
+          <w:p>
+            <w:pPr>
+              <w:spacing w:before="40" w:after="40"/>
+            </w:pPr>
+            <w:r>
+              <w:rPr>
+                <w:b/>
+                <w:sz w:val="18"/>
+              </w:rPr>
+              <w:t xml:space="preserve">Salary figures</w:t>
+            </w:r>
+          </w:p>
+        </w:tc>
+        <w:tc>
+          <w:tcPr>
+            <w:tcW w:w="5040" w:type="dxa"/>
+          </w:tcPr>
+          <w:p>
+            <w:pPr>
+              <w:spacing w:before="40" w:after="40"/>
+            </w:pPr>
+            <w:r>
+              <w:rPr>
+                <w:sz w:val="18"/>
+              </w:rPr>
+              <w:t xml:space="preserve">⚠️ Glassdoor/ZipRecruiter self-reported estimates, except the BLS interior-designer figure.</w:t>
+            </w:r>
+          </w:p>
+        </w:tc>
+      </w:tr>
+      <w:tr>
+        <w:tc>
+          <w:tcPr>
+            <w:tcW w:w="5040" w:type="dxa"/>
+          </w:tcPr>
+          <w:p>
+            <w:pPr>
+              <w:spacing w:before="40" w:after="40"/>
+            </w:pPr>
+            <w:r>
+              <w:rPr>
+                <w:b/>
+                <w:sz w:val="18"/>
+              </w:rPr>
+              <w:t xml:space="preserve">Advisor fee percentages</w:t>
+            </w:r>
+          </w:p>
+        </w:tc>
+        <w:tc>
+          <w:tcPr>
+            <w:tcW w:w="5040" w:type="dxa"/>
+          </w:tcPr>
+          <w:p>
+            <w:pPr>
+              <w:spacing w:before="40" w:after="40"/>
+            </w:pPr>
+            <w:r>
+              <w:rPr>
+                <w:sz w:val="18"/>
+              </w:rPr>
+              <w:t xml:space="preserve">⚠️ From art-advisory firms' own marketing pages — parties with an interest in the anchor. Consistent across sources but not independent.</w:t>
+            </w:r>
+          </w:p>
+        </w:tc>
+      </w:tr>
+      <w:tr>
+        <w:tc>
+          <w:tcPr>
+            <w:tcW w:w="5040" w:type="dxa"/>
+          </w:tcPr>
+          <w:p>
+            <w:pPr>
+              <w:spacing w:before="40" w:after="40"/>
+            </w:pPr>
+            <w:r>
+              <w:rPr>
+                <w:b/>
+                <w:sz w:val="18"/>
+              </w:rPr>
+              <w:t xml:space="preserve">Google Play</w:t>
+            </w:r>
+          </w:p>
+        </w:tc>
+        <w:tc>
+          <w:tcPr>
+            <w:tcW w:w="5040" w:type="dxa"/>
+          </w:tcPr>
+          <w:p>
+            <w:pPr>
+              <w:spacing w:before="40" w:after="40"/>
+            </w:pPr>
+            <w:r>
+              <w:rPr>
+                <w:sz w:val="18"/>
+              </w:rPr>
+              <w:t xml:space="preserve">❌ Not collected.</w:t>
             </w:r>
           </w:p>
         </w:tc>

</xml_diff>

<commit_message>
Add ArtCommissionApp competitor teardown of the five closest products
Co-Authored-By: Claude Opus 5 <noreply@anthropic.com>
</commit_message>
<xml_diff>
--- a/10_ArtCommissionApp/ResearchAgents/ArtCommissionApp_Research.docx
+++ b/10_ArtCommissionApp/ResearchAgents/ArtCommissionApp_Research.docx
@@ -82,6 +82,17 @@
       </w:pPr>
       <w:r>
         <w:t xml:space="preserve">Section 2 — Complaint Themes &amp; What Humans Are Paid: six themes from 390 feature-analog reviews, plus what art advisors and producers charge to compile a brief. *(Added Sept 22, 2026)*</w:t>
+      </w:r>
+    </w:p>
+    <w:p>
+      <w:pPr>
+        <w:numPr>
+          <w:ilvl w:val="0"/>
+          <w:numId w:val="1"/>
+        </w:numPr>
+      </w:pPr>
+      <w:r>
+        <w:t xml:space="preserve">Section 3 — Competitor Teardown: the five closest products, their pricing, funding and complaints, plus the gaps nobody serves. *(Added Sept 22, 2026)*</w:t>
       </w:r>
     </w:p>
     <w:p>
@@ -7308,6 +7319,2365 @@
                 <w:sz w:val="18"/>
               </w:rPr>
               <w:t xml:space="preserve">❌ Not collected.</w:t>
+            </w:r>
+          </w:p>
+        </w:tc>
+      </w:tr>
+    </w:tbl>
+    <w:p>
+      <w:pPr>
+        <w:spacing w:after="0"/>
+      </w:pPr>
+    </w:p>
+    <w:p>
+      <w:r>
+        <w:br w:type="page"/>
+      </w:r>
+    </w:p>
+    <w:p>
+      <w:pPr>
+        <w:pStyle w:val="Title"/>
+      </w:pPr>
+      <w:r>
+        <w:t xml:space="preserve">Competitor Teardown — Top 5 Products</w:t>
+      </w:r>
+    </w:p>
+    <w:p>
+      <w:r>
+        <w:rPr>
+          <w:b/>
+        </w:rPr>
+        <w:t xml:space="preserve">Prepared:</w:t>
+      </w:r>
+      <w:r>
+        <w:t xml:space="preserve"> September 22, 2026</w:t>
+      </w:r>
+    </w:p>
+    <w:p>
+      <w:r>
+        <w:rPr>
+          <w:b/>
+        </w:rPr>
+        <w:t xml:space="preserve">Selection:</w:t>
+      </w:r>
+      <w:r>
+        <w:t xml:space="preserve"> The five products that cover the most of your feature set — room fit, size/palette/theme selection, inspiration upload, artist vetting, and commissioning a human to make the final work. </w:t>
+      </w:r>
+      <w:r>
+        <w:rPr>
+          <w:b/>
+        </w:rPr>
+        <w:t xml:space="preserve">No product ships all of it</w:t>
+      </w:r>
+      <w:r>
+        <w:t xml:space="preserve">; each covers a slice.</w:t>
+      </w:r>
+    </w:p>
+    <w:p>
+      <w:r>
+        <w:rPr>
+          <w:b/>
+        </w:rPr>
+        <w:t xml:space="preserve">Anything inferred rather than read is tagged `[UNVERIFIED]`.</w:t>
+      </w:r>
+      <w:r>
+        <w:t xml:space="preserve"> Complaints are paraphrased with source, rating and date (originals in </w:t>
+      </w:r>
+      <w:hyperlink r:id="rHl30">
+        <w:r>
+          <w:rPr>
+            <w:rStyle w:val="Hyperlink"/>
+          </w:rPr>
+          <w:t xml:space="preserve">appstore-reviews-18mo.json</w:t>
+        </w:r>
+      </w:hyperlink>
+      <w:r>
+        <w:t xml:space="preserve">).</w:t>
+      </w:r>
+    </w:p>
+    <w:p>
+      <w:pPr>
+        <w:pBdr>
+          <w:bottom w:val="single" w:sz="6" w:space="6" w:color="C9CCD1"/>
+        </w:pBdr>
+      </w:pPr>
+    </w:p>
+    <w:p>
+      <w:pPr>
+        <w:pStyle w:val="Heading1"/>
+      </w:pPr>
+      <w:r>
+        <w:t xml:space="preserve">Master comparison table</w:t>
+      </w:r>
+    </w:p>
+    <w:tbl>
+      <w:tblPr>
+        <w:tblW w:w="10080" w:type="dxa"/>
+        <w:tblBorders>
+          <w:top w:val="single" w:sz="4" w:space="0" w:color="C9CCD1"/>
+          <w:left w:val="single" w:sz="4" w:space="0" w:color="C9CCD1"/>
+          <w:bottom w:val="single" w:sz="4" w:space="0" w:color="C9CCD1"/>
+          <w:right w:val="single" w:sz="4" w:space="0" w:color="C9CCD1"/>
+          <w:insideH w:val="single" w:sz="4" w:space="0" w:color="C9CCD1"/>
+          <w:insideV w:val="single" w:sz="4" w:space="0" w:color="C9CCD1"/>
+        </w:tblBorders>
+        <w:tblLayout w:type="fixed"/>
+      </w:tblPr>
+      <w:tblGrid>
+        <w:gridCol w:w="1680"/>
+        <w:gridCol w:w="1680"/>
+        <w:gridCol w:w="1680"/>
+        <w:gridCol w:w="1680"/>
+        <w:gridCol w:w="1680"/>
+        <w:gridCol w:w="1680"/>
+      </w:tblGrid>
+      <w:tr>
+        <w:trPr>
+          <w:tblHeader/>
+        </w:trPr>
+        <w:tc>
+          <w:tcPr>
+            <w:tcW w:w="1680" w:type="dxa"/>
+            <w:shd w:val="clear" w:color="auto" w:fill="EFF1F3"/>
+          </w:tcPr>
+          <w:p>
+            <w:pPr>
+              <w:spacing w:before="40" w:after="40"/>
+            </w:pPr>
+            <w:r>
+              <w:rPr>
+                <w:b/>
+                <w:sz w:val="18"/>
+              </w:rPr>
+              <w:t xml:space="preserve">Product</w:t>
+            </w:r>
+          </w:p>
+        </w:tc>
+        <w:tc>
+          <w:tcPr>
+            <w:tcW w:w="1680" w:type="dxa"/>
+            <w:shd w:val="clear" w:color="auto" w:fill="EFF1F3"/>
+          </w:tcPr>
+          <w:p>
+            <w:pPr>
+              <w:spacing w:before="40" w:after="40"/>
+            </w:pPr>
+            <w:r>
+              <w:rPr>
+                <w:b/>
+                <w:sz w:val="18"/>
+              </w:rPr>
+              <w:t xml:space="preserve">Pricing (source)</w:t>
+            </w:r>
+          </w:p>
+        </w:tc>
+        <w:tc>
+          <w:tcPr>
+            <w:tcW w:w="1680" w:type="dxa"/>
+            <w:shd w:val="clear" w:color="auto" w:fill="EFF1F3"/>
+          </w:tcPr>
+          <w:p>
+            <w:pPr>
+              <w:spacing w:before="40" w:after="40"/>
+            </w:pPr>
+            <w:r>
+              <w:rPr>
+                <w:b/>
+                <w:sz w:val="18"/>
+              </w:rPr>
+              <w:t xml:space="preserve">Three core features</w:t>
+            </w:r>
+          </w:p>
+        </w:tc>
+        <w:tc>
+          <w:tcPr>
+            <w:tcW w:w="1680" w:type="dxa"/>
+            <w:shd w:val="clear" w:color="auto" w:fill="EFF1F3"/>
+          </w:tcPr>
+          <w:p>
+            <w:pPr>
+              <w:spacing w:before="40" w:after="40"/>
+            </w:pPr>
+            <w:r>
+              <w:rPr>
+                <w:b/>
+                <w:sz w:val="18"/>
+              </w:rPr>
+              <w:t xml:space="preserve">Target customer</w:t>
+            </w:r>
+          </w:p>
+        </w:tc>
+        <w:tc>
+          <w:tcPr>
+            <w:tcW w:w="1680" w:type="dxa"/>
+            <w:shd w:val="clear" w:color="auto" w:fill="EFF1F3"/>
+          </w:tcPr>
+          <w:p>
+            <w:pPr>
+              <w:spacing w:before="40" w:after="40"/>
+            </w:pPr>
+            <w:r>
+              <w:rPr>
+                <w:b/>
+                <w:sz w:val="18"/>
+              </w:rPr>
+              <w:t xml:space="preserve">Funding / ownership</w:t>
+            </w:r>
+          </w:p>
+        </w:tc>
+        <w:tc>
+          <w:tcPr>
+            <w:tcW w:w="1680" w:type="dxa"/>
+            <w:shd w:val="clear" w:color="auto" w:fill="EFF1F3"/>
+          </w:tcPr>
+          <w:p>
+            <w:pPr>
+              <w:spacing w:before="40" w:after="40"/>
+            </w:pPr>
+            <w:r>
+              <w:rPr>
+                <w:b/>
+                <w:sz w:val="18"/>
+              </w:rPr>
+              <w:t xml:space="preserve">Three most common complaints</w:t>
+            </w:r>
+          </w:p>
+        </w:tc>
+      </w:tr>
+      <w:tr>
+        <w:tc>
+          <w:tcPr>
+            <w:tcW w:w="1680" w:type="dxa"/>
+          </w:tcPr>
+          <w:p>
+            <w:pPr>
+              <w:spacing w:before="40" w:after="40"/>
+            </w:pPr>
+            <w:r>
+              <w:rPr>
+                <w:b/>
+                <w:sz w:val="18"/>
+              </w:rPr>
+              <w:t xml:space="preserve">1. Saatchi Art</w:t>
+            </w:r>
+          </w:p>
+        </w:tc>
+        <w:tc>
+          <w:tcPr>
+            <w:tcW w:w="1680" w:type="dxa"/>
+          </w:tcPr>
+          <w:p>
+            <w:pPr>
+              <w:spacing w:before="40" w:after="40"/>
+            </w:pPr>
+            <w:r>
+              <w:rPr>
+                <w:b/>
+                <w:sz w:val="18"/>
+              </w:rPr>
+              <w:t xml:space="preserve">40% commission to the platform</w:t>
+            </w:r>
+            <w:r>
+              <w:rPr>
+                <w:sz w:val="18"/>
+              </w:rPr>
+              <w:t xml:space="preserve"> — raised from 35% in 2026; free to list; free to buyers — </w:t>
+            </w:r>
+            <w:hyperlink r:id="rHl45">
+              <w:r>
+                <w:rPr>
+                  <w:rStyle w:val="Hyperlink"/>
+                  <w:sz w:val="18"/>
+                </w:rPr>
+                <w:t xml:space="preserve">Saatchi Art help centre</w:t>
+              </w:r>
+            </w:hyperlink>
+            <w:r>
+              <w:rPr>
+                <w:sz w:val="18"/>
+              </w:rPr>
+              <w:t xml:space="preserve"> </w:t>
+            </w:r>
+            <w:r>
+              <w:rPr>
+                <w:rFonts w:ascii="Consolas" w:hAnsi="Consolas"/>
+                <w:sz w:val="18"/>
+              </w:rPr>
+              <w:t xml:space="preserve">[page is 403 to this tool; rate confirmed via multiple secondary sources]</w:t>
+            </w:r>
+          </w:p>
+        </w:tc>
+        <w:tc>
+          <w:tcPr>
+            <w:tcW w:w="1680" w:type="dxa"/>
+          </w:tcPr>
+          <w:p>
+            <w:pPr>
+              <w:spacing w:before="40" w:after="40"/>
+            </w:pPr>
+            <w:r>
+              <w:rPr>
+                <w:sz w:val="18"/>
+              </w:rPr>
+              <w:t xml:space="preserve">1. Curated marketplace of original work 2. </w:t>
+            </w:r>
+            <w:r>
+              <w:rPr>
+                <w:b/>
+                <w:sz w:val="18"/>
+              </w:rPr>
+              <w:t xml:space="preserve">"View in a Room"</w:t>
+            </w:r>
+            <w:r>
+              <w:rPr>
+                <w:sz w:val="18"/>
+              </w:rPr>
+              <w:t xml:space="preserve"> wall preview 3. Art Advisory service for buyers and commissions</w:t>
+            </w:r>
+          </w:p>
+        </w:tc>
+        <w:tc>
+          <w:tcPr>
+            <w:tcW w:w="1680" w:type="dxa"/>
+          </w:tcPr>
+          <w:p>
+            <w:pPr>
+              <w:spacing w:before="40" w:after="40"/>
+            </w:pPr>
+            <w:r>
+              <w:rPr>
+                <w:sz w:val="18"/>
+              </w:rPr>
+              <w:t xml:space="preserve">Buyers of original art; artists seeking reach</w:t>
+            </w:r>
+          </w:p>
+        </w:tc>
+        <w:tc>
+          <w:tcPr>
+            <w:tcW w:w="1680" w:type="dxa"/>
+          </w:tcPr>
+          <w:p>
+            <w:pPr>
+              <w:spacing w:before="40" w:after="40"/>
+            </w:pPr>
+            <w:r>
+              <w:rPr>
+                <w:sz w:val="18"/>
+              </w:rPr>
+              <w:t xml:space="preserve">Acquired by Demand Media/</w:t>
+            </w:r>
+            <w:r>
+              <w:rPr>
+                <w:b/>
+                <w:sz w:val="18"/>
+              </w:rPr>
+              <w:t xml:space="preserve">Leaf Group</w:t>
+            </w:r>
+            <w:r>
+              <w:rPr>
+                <w:sz w:val="18"/>
+              </w:rPr>
+              <w:t xml:space="preserve"> (2014); Leaf Group bought by </w:t>
+            </w:r>
+            <w:r>
+              <w:rPr>
+                <w:b/>
+                <w:sz w:val="18"/>
+              </w:rPr>
+              <w:t xml:space="preserve">Graham Holdings for $323M (2021)</w:t>
+            </w:r>
+            <w:r>
+              <w:rPr>
+                <w:sz w:val="18"/>
+              </w:rPr>
+              <w:t xml:space="preserve">; marketplaces separated in a 2023 restructure (</w:t>
+            </w:r>
+            <w:hyperlink r:id="rHl46">
+              <w:r>
+                <w:rPr>
+                  <w:rStyle w:val="Hyperlink"/>
+                  <w:sz w:val="18"/>
+                </w:rPr>
+                <w:t xml:space="preserve">LA Business Journal</w:t>
+              </w:r>
+            </w:hyperlink>
+            <w:r>
+              <w:rPr>
+                <w:sz w:val="18"/>
+              </w:rPr>
+              <w:t xml:space="preserve">)</w:t>
+            </w:r>
+          </w:p>
+        </w:tc>
+        <w:tc>
+          <w:tcPr>
+            <w:tcW w:w="1680" w:type="dxa"/>
+          </w:tcPr>
+          <w:p>
+            <w:pPr>
+              <w:spacing w:before="40" w:after="40"/>
+            </w:pPr>
+            <w:r>
+              <w:rPr>
+                <w:b/>
+                <w:sz w:val="18"/>
+              </w:rPr>
+              <w:t xml:space="preserve">Commission raised 35% → 40%</w:t>
+            </w:r>
+            <w:r>
+              <w:rPr>
+                <w:sz w:val="18"/>
+              </w:rPr>
+              <w:t xml:space="preserve"> (artist grievance); shipping overcharge with no reply after 9 days (Sept 3 2026); a 50-year-career artist stuck in ID verification for 3 weeks, support unanswered (Sept 15 2026) — </w:t>
+            </w:r>
+            <w:hyperlink r:id="rHl20">
+              <w:r>
+                <w:rPr>
+                  <w:rStyle w:val="Hyperlink"/>
+                  <w:sz w:val="18"/>
+                </w:rPr>
+                <w:t xml:space="preserve">Trustpilot 4.5★/10,491</w:t>
+              </w:r>
+            </w:hyperlink>
+          </w:p>
+        </w:tc>
+      </w:tr>
+      <w:tr>
+        <w:tc>
+          <w:tcPr>
+            <w:tcW w:w="1680" w:type="dxa"/>
+          </w:tcPr>
+          <w:p>
+            <w:pPr>
+              <w:spacing w:before="40" w:after="40"/>
+            </w:pPr>
+            <w:r>
+              <w:rPr>
+                <w:b/>
+                <w:sz w:val="18"/>
+              </w:rPr>
+              <w:t xml:space="preserve">2. Artfinder</w:t>
+            </w:r>
+          </w:p>
+        </w:tc>
+        <w:tc>
+          <w:tcPr>
+            <w:tcW w:w="1680" w:type="dxa"/>
+          </w:tcPr>
+          <w:p>
+            <w:pPr>
+              <w:spacing w:before="40" w:after="40"/>
+            </w:pPr>
+            <w:r>
+              <w:rPr>
+                <w:b/>
+                <w:sz w:val="18"/>
+              </w:rPr>
+              <w:t xml:space="preserve">Free plan, or paid monthly plans that reduce commission</w:t>
+            </w:r>
+            <w:r>
+              <w:rPr>
+                <w:sz w:val="18"/>
+              </w:rPr>
+              <w:t xml:space="preserve">; exact percentages not published on the seller page — </w:t>
+            </w:r>
+            <w:hyperlink r:id="rHl47">
+              <w:r>
+                <w:rPr>
+                  <w:rStyle w:val="Hyperlink"/>
+                  <w:sz w:val="18"/>
+                </w:rPr>
+                <w:t xml:space="preserve">artfinder.com/sell</w:t>
+              </w:r>
+            </w:hyperlink>
+          </w:p>
+        </w:tc>
+        <w:tc>
+          <w:tcPr>
+            <w:tcW w:w="1680" w:type="dxa"/>
+          </w:tcPr>
+          <w:p>
+            <w:pPr>
+              <w:spacing w:before="40" w:after="40"/>
+            </w:pPr>
+            <w:r>
+              <w:rPr>
+                <w:sz w:val="18"/>
+              </w:rPr>
+              <w:t xml:space="preserve">1. Marketplace of 2,000+ artists, ~1M visitors/month 2. </w:t>
+            </w:r>
+            <w:r>
+              <w:rPr>
+                <w:b/>
+                <w:sz w:val="18"/>
+              </w:rPr>
+              <w:t xml:space="preserve">"Commission an Artwork"</w:t>
+            </w:r>
+            <w:r>
+              <w:rPr>
+                <w:sz w:val="18"/>
+              </w:rPr>
+              <w:t xml:space="preserve"> request flow 3. Direct artist–buyer relationship, curation team</w:t>
+            </w:r>
+          </w:p>
+        </w:tc>
+        <w:tc>
+          <w:tcPr>
+            <w:tcW w:w="1680" w:type="dxa"/>
+          </w:tcPr>
+          <w:p>
+            <w:pPr>
+              <w:spacing w:before="40" w:after="40"/>
+            </w:pPr>
+            <w:r>
+              <w:rPr>
+                <w:sz w:val="18"/>
+              </w:rPr>
+              <w:t xml:space="preserve">Buyers wanting original, non-mass-produced art; independent artists</w:t>
+            </w:r>
+          </w:p>
+        </w:tc>
+        <w:tc>
+          <w:tcPr>
+            <w:tcW w:w="1680" w:type="dxa"/>
+          </w:tcPr>
+          <w:p>
+            <w:pPr>
+              <w:spacing w:before="40" w:after="40"/>
+            </w:pPr>
+            <w:r>
+              <w:rPr>
+                <w:sz w:val="18"/>
+              </w:rPr>
+              <w:t xml:space="preserve">Private </w:t>
+            </w:r>
+            <w:r>
+              <w:rPr>
+                <w:rFonts w:ascii="Consolas" w:hAnsi="Consolas"/>
+                <w:sz w:val="18"/>
+              </w:rPr>
+              <w:t xml:space="preserve">[funding not verified]</w:t>
+            </w:r>
+          </w:p>
+        </w:tc>
+        <w:tc>
+          <w:tcPr>
+            <w:tcW w:w="1680" w:type="dxa"/>
+          </w:tcPr>
+          <w:p>
+            <w:pPr>
+              <w:spacing w:before="40" w:after="40"/>
+            </w:pPr>
+            <w:r>
+              <w:rPr>
+                <w:sz w:val="18"/>
+              </w:rPr>
+              <w:t xml:space="preserve">Framed work arriving warped, twice, with a bouncing support email (Aug 2026); difficulty reaching support after first contact — </w:t>
+            </w:r>
+            <w:hyperlink r:id="rHl48">
+              <w:r>
+                <w:rPr>
+                  <w:rStyle w:val="Hyperlink"/>
+                  <w:sz w:val="18"/>
+                </w:rPr>
+                <w:t xml:space="preserve">Trustpilot 4.7★/6,913</w:t>
+              </w:r>
+            </w:hyperlink>
+            <w:r>
+              <w:rPr>
+                <w:sz w:val="18"/>
+              </w:rPr>
+              <w:t xml:space="preserve">. </w:t>
+            </w:r>
+            <w:r>
+              <w:rPr>
+                <w:b/>
+                <w:sz w:val="18"/>
+              </w:rPr>
+              <w:t xml:space="preserve">No fee complaints visible</w:t>
+            </w:r>
+          </w:p>
+        </w:tc>
+      </w:tr>
+      <w:tr>
+        <w:tc>
+          <w:tcPr>
+            <w:tcW w:w="1680" w:type="dxa"/>
+          </w:tcPr>
+          <w:p>
+            <w:pPr>
+              <w:spacing w:before="40" w:after="40"/>
+            </w:pPr>
+            <w:r>
+              <w:rPr>
+                <w:b/>
+                <w:sz w:val="18"/>
+              </w:rPr>
+              <w:t xml:space="preserve">3. Etsy</w:t>
+            </w:r>
+          </w:p>
+        </w:tc>
+        <w:tc>
+          <w:tcPr>
+            <w:tcW w:w="1680" w:type="dxa"/>
+          </w:tcPr>
+          <w:p>
+            <w:pPr>
+              <w:spacing w:before="40" w:after="40"/>
+            </w:pPr>
+            <w:r>
+              <w:rPr>
+                <w:b/>
+                <w:sz w:val="18"/>
+              </w:rPr>
+              <w:t xml:space="preserve">$0.20 listing + 6.5% transaction + ~3% + $0.25 processing ≈ ~10% effective</w:t>
+            </w:r>
+            <w:r>
+              <w:rPr>
+                <w:sz w:val="18"/>
+              </w:rPr>
+              <w:t xml:space="preserve">; offsite ads extra — </w:t>
+            </w:r>
+            <w:hyperlink r:id="rHl49">
+              <w:r>
+                <w:rPr>
+                  <w:rStyle w:val="Hyperlink"/>
+                  <w:sz w:val="18"/>
+                </w:rPr>
+                <w:t xml:space="preserve">fee guides</w:t>
+              </w:r>
+            </w:hyperlink>
+            <w:r>
+              <w:rPr>
+                <w:sz w:val="18"/>
+              </w:rPr>
+              <w:t xml:space="preserve"> </w:t>
+            </w:r>
+            <w:r>
+              <w:rPr>
+                <w:rFonts w:ascii="Consolas" w:hAnsi="Consolas"/>
+                <w:sz w:val="18"/>
+              </w:rPr>
+              <w:t xml:space="preserve">[etsy.com/legal/fees is 403 to this tool]</w:t>
+            </w:r>
+          </w:p>
+        </w:tc>
+        <w:tc>
+          <w:tcPr>
+            <w:tcW w:w="1680" w:type="dxa"/>
+          </w:tcPr>
+          <w:p>
+            <w:pPr>
+              <w:spacing w:before="40" w:after="40"/>
+            </w:pPr>
+            <w:r>
+              <w:rPr>
+                <w:sz w:val="18"/>
+              </w:rPr>
+              <w:t xml:space="preserve">1. Largest custom-order marketplace 2. In-app AR preview 3. Direct buyer–seller messaging for custom work</w:t>
+            </w:r>
+          </w:p>
+        </w:tc>
+        <w:tc>
+          <w:tcPr>
+            <w:tcW w:w="1680" w:type="dxa"/>
+          </w:tcPr>
+          <w:p>
+            <w:pPr>
+              <w:spacing w:before="40" w:after="40"/>
+            </w:pPr>
+            <w:r>
+              <w:rPr>
+                <w:sz w:val="18"/>
+              </w:rPr>
+              <w:t xml:space="preserve">Mass-market buyers of handmade and custom goods; independent sellers</w:t>
+            </w:r>
+          </w:p>
+        </w:tc>
+        <w:tc>
+          <w:tcPr>
+            <w:tcW w:w="1680" w:type="dxa"/>
+          </w:tcPr>
+          <w:p>
+            <w:pPr>
+              <w:spacing w:before="40" w:after="40"/>
+            </w:pPr>
+            <w:r>
+              <w:rPr>
+                <w:b/>
+                <w:sz w:val="18"/>
+              </w:rPr>
+              <w:t xml:space="preserve">Public — NASDAQ: ETSY</w:t>
+            </w:r>
+          </w:p>
+        </w:tc>
+        <w:tc>
+          <w:tcPr>
+            <w:tcW w:w="1680" w:type="dxa"/>
+          </w:tcPr>
+          <w:p>
+            <w:pPr>
+              <w:spacing w:before="40" w:after="40"/>
+            </w:pPr>
+            <w:r>
+              <w:rPr>
+                <w:sz w:val="18"/>
+              </w:rPr>
+              <w:t xml:space="preserve">Account suspensions with no explanation or appeal; unresponsive support; withheld seller funds and failed buyer protection — </w:t>
+            </w:r>
+            <w:hyperlink r:id="rHl50">
+              <w:r>
+                <w:rPr>
+                  <w:rStyle w:val="Hyperlink"/>
+                  <w:sz w:val="18"/>
+                </w:rPr>
+                <w:t xml:space="preserve">Trustpilot **1.4★ / 21,264 reviews, 80% one-star**</w:t>
+              </w:r>
+            </w:hyperlink>
+          </w:p>
+        </w:tc>
+      </w:tr>
+      <w:tr>
+        <w:tc>
+          <w:tcPr>
+            <w:tcW w:w="1680" w:type="dxa"/>
+          </w:tcPr>
+          <w:p>
+            <w:pPr>
+              <w:spacing w:before="40" w:after="40"/>
+            </w:pPr>
+            <w:r>
+              <w:rPr>
+                <w:b/>
+                <w:sz w:val="18"/>
+              </w:rPr>
+              <w:t xml:space="preserve">4. Fiverr</w:t>
+            </w:r>
+          </w:p>
+        </w:tc>
+        <w:tc>
+          <w:tcPr>
+            <w:tcW w:w="1680" w:type="dxa"/>
+          </w:tcPr>
+          <w:p>
+            <w:pPr>
+              <w:spacing w:before="40" w:after="40"/>
+            </w:pPr>
+            <w:r>
+              <w:rPr>
+                <w:b/>
+                <w:sz w:val="18"/>
+              </w:rPr>
+              <w:t xml:space="preserve">20% seller commission</w:t>
+            </w:r>
+            <w:r>
+              <w:rPr>
+                <w:sz w:val="18"/>
+              </w:rPr>
+              <w:t xml:space="preserve"> + </w:t>
+            </w:r>
+            <w:r>
+              <w:rPr>
+                <w:b/>
+                <w:sz w:val="18"/>
+              </w:rPr>
+              <w:t xml:space="preserve">5.5% buyer service fee</w:t>
+            </w:r>
+            <w:r>
+              <w:rPr>
+                <w:sz w:val="18"/>
+              </w:rPr>
+              <w:t xml:space="preserve"> + $2.50 small-order fee under $50 — </w:t>
+            </w:r>
+            <w:hyperlink r:id="rHl51">
+              <w:r>
+                <w:rPr>
+                  <w:rStyle w:val="Hyperlink"/>
+                  <w:sz w:val="18"/>
+                </w:rPr>
+                <w:t xml:space="preserve">fee guides</w:t>
+              </w:r>
+            </w:hyperlink>
+            <w:r>
+              <w:rPr>
+                <w:sz w:val="18"/>
+              </w:rPr>
+              <w:t xml:space="preserve"> </w:t>
+            </w:r>
+            <w:r>
+              <w:rPr>
+                <w:rFonts w:ascii="Consolas" w:hAnsi="Consolas"/>
+                <w:sz w:val="18"/>
+              </w:rPr>
+              <w:t xml:space="preserve">[fiverr.com support page is 403 to this tool]</w:t>
+            </w:r>
+          </w:p>
+        </w:tc>
+        <w:tc>
+          <w:tcPr>
+            <w:tcW w:w="1680" w:type="dxa"/>
+          </w:tcPr>
+          <w:p>
+            <w:pPr>
+              <w:spacing w:before="40" w:after="40"/>
+            </w:pPr>
+            <w:r>
+              <w:rPr>
+                <w:sz w:val="18"/>
+              </w:rPr>
+              <w:t xml:space="preserve">1. Commission marketplace with escrow and milestones 2. Seller levels, ratings and vetting 3. Brief-driven ordering with revisions</w:t>
+            </w:r>
+          </w:p>
+        </w:tc>
+        <w:tc>
+          <w:tcPr>
+            <w:tcW w:w="1680" w:type="dxa"/>
+          </w:tcPr>
+          <w:p>
+            <w:pPr>
+              <w:spacing w:before="40" w:after="40"/>
+            </w:pPr>
+            <w:r>
+              <w:rPr>
+                <w:sz w:val="18"/>
+              </w:rPr>
+              <w:t xml:space="preserve">Buyers commissioning custom creative work; freelancers</w:t>
+            </w:r>
+          </w:p>
+        </w:tc>
+        <w:tc>
+          <w:tcPr>
+            <w:tcW w:w="1680" w:type="dxa"/>
+          </w:tcPr>
+          <w:p>
+            <w:pPr>
+              <w:spacing w:before="40" w:after="40"/>
+            </w:pPr>
+            <w:r>
+              <w:rPr>
+                <w:b/>
+                <w:sz w:val="18"/>
+              </w:rPr>
+              <w:t xml:space="preserve">Public — NYSE: FVRR</w:t>
+            </w:r>
+          </w:p>
+        </w:tc>
+        <w:tc>
+          <w:tcPr>
+            <w:tcW w:w="1680" w:type="dxa"/>
+          </w:tcPr>
+          <w:p>
+            <w:pPr>
+              <w:spacing w:before="40" w:after="40"/>
+            </w:pPr>
+            <w:r>
+              <w:rPr>
+                <w:b/>
+                <w:sz w:val="18"/>
+              </w:rPr>
+              <w:t xml:space="preserve">$600 lost trusting the platform's vetting</w:t>
+            </w:r>
+            <w:r>
+              <w:rPr>
+                <w:sz w:val="18"/>
+              </w:rPr>
+              <w:t xml:space="preserve"> of a high-rated seller (Sept 14 2026); scam reported with proof, ticket runaround, going to the bank (Sept 21 2026); fees stacked even on tips (Sept 17 2026) — </w:t>
+            </w:r>
+            <w:hyperlink r:id="rHl35">
+              <w:r>
+                <w:rPr>
+                  <w:rStyle w:val="Hyperlink"/>
+                  <w:sz w:val="18"/>
+                </w:rPr>
+                <w:t xml:space="preserve">App Store</w:t>
+              </w:r>
+            </w:hyperlink>
+          </w:p>
+        </w:tc>
+      </w:tr>
+      <w:tr>
+        <w:tc>
+          <w:tcPr>
+            <w:tcW w:w="1680" w:type="dxa"/>
+          </w:tcPr>
+          <w:p>
+            <w:pPr>
+              <w:spacing w:before="40" w:after="40"/>
+            </w:pPr>
+            <w:r>
+              <w:rPr>
+                <w:b/>
+                <w:sz w:val="18"/>
+              </w:rPr>
+              <w:t xml:space="preserve">5. TurningArt</w:t>
+            </w:r>
+          </w:p>
+        </w:tc>
+        <w:tc>
+          <w:tcPr>
+            <w:tcW w:w="1680" w:type="dxa"/>
+          </w:tcPr>
+          <w:p>
+            <w:pPr>
+              <w:spacing w:before="40" w:after="40"/>
+            </w:pPr>
+            <w:r>
+              <w:rPr>
+                <w:b/>
+                <w:sz w:val="18"/>
+              </w:rPr>
+              <w:t xml:space="preserve">Not published</w:t>
+            </w:r>
+            <w:r>
+              <w:rPr>
+                <w:sz w:val="18"/>
+              </w:rPr>
+              <w:t xml:space="preserve"> — three program models: Lease &amp; Rotation, </w:t>
+            </w:r>
+            <w:r>
+              <w:rPr>
+                <w:b/>
+                <w:sz w:val="18"/>
+              </w:rPr>
+              <w:t xml:space="preserve">Purchase &amp; Commission</w:t>
+            </w:r>
+            <w:r>
+              <w:rPr>
+                <w:sz w:val="18"/>
+              </w:rPr>
+              <w:t xml:space="preserve">, or hybrid; third-party benchmarks put office art rental at </w:t>
+            </w:r>
+            <w:r>
+              <w:rPr>
+                <w:b/>
+                <w:sz w:val="18"/>
+              </w:rPr>
+              <w:t xml:space="preserve">$38–$150/month per piece</w:t>
+            </w:r>
+            <w:r>
+              <w:rPr>
+                <w:sz w:val="18"/>
+              </w:rPr>
+              <w:t xml:space="preserve"> — </w:t>
+            </w:r>
+            <w:hyperlink r:id="rHl52">
+              <w:r>
+                <w:rPr>
+                  <w:rStyle w:val="Hyperlink"/>
+                  <w:sz w:val="18"/>
+                </w:rPr>
+                <w:t xml:space="preserve">TurningArt</w:t>
+              </w:r>
+            </w:hyperlink>
+            <w:r>
+              <w:rPr>
+                <w:sz w:val="18"/>
+              </w:rPr>
+              <w:t xml:space="preserve">; </w:t>
+            </w:r>
+            <w:hyperlink r:id="rHl53">
+              <w:r>
+                <w:rPr>
+                  <w:rStyle w:val="Hyperlink"/>
+                  <w:sz w:val="18"/>
+                </w:rPr>
+                <w:t xml:space="preserve">Curina benchmark</w:t>
+              </w:r>
+            </w:hyperlink>
+          </w:p>
+        </w:tc>
+        <w:tc>
+          <w:tcPr>
+            <w:tcW w:w="1680" w:type="dxa"/>
+          </w:tcPr>
+          <w:p>
+            <w:pPr>
+              <w:spacing w:before="40" w:after="40"/>
+            </w:pPr>
+            <w:r>
+              <w:rPr>
+                <w:sz w:val="18"/>
+              </w:rPr>
+              <w:t xml:space="preserve">1. </w:t>
+            </w:r>
+            <w:r>
+              <w:rPr>
+                <w:b/>
+                <w:sz w:val="18"/>
+              </w:rPr>
+              <w:t xml:space="preserve">Curation to a physical space</w:t>
+            </w:r>
+            <w:r>
+              <w:rPr>
+                <w:sz w:val="18"/>
+              </w:rPr>
+              <w:t xml:space="preserve"> (offices, healthcare, hospitality) 2. Lease-and-rotate model 3. Commission program with affiliate artists</w:t>
+            </w:r>
+          </w:p>
+        </w:tc>
+        <w:tc>
+          <w:tcPr>
+            <w:tcW w:w="1680" w:type="dxa"/>
+          </w:tcPr>
+          <w:p>
+            <w:pPr>
+              <w:spacing w:before="40" w:after="40"/>
+            </w:pPr>
+            <w:r>
+              <w:rPr>
+                <w:b/>
+                <w:sz w:val="18"/>
+              </w:rPr>
+              <w:t xml:space="preserve">Businesses</w:t>
+            </w:r>
+            <w:r>
+              <w:rPr>
+                <w:sz w:val="18"/>
+              </w:rPr>
+              <w:t xml:space="preserve"> — facilities, workplace design, healthcare</w:t>
+            </w:r>
+          </w:p>
+        </w:tc>
+        <w:tc>
+          <w:tcPr>
+            <w:tcW w:w="1680" w:type="dxa"/>
+          </w:tcPr>
+          <w:p>
+            <w:pPr>
+              <w:spacing w:before="40" w:after="40"/>
+            </w:pPr>
+            <w:r>
+              <w:rPr>
+                <w:b/>
+                <w:sz w:val="18"/>
+              </w:rPr>
+              <w:t xml:space="preserve">~$2.9M–$3.17M total raised</w:t>
+            </w:r>
+            <w:r>
+              <w:rPr>
+                <w:sz w:val="18"/>
+              </w:rPr>
+              <w:t xml:space="preserve">; NextView Ventures, FJ Labs and others; </w:t>
+            </w:r>
+            <w:r>
+              <w:rPr>
+                <w:b/>
+                <w:sz w:val="18"/>
+              </w:rPr>
+              <w:t xml:space="preserve">recapitalized by Brighton Partners in 2025</w:t>
+            </w:r>
+            <w:r>
+              <w:rPr>
+                <w:sz w:val="18"/>
+              </w:rPr>
+              <w:t xml:space="preserve"> (</w:t>
+            </w:r>
+            <w:hyperlink r:id="rHl54">
+              <w:r>
+                <w:rPr>
+                  <w:rStyle w:val="Hyperlink"/>
+                  <w:sz w:val="18"/>
+                </w:rPr>
+                <w:t xml:space="preserve">TechCrunch 2012</w:t>
+              </w:r>
+            </w:hyperlink>
+            <w:r>
+              <w:rPr>
+                <w:sz w:val="18"/>
+              </w:rPr>
+              <w:t xml:space="preserve">; </w:t>
+            </w:r>
+            <w:hyperlink r:id="rHl55">
+              <w:r>
+                <w:rPr>
+                  <w:rStyle w:val="Hyperlink"/>
+                  <w:sz w:val="18"/>
+                </w:rPr>
+                <w:t xml:space="preserve">Brighton Partners</w:t>
+              </w:r>
+            </w:hyperlink>
+            <w:r>
+              <w:rPr>
+                <w:sz w:val="18"/>
+              </w:rPr>
+              <w:t xml:space="preserve">)</w:t>
+            </w:r>
+          </w:p>
+        </w:tc>
+        <w:tc>
+          <w:tcPr>
+            <w:tcW w:w="1680" w:type="dxa"/>
+          </w:tcPr>
+          <w:p>
+            <w:pPr>
+              <w:spacing w:before="40" w:after="40"/>
+            </w:pPr>
+            <w:r>
+              <w:rPr>
+                <w:b/>
+                <w:sz w:val="18"/>
+              </w:rPr>
+              <w:t xml:space="preserve">No consumer review channel exists</w:t>
+            </w:r>
+            <w:r>
+              <w:rPr>
+                <w:sz w:val="18"/>
+              </w:rPr>
+              <w:t xml:space="preserve"> — no app, no Trustpilot profile found. </w:t>
+            </w:r>
+            <w:r>
+              <w:rPr>
+                <w:rFonts w:ascii="Consolas" w:hAnsi="Consolas"/>
+                <w:sz w:val="18"/>
+              </w:rPr>
+              <w:t xml:space="preserve">[Complaint record unavailable — see flags]</w:t>
+            </w:r>
+          </w:p>
+        </w:tc>
+      </w:tr>
+    </w:tbl>
+    <w:p>
+      <w:pPr>
+        <w:spacing w:after="0"/>
+      </w:pPr>
+    </w:p>
+    <w:p>
+      <w:pPr>
+        <w:pStyle w:val="Heading2"/>
+      </w:pPr>
+      <w:r>
+        <w:t xml:space="preserve">Runners-up, by feature</w:t>
+      </w:r>
+    </w:p>
+    <w:tbl>
+      <w:tblPr>
+        <w:tblW w:w="10080" w:type="dxa"/>
+        <w:tblBorders>
+          <w:top w:val="single" w:sz="4" w:space="0" w:color="C9CCD1"/>
+          <w:left w:val="single" w:sz="4" w:space="0" w:color="C9CCD1"/>
+          <w:bottom w:val="single" w:sz="4" w:space="0" w:color="C9CCD1"/>
+          <w:right w:val="single" w:sz="4" w:space="0" w:color="C9CCD1"/>
+          <w:insideH w:val="single" w:sz="4" w:space="0" w:color="C9CCD1"/>
+          <w:insideV w:val="single" w:sz="4" w:space="0" w:color="C9CCD1"/>
+        </w:tblBorders>
+        <w:tblLayout w:type="fixed"/>
+      </w:tblPr>
+      <w:tblGrid>
+        <w:gridCol w:w="3360"/>
+        <w:gridCol w:w="3360"/>
+        <w:gridCol w:w="3360"/>
+      </w:tblGrid>
+      <w:tr>
+        <w:trPr>
+          <w:tblHeader/>
+        </w:trPr>
+        <w:tc>
+          <w:tcPr>
+            <w:tcW w:w="3360" w:type="dxa"/>
+            <w:shd w:val="clear" w:color="auto" w:fill="EFF1F3"/>
+          </w:tcPr>
+          <w:p>
+            <w:pPr>
+              <w:spacing w:before="40" w:after="40"/>
+            </w:pPr>
+            <w:r>
+              <w:rPr>
+                <w:b/>
+                <w:sz w:val="18"/>
+              </w:rPr>
+              <w:t xml:space="preserve">Feature</w:t>
+            </w:r>
+          </w:p>
+        </w:tc>
+        <w:tc>
+          <w:tcPr>
+            <w:tcW w:w="3360" w:type="dxa"/>
+            <w:shd w:val="clear" w:color="auto" w:fill="EFF1F3"/>
+          </w:tcPr>
+          <w:p>
+            <w:pPr>
+              <w:spacing w:before="40" w:after="40"/>
+            </w:pPr>
+            <w:r>
+              <w:rPr>
+                <w:b/>
+                <w:sz w:val="18"/>
+              </w:rPr>
+              <w:t xml:space="preserve">Products</w:t>
+            </w:r>
+          </w:p>
+        </w:tc>
+        <w:tc>
+          <w:tcPr>
+            <w:tcW w:w="3360" w:type="dxa"/>
+            <w:shd w:val="clear" w:color="auto" w:fill="EFF1F3"/>
+          </w:tcPr>
+          <w:p>
+            <w:pPr>
+              <w:spacing w:before="40" w:after="40"/>
+            </w:pPr>
+            <w:r>
+              <w:rPr>
+                <w:b/>
+                <w:sz w:val="18"/>
+              </w:rPr>
+              <w:t xml:space="preserve">Evidence</w:t>
+            </w:r>
+          </w:p>
+        </w:tc>
+      </w:tr>
+      <w:tr>
+        <w:tc>
+          <w:tcPr>
+            <w:tcW w:w="3360" w:type="dxa"/>
+          </w:tcPr>
+          <w:p>
+            <w:pPr>
+              <w:spacing w:before="40" w:after="40"/>
+            </w:pPr>
+            <w:r>
+              <w:rPr>
+                <w:b/>
+                <w:sz w:val="18"/>
+              </w:rPr>
+              <w:t xml:space="preserve">Photograph your space + AI</w:t>
+            </w:r>
+          </w:p>
+        </w:tc>
+        <w:tc>
+          <w:tcPr>
+            <w:tcW w:w="3360" w:type="dxa"/>
+          </w:tcPr>
+          <w:p>
+            <w:pPr>
+              <w:spacing w:before="40" w:after="40"/>
+            </w:pPr>
+            <w:r>
+              <w:rPr>
+                <w:sz w:val="18"/>
+              </w:rPr>
+              <w:t xml:space="preserve">Renovate AI, Home AI (160,088 ratings), Paint AI</w:t>
+            </w:r>
+          </w:p>
+        </w:tc>
+        <w:tc>
+          <w:tcPr>
+            <w:tcW w:w="3360" w:type="dxa"/>
+          </w:tcPr>
+          <w:p>
+            <w:pPr>
+              <w:spacing w:before="40" w:after="40"/>
+            </w:pPr>
+            <w:r>
+              <w:rPr>
+                <w:sz w:val="18"/>
+              </w:rPr>
+              <w:t xml:space="preserve">174 critical reviews in 18 months; "Gemini does a better job by far" (Sept 18 2026)</w:t>
+            </w:r>
+          </w:p>
+        </w:tc>
+      </w:tr>
+      <w:tr>
+        <w:tc>
+          <w:tcPr>
+            <w:tcW w:w="3360" w:type="dxa"/>
+          </w:tcPr>
+          <w:p>
+            <w:pPr>
+              <w:spacing w:before="40" w:after="40"/>
+            </w:pPr>
+            <w:r>
+              <w:rPr>
+                <w:b/>
+                <w:sz w:val="18"/>
+              </w:rPr>
+              <w:t xml:space="preserve">Art at true size on your wall</w:t>
+            </w:r>
+          </w:p>
+        </w:tc>
+        <w:tc>
+          <w:tcPr>
+            <w:tcW w:w="3360" w:type="dxa"/>
+          </w:tcPr>
+          <w:p>
+            <w:pPr>
+              <w:spacing w:before="40" w:after="40"/>
+            </w:pPr>
+            <w:r>
+              <w:rPr>
+                <w:sz w:val="18"/>
+              </w:rPr>
+              <w:t xml:space="preserve">Smartist (8,529 ratings), Artrooms, ArtStage, iArtView</w:t>
+            </w:r>
+          </w:p>
+        </w:tc>
+        <w:tc>
+          <w:tcPr>
+            <w:tcW w:w="3360" w:type="dxa"/>
+          </w:tcPr>
+          <w:p>
+            <w:pPr>
+              <w:spacing w:before="40" w:after="40"/>
+            </w:pPr>
+            <w:r>
+              <w:rPr>
+                <w:sz w:val="18"/>
+              </w:rPr>
+              <w:t xml:space="preserve">Scale accuracy complaints across all four</w:t>
+            </w:r>
+          </w:p>
+        </w:tc>
+      </w:tr>
+      <w:tr>
+        <w:tc>
+          <w:tcPr>
+            <w:tcW w:w="3360" w:type="dxa"/>
+          </w:tcPr>
+          <w:p>
+            <w:pPr>
+              <w:spacing w:before="40" w:after="40"/>
+            </w:pPr>
+            <w:r>
+              <w:rPr>
+                <w:b/>
+                <w:sz w:val="18"/>
+              </w:rPr>
+              <w:t xml:space="preserve">Commission workflow for artists</w:t>
+            </w:r>
+          </w:p>
+        </w:tc>
+        <w:tc>
+          <w:tcPr>
+            <w:tcW w:w="3360" w:type="dxa"/>
+          </w:tcPr>
+          <w:p>
+            <w:pPr>
+              <w:spacing w:before="40" w:after="40"/>
+            </w:pPr>
+            <w:r>
+              <w:rPr>
+                <w:sz w:val="18"/>
+              </w:rPr>
+              <w:t xml:space="preserve">VGen, Artconomy </w:t>
+            </w:r>
+            <w:r>
+              <w:rPr>
+                <w:rFonts w:ascii="Consolas" w:hAnsi="Consolas"/>
+                <w:sz w:val="18"/>
+              </w:rPr>
+              <w:t xml:space="preserve">[not reviewed — web-only, no App Store presence found]</w:t>
+            </w:r>
+          </w:p>
+        </w:tc>
+        <w:tc>
+          <w:tcPr>
+            <w:tcW w:w="3360" w:type="dxa"/>
+          </w:tcPr>
+          <w:p>
+            <w:pPr>
+              <w:spacing w:before="40" w:after="40"/>
+            </w:pPr>
+            <w:r>
+              <w:rPr>
+                <w:sz w:val="18"/>
+              </w:rPr>
+              <w:t xml:space="preserve">—</w:t>
+            </w:r>
+          </w:p>
+        </w:tc>
+      </w:tr>
+      <w:tr>
+        <w:tc>
+          <w:tcPr>
+            <w:tcW w:w="3360" w:type="dxa"/>
+          </w:tcPr>
+          <w:p>
+            <w:pPr>
+              <w:spacing w:before="40" w:after="40"/>
+            </w:pPr>
+            <w:r>
+              <w:rPr>
+                <w:b/>
+                <w:sz w:val="18"/>
+              </w:rPr>
+              <w:t xml:space="preserve">AI-free artist communities</w:t>
+            </w:r>
+          </w:p>
+        </w:tc>
+        <w:tc>
+          <w:tcPr>
+            <w:tcW w:w="3360" w:type="dxa"/>
+          </w:tcPr>
+          <w:p>
+            <w:pPr>
+              <w:spacing w:before="40" w:after="40"/>
+            </w:pPr>
+            <w:r>
+              <w:rPr>
+                <w:sz w:val="18"/>
+              </w:rPr>
+              <w:t xml:space="preserve">Cara (762 ratings), Artfol (762)</w:t>
+            </w:r>
+          </w:p>
+        </w:tc>
+        <w:tc>
+          <w:tcPr>
+            <w:tcW w:w="3360" w:type="dxa"/>
+          </w:tcPr>
+          <w:p>
+            <w:pPr>
+              <w:spacing w:before="40" w:after="40"/>
+            </w:pPr>
+            <w:r>
+              <w:rPr>
+                <w:sz w:val="18"/>
+              </w:rPr>
+              <w:t xml:space="preserve">Cara grew 40k → 650k users in a week, June 2024</w:t>
+            </w:r>
+          </w:p>
+        </w:tc>
+      </w:tr>
+      <w:tr>
+        <w:tc>
+          <w:tcPr>
+            <w:tcW w:w="3360" w:type="dxa"/>
+          </w:tcPr>
+          <w:p>
+            <w:pPr>
+              <w:spacing w:before="40" w:after="40"/>
+            </w:pPr>
+            <w:r>
+              <w:rPr>
+                <w:b/>
+                <w:sz w:val="18"/>
+              </w:rPr>
+              <w:t xml:space="preserve">Art as an investment</w:t>
+            </w:r>
+          </w:p>
+        </w:tc>
+        <w:tc>
+          <w:tcPr>
+            <w:tcW w:w="3360" w:type="dxa"/>
+          </w:tcPr>
+          <w:p>
+            <w:pPr>
+              <w:spacing w:before="40" w:after="40"/>
+            </w:pPr>
+            <w:r>
+              <w:rPr>
+                <w:sz w:val="18"/>
+              </w:rPr>
+              <w:t xml:space="preserve">Masterworks (2,482 ratings)</w:t>
+            </w:r>
+          </w:p>
+        </w:tc>
+        <w:tc>
+          <w:tcPr>
+            <w:tcW w:w="3360" w:type="dxa"/>
+          </w:tcPr>
+          <w:p>
+            <w:pPr>
+              <w:spacing w:before="40" w:after="40"/>
+            </w:pPr>
+            <w:r>
+              <w:rPr>
+                <w:sz w:val="18"/>
+              </w:rPr>
+              <w:t xml:space="preserve">Investors report being unable to sell; secondary market closed by email, March 2026</w:t>
+            </w:r>
+          </w:p>
+        </w:tc>
+      </w:tr>
+    </w:tbl>
+    <w:p>
+      <w:pPr>
+        <w:spacing w:after="0"/>
+      </w:pPr>
+    </w:p>
+    <w:p>
+      <w:pPr>
+        <w:pBdr>
+          <w:bottom w:val="single" w:sz="6" w:space="6" w:color="C9CCD1"/>
+        </w:pBdr>
+      </w:pPr>
+    </w:p>
+    <w:p>
+      <w:pPr>
+        <w:pStyle w:val="Heading1"/>
+      </w:pPr>
+      <w:r>
+        <w:t xml:space="preserve">Per-product notes</w:t>
+      </w:r>
+    </w:p>
+    <w:p>
+      <w:pPr>
+        <w:pStyle w:val="Heading2"/>
+      </w:pPr>
+      <w:r>
+        <w:t xml:space="preserve">1. Saatchi Art — the incumbent, and it just got more expensive</w:t>
+      </w:r>
+    </w:p>
+    <w:p>
+      <w:r>
+        <w:t xml:space="preserve">The largest curated online marketplace for original art, with the "View in a Room" feature your spec describes. </w:t>
+      </w:r>
+      <w:r>
+        <w:rPr>
+          <w:b/>
+        </w:rPr>
+        <w:t xml:space="preserve">It raised its artist commission from 35% to 40% in 2026</w:t>
+      </w:r>
+      <w:r>
+        <w:t xml:space="preserve"> — which lands squarely inside the 30–50% gallery range your premise attacks. </w:t>
+      </w:r>
+      <w:r>
+        <w:rPr>
+          <w:b/>
+        </w:rPr>
+        <w:t xml:space="preserve">The online alternative to the gallery now charges gallery rates.</w:t>
+      </w:r>
+      <w:r>
+        <w:t xml:space="preserve"> </w:t>
+      </w:r>
+      <w:r>
+        <w:rPr>
+          <w:rFonts w:ascii="Consolas" w:hAnsi="Consolas"/>
+        </w:rPr>
+        <w:t xml:space="preserve">[The rate change is reported consistently across secondary sources; Saatchi's own help page blocks this tool.]</w:t>
+      </w:r>
+    </w:p>
+    <w:p>
+      <w:pPr>
+        <w:pStyle w:val="Heading2"/>
+      </w:pPr>
+      <w:r>
+        <w:t xml:space="preserve">2. Artfinder — the closest thing to your commission flow, and explicitly anti-AI</w:t>
+      </w:r>
+    </w:p>
+    <w:p>
+      <w:r>
+        <w:t xml:space="preserve">It already runs a </w:t>
+      </w:r>
+      <w:r>
+        <w:rPr>
+          <w:b/>
+        </w:rPr>
+        <w:t xml:space="preserve">"Commission an Artwork"</w:t>
+      </w:r>
+      <w:r>
+        <w:t xml:space="preserve"> request flow, connects buyers directly to artists, and has a curation team. Critically: </w:t>
+      </w:r>
+      <w:r>
+        <w:rPr>
+          <w:b/>
+        </w:rPr>
+        <w:t xml:space="preserve">Artfinder explicitly prohibits AI-generated artwork.</w:t>
+      </w:r>
+      <w:r>
+        <w:t xml:space="preserve"> If your product's brief is AI-generated, the platforms most aligned with fine artists are the ones whose rules you'd be arguing with.</w:t>
+      </w:r>
+    </w:p>
+    <w:p>
+      <w:pPr>
+        <w:pStyle w:val="Heading2"/>
+      </w:pPr>
+      <w:r>
+        <w:t xml:space="preserve">3. Etsy — the volume leader with the worst reputation in this set</w:t>
+      </w:r>
+    </w:p>
+    <w:p>
+      <w:r>
+        <w:t xml:space="preserve">Roughly 10% effective fees — by far the cheapest of the five — and enormous reach. But </w:t>
+      </w:r>
+      <w:r>
+        <w:rPr>
+          <w:b/>
+        </w:rPr>
+        <w:t xml:space="preserve">1.4★ across 21,264 Trustpilot reviews with 80% one-star</w:t>
+      </w:r>
+      <w:r>
+        <w:t xml:space="preserve"> is the worst rating in any competitor set across these four dossiers. Sellers report unexplained permanent suspensions; buyers report failed protection. Cheap distribution, expensive trust.</w:t>
+      </w:r>
+    </w:p>
+    <w:p>
+      <w:pPr>
+        <w:pStyle w:val="Heading2"/>
+      </w:pPr>
+      <w:r>
+        <w:t xml:space="preserve">4. Fiverr — the vetting-and-escrow model, stress-tested</w:t>
+      </w:r>
+    </w:p>
+    <w:p>
+      <w:r>
+        <w:t xml:space="preserve">Everything your vetting feature promises, Fiverr already does: identity checks, seller levels, ratings, escrow, milestones, revisions. </w:t>
+      </w:r>
+      <w:r>
+        <w:rPr>
+          <w:b/>
+        </w:rPr>
+        <w:t xml:space="preserve">And its buyers still report losing money to vetted, highly-rated sellers.</w:t>
+      </w:r>
+      <w:r>
+        <w:t xml:space="preserve"> At 20% + 5.5%, it also costs more than Etsy and less than Saatchi. </w:t>
+      </w:r>
+      <w:r>
+        <w:rPr>
+          <w:b/>
+        </w:rPr>
+        <w:t xml:space="preserve">Read Fiverr as the experiment that already ran.</w:t>
+      </w:r>
+    </w:p>
+    <w:p>
+      <w:pPr>
+        <w:pStyle w:val="Heading2"/>
+      </w:pPr>
+      <w:r>
+        <w:t xml:space="preserve">5. TurningArt — the only one that starts with the space</w:t>
+      </w:r>
+    </w:p>
+    <w:p>
+      <w:r>
+        <w:t xml:space="preserve">Curates art *to a physical environment*, commissions from affiliate artists, and sells to businesses — the interior-designer and corporate-buyer segment Section 1 identified as the most concentrated buyer. It has been at this since 2012 on </w:t>
+      </w:r>
+      <w:r>
+        <w:rPr>
+          <w:b/>
+        </w:rPr>
+        <w:t xml:space="preserve">under $3.2M of funding</w:t>
+      </w:r>
+      <w:r>
+        <w:t xml:space="preserve">, and was recapitalized in 2025 </w:t>
+      </w:r>
+      <w:r>
+        <w:rPr>
+          <w:rFonts w:ascii="Consolas" w:hAnsi="Consolas"/>
+        </w:rPr>
+        <w:t xml:space="preserve">[a recapitalization usually signals a reset rather than growth — UNVERIFIED as to cause]</w:t>
+      </w:r>
+      <w:r>
+        <w:t xml:space="preserve">.</w:t>
+      </w:r>
+    </w:p>
+    <w:p>
+      <w:pPr>
+        <w:pBdr>
+          <w:bottom w:val="single" w:sz="6" w:space="6" w:color="C9CCD1"/>
+        </w:pBdr>
+      </w:pPr>
+    </w:p>
+    <w:p>
+      <w:pPr>
+        <w:pStyle w:val="Heading1"/>
+      </w:pPr>
+      <w:r>
+        <w:t xml:space="preserve">What does nobody serve well?</w:t>
+      </w:r>
+    </w:p>
+    <w:p>
+      <w:r>
+        <w:rPr>
+          <w:b/>
+        </w:rPr>
+        <w:t xml:space="preserve">1. Nobody joins the room to the commission.</w:t>
+      </w:r>
+      <w:r>
+        <w:t xml:space="preserve"> AR previewers show you *existing* art on your wall. Marketplaces sell *existing* art. Fiverr commissions new work with </w:t>
+      </w:r>
+      <w:r>
+        <w:rPr>
+          <w:b/>
+        </w:rPr>
+        <w:t xml:space="preserve">no spatial tools at all</w:t>
+      </w:r>
+      <w:r>
+        <w:t xml:space="preserve">. TurningArt starts from the space but works from an existing catalog and sells to businesses. </w:t>
+      </w:r>
+      <w:r>
+        <w:rPr>
+          <w:b/>
+        </w:rPr>
+        <w:t xml:space="preserve">Nothing takes a photograph of a wall and turns it into a brief for a new painting.</w:t>
+      </w:r>
+      <w:r>
+        <w:t xml:space="preserve"> That specific join is empty — and it is your idea's core.</w:t>
+      </w:r>
+    </w:p>
+    <w:p>
+      <w:r>
+        <w:rPr>
+          <w:b/>
+        </w:rPr>
+        <w:t xml:space="preserve">2. Nobody vets fine artists on anything meaningful to the buyer.</w:t>
+      </w:r>
+      <w:r>
+        <w:t xml:space="preserve"> Fiverr vets on ratings and levels (and still gets defrauded). Saatchi and Artfinder vet on curatorial judgment. </w:t>
+      </w:r>
+      <w:r>
+        <w:rPr>
+          <w:b/>
+        </w:rPr>
+        <w:t xml:space="preserve">Nobody vets on credentials</w:t>
+      </w:r>
+      <w:r>
+        <w:t xml:space="preserve"> — and Section 1 flagged that no evidence links a degree to sales, price or appreciation. </w:t>
+      </w:r>
+      <w:r>
+        <w:rPr>
+          <w:rFonts w:ascii="Consolas" w:hAnsi="Consolas"/>
+        </w:rPr>
+        <w:t xml:space="preserve">[UNVERIFIED: degree-as-quality-signal remains untested, and it is your product's core filter.]</w:t>
+      </w:r>
+    </w:p>
+    <w:p>
+      <w:r>
+        <w:rPr>
+          <w:b/>
+        </w:rPr>
+        <w:t xml:space="preserve">3. Nobody has made commissioning cheaper.</w:t>
+      </w:r>
+      <w:r>
+        <w:t xml:space="preserve"> Your premise attacks 30–50% gallery commissions. The online alternatives: </w:t>
+      </w:r>
+      <w:r>
+        <w:rPr>
+          <w:b/>
+        </w:rPr>
+        <w:t xml:space="preserve">Saatchi 40%, Fiverr 25.5% all-in, Etsy ~10%.</w:t>
+      </w:r>
+      <w:r>
+        <w:t xml:space="preserve"> Only Etsy meaningfully undercuts galleries, and it does so by being a mass-market handmade bazaar rather than a fine-art channel. Meanwhile art advisors (Section 2) charge </w:t>
+      </w:r>
+      <w:r>
+        <w:rPr>
+          <w:b/>
+        </w:rPr>
+        <w:t xml:space="preserve">5–20%</w:t>
+      </w:r>
+      <w:r>
+        <w:t xml:space="preserve">. </w:t>
+      </w:r>
+      <w:r>
+        <w:rPr>
+          <w:b/>
+        </w:rPr>
+        <w:t xml:space="preserve">The cheap middlemen already exist; they just aren't fine-art-specific.</w:t>
+      </w:r>
+    </w:p>
+    <w:p>
+      <w:r>
+        <w:rPr>
+          <w:b/>
+        </w:rPr>
+        <w:t xml:space="preserve">4. Nobody makes the size question trustworthy.</w:t>
+      </w:r>
+      <w:r>
+        <w:t xml:space="preserve"> Every wall-preview app in this market has scale complaints. For a </w:t>
+      </w:r>
+      <w:r>
+        <w:rPr>
+          <w:b/>
+        </w:rPr>
+        <w:t xml:space="preserve">custom, non-returnable</w:t>
+      </w:r>
+      <w:r>
+        <w:t xml:space="preserve"> work this is not a nuisance — it's the difference between delight and a four-figure dispute.</w:t>
+      </w:r>
+    </w:p>
+    <w:p>
+      <w:r>
+        <w:rPr>
+          <w:b/>
+        </w:rPr>
+        <w:t xml:space="preserve">5. Nobody serves the interior designer commissioning original work.</w:t>
+      </w:r>
+      <w:r>
+        <w:t xml:space="preserve"> 87,100 interior designers (BLS) do size/palette/theme matching daily. TurningArt serves facilities teams with leased catalogs; nothing serves a designer who wants a *new* piece made for a specific room. </w:t>
+      </w:r>
+      <w:r>
+        <w:rPr>
+          <w:b/>
+        </w:rPr>
+        <w:t xml:space="preserve">This is the most concentrated, highest-intent, already-paying buyer in the space and it is underserved.</w:t>
+      </w:r>
+    </w:p>
+    <w:p>
+      <w:r>
+        <w:rPr>
+          <w:b/>
+        </w:rPr>
+        <w:t xml:space="preserve">6. Nobody has solved artist trust around AI.</w:t>
+      </w:r>
+      <w:r>
+        <w:t xml:space="preserve"> Artfinder bans AI art. Cara and Artfol are built on AI refusal. Etsy mandates disclosure. </w:t>
+      </w:r>
+      <w:r>
+        <w:rPr>
+          <w:b/>
+        </w:rPr>
+        <w:t xml:space="preserve">An AI-brief product enters this market with a supply-side trust problem before it has a single customer</w:t>
+      </w:r>
+      <w:r>
+        <w:t xml:space="preserve"> — and your supply side is the one with 347,000 people and no money.</w:t>
+      </w:r>
+    </w:p>
+    <w:p>
+      <w:pPr>
+        <w:pStyle w:val="Heading2"/>
+      </w:pPr>
+      <w:r>
+        <w:t xml:space="preserve">The sharpest wedge</w:t>
+      </w:r>
+    </w:p>
+    <w:p>
+      <w:r>
+        <w:rPr>
+          <w:b/>
+        </w:rPr>
+        <w:t xml:space="preserve">A commissioning workflow for interior designers and corporate buyers that starts from a measured photograph of the space, produces a written brief the artist owns, and never generates artwork.</w:t>
+      </w:r>
+      <w:r>
+        <w:t xml:space="preserve"> It avoids the AI-supply-trust problem (the brief is text, the human paints), serves the buyer segment that already pays for this labor at 5–20%, and occupies the one join — room to commission — that no competitor covers.</w:t>
+      </w:r>
+    </w:p>
+    <w:p>
+      <w:pPr>
+        <w:pBdr>
+          <w:bottom w:val="single" w:sz="6" w:space="6" w:color="C9CCD1"/>
+        </w:pBdr>
+      </w:pPr>
+    </w:p>
+    <w:p>
+      <w:pPr>
+        <w:pStyle w:val="Heading1"/>
+      </w:pPr>
+      <w:r>
+        <w:t xml:space="preserve">Flags</w:t>
+      </w:r>
+    </w:p>
+    <w:tbl>
+      <w:tblPr>
+        <w:tblW w:w="10080" w:type="dxa"/>
+        <w:tblBorders>
+          <w:top w:val="single" w:sz="4" w:space="0" w:color="C9CCD1"/>
+          <w:left w:val="single" w:sz="4" w:space="0" w:color="C9CCD1"/>
+          <w:bottom w:val="single" w:sz="4" w:space="0" w:color="C9CCD1"/>
+          <w:right w:val="single" w:sz="4" w:space="0" w:color="C9CCD1"/>
+          <w:insideH w:val="single" w:sz="4" w:space="0" w:color="C9CCD1"/>
+          <w:insideV w:val="single" w:sz="4" w:space="0" w:color="C9CCD1"/>
+        </w:tblBorders>
+        <w:tblLayout w:type="fixed"/>
+      </w:tblPr>
+      <w:tblGrid>
+        <w:gridCol w:w="5040"/>
+        <w:gridCol w:w="5040"/>
+      </w:tblGrid>
+      <w:tr>
+        <w:trPr>
+          <w:tblHeader/>
+        </w:trPr>
+        <w:tc>
+          <w:tcPr>
+            <w:tcW w:w="5040" w:type="dxa"/>
+            <w:shd w:val="clear" w:color="auto" w:fill="EFF1F3"/>
+          </w:tcPr>
+          <w:p>
+            <w:pPr>
+              <w:spacing w:before="40" w:after="40"/>
+            </w:pPr>
+            <w:r>
+              <w:rPr>
+                <w:b/>
+                <w:sz w:val="18"/>
+              </w:rPr>
+              <w:t xml:space="preserve">Item</w:t>
+            </w:r>
+          </w:p>
+        </w:tc>
+        <w:tc>
+          <w:tcPr>
+            <w:tcW w:w="5040" w:type="dxa"/>
+            <w:shd w:val="clear" w:color="auto" w:fill="EFF1F3"/>
+          </w:tcPr>
+          <w:p>
+            <w:pPr>
+              <w:spacing w:before="40" w:after="40"/>
+            </w:pPr>
+            <w:r>
+              <w:rPr>
+                <w:b/>
+                <w:sz w:val="18"/>
+              </w:rPr>
+              <w:t xml:space="preserve">Status</w:t>
+            </w:r>
+          </w:p>
+        </w:tc>
+      </w:tr>
+      <w:tr>
+        <w:tc>
+          <w:tcPr>
+            <w:tcW w:w="5040" w:type="dxa"/>
+          </w:tcPr>
+          <w:p>
+            <w:pPr>
+              <w:spacing w:before="40" w:after="40"/>
+            </w:pPr>
+            <w:r>
+              <w:rPr>
+                <w:b/>
+                <w:sz w:val="18"/>
+              </w:rPr>
+              <w:t xml:space="preserve">Saatchi Art 40% commission</w:t>
+            </w:r>
+          </w:p>
+        </w:tc>
+        <w:tc>
+          <w:tcPr>
+            <w:tcW w:w="5040" w:type="dxa"/>
+          </w:tcPr>
+          <w:p>
+            <w:pPr>
+              <w:spacing w:before="40" w:after="40"/>
+            </w:pPr>
+            <w:r>
+              <w:rPr>
+                <w:sz w:val="18"/>
+              </w:rPr>
+              <w:t xml:space="preserve">⚠️ Their own help page returns 403 to this tool. The 35% → 40% change in 2026 is consistent across several secondary sources but </w:t>
+            </w:r>
+            <w:r>
+              <w:rPr>
+                <w:b/>
+                <w:sz w:val="18"/>
+              </w:rPr>
+              <w:t xml:space="preserve">not read from the primary page</w:t>
+            </w:r>
+            <w:r>
+              <w:rPr>
+                <w:sz w:val="18"/>
+              </w:rPr>
+              <w:t xml:space="preserve">.</w:t>
+            </w:r>
+          </w:p>
+        </w:tc>
+      </w:tr>
+      <w:tr>
+        <w:tc>
+          <w:tcPr>
+            <w:tcW w:w="5040" w:type="dxa"/>
+          </w:tcPr>
+          <w:p>
+            <w:pPr>
+              <w:spacing w:before="40" w:after="40"/>
+            </w:pPr>
+            <w:r>
+              <w:rPr>
+                <w:b/>
+                <w:sz w:val="18"/>
+              </w:rPr>
+              <w:t xml:space="preserve">Etsy and Fiverr fee pages</w:t>
+            </w:r>
+          </w:p>
+        </w:tc>
+        <w:tc>
+          <w:tcPr>
+            <w:tcW w:w="5040" w:type="dxa"/>
+          </w:tcPr>
+          <w:p>
+            <w:pPr>
+              <w:spacing w:before="40" w:after="40"/>
+            </w:pPr>
+            <w:r>
+              <w:rPr>
+                <w:sz w:val="18"/>
+              </w:rPr>
+              <w:t xml:space="preserve">⚠️ Both 403 to this tool; figures from fee-calculator and guide sites that agree with each other.</w:t>
+            </w:r>
+          </w:p>
+        </w:tc>
+      </w:tr>
+      <w:tr>
+        <w:tc>
+          <w:tcPr>
+            <w:tcW w:w="5040" w:type="dxa"/>
+          </w:tcPr>
+          <w:p>
+            <w:pPr>
+              <w:spacing w:before="40" w:after="40"/>
+            </w:pPr>
+            <w:r>
+              <w:rPr>
+                <w:b/>
+                <w:sz w:val="18"/>
+              </w:rPr>
+              <w:t xml:space="preserve">Artfinder commission percentages</w:t>
+            </w:r>
+          </w:p>
+        </w:tc>
+        <w:tc>
+          <w:tcPr>
+            <w:tcW w:w="5040" w:type="dxa"/>
+          </w:tcPr>
+          <w:p>
+            <w:pPr>
+              <w:spacing w:before="40" w:after="40"/>
+            </w:pPr>
+            <w:r>
+              <w:rPr>
+                <w:sz w:val="18"/>
+              </w:rPr>
+              <w:t xml:space="preserve">❌ Not published on the seller page — only "free plan or paid plans that reduce commission."</w:t>
+            </w:r>
+          </w:p>
+        </w:tc>
+      </w:tr>
+      <w:tr>
+        <w:tc>
+          <w:tcPr>
+            <w:tcW w:w="5040" w:type="dxa"/>
+          </w:tcPr>
+          <w:p>
+            <w:pPr>
+              <w:spacing w:before="40" w:after="40"/>
+            </w:pPr>
+            <w:r>
+              <w:rPr>
+                <w:b/>
+                <w:sz w:val="18"/>
+              </w:rPr>
+              <w:t xml:space="preserve">Artfinder funding</w:t>
+            </w:r>
+          </w:p>
+        </w:tc>
+        <w:tc>
+          <w:tcPr>
+            <w:tcW w:w="5040" w:type="dxa"/>
+          </w:tcPr>
+          <w:p>
+            <w:pPr>
+              <w:spacing w:before="40" w:after="40"/>
+            </w:pPr>
+            <w:r>
+              <w:rPr>
+                <w:sz w:val="18"/>
+              </w:rPr>
+              <w:t xml:space="preserve">❌ Not verified.</w:t>
+            </w:r>
+          </w:p>
+        </w:tc>
+      </w:tr>
+      <w:tr>
+        <w:tc>
+          <w:tcPr>
+            <w:tcW w:w="5040" w:type="dxa"/>
+          </w:tcPr>
+          <w:p>
+            <w:pPr>
+              <w:spacing w:before="40" w:after="40"/>
+            </w:pPr>
+            <w:r>
+              <w:rPr>
+                <w:b/>
+                <w:sz w:val="18"/>
+              </w:rPr>
+              <w:t xml:space="preserve">TurningArt pricing</w:t>
+            </w:r>
+          </w:p>
+        </w:tc>
+        <w:tc>
+          <w:tcPr>
+            <w:tcW w:w="5040" w:type="dxa"/>
+          </w:tcPr>
+          <w:p>
+            <w:pPr>
+              <w:spacing w:before="40" w:after="40"/>
+            </w:pPr>
+            <w:r>
+              <w:rPr>
+                <w:sz w:val="18"/>
+              </w:rPr>
+              <w:t xml:space="preserve">❌ Not published. The $38–$150/month per piece figure is a </w:t>
+            </w:r>
+            <w:r>
+              <w:rPr>
+                <w:b/>
+                <w:sz w:val="18"/>
+              </w:rPr>
+              <w:t xml:space="preserve">competitor's</w:t>
+            </w:r>
+            <w:r>
+              <w:rPr>
+                <w:sz w:val="18"/>
+              </w:rPr>
+              <w:t xml:space="preserve"> benchmark article, not TurningArt's.</w:t>
+            </w:r>
+          </w:p>
+        </w:tc>
+      </w:tr>
+      <w:tr>
+        <w:tc>
+          <w:tcPr>
+            <w:tcW w:w="5040" w:type="dxa"/>
+          </w:tcPr>
+          <w:p>
+            <w:pPr>
+              <w:spacing w:before="40" w:after="40"/>
+            </w:pPr>
+            <w:r>
+              <w:rPr>
+                <w:b/>
+                <w:sz w:val="18"/>
+              </w:rPr>
+              <w:t xml:space="preserve">TurningArt complaints</w:t>
+            </w:r>
+          </w:p>
+        </w:tc>
+        <w:tc>
+          <w:tcPr>
+            <w:tcW w:w="5040" w:type="dxa"/>
+          </w:tcPr>
+          <w:p>
+            <w:pPr>
+              <w:spacing w:before="40" w:after="40"/>
+            </w:pPr>
+            <w:r>
+              <w:rPr>
+                <w:sz w:val="18"/>
+              </w:rPr>
+              <w:t xml:space="preserve">❌ </w:t>
+            </w:r>
+            <w:r>
+              <w:rPr>
+                <w:b/>
+                <w:sz w:val="18"/>
+              </w:rPr>
+              <w:t xml:space="preserve">No review channel found</w:t>
+            </w:r>
+            <w:r>
+              <w:rPr>
+                <w:sz w:val="18"/>
+              </w:rPr>
+              <w:t xml:space="preserve"> — no app, no Trustpilot profile. Its absence from the complaint record is a gap, not a clean bill of health.</w:t>
+            </w:r>
+          </w:p>
+        </w:tc>
+      </w:tr>
+      <w:tr>
+        <w:tc>
+          <w:tcPr>
+            <w:tcW w:w="5040" w:type="dxa"/>
+          </w:tcPr>
+          <w:p>
+            <w:pPr>
+              <w:spacing w:before="40" w:after="40"/>
+            </w:pPr>
+            <w:r>
+              <w:rPr>
+                <w:b/>
+                <w:sz w:val="18"/>
+              </w:rPr>
+              <w:t xml:space="preserve">TurningArt 2025 recapitalization</w:t>
+            </w:r>
+          </w:p>
+        </w:tc>
+        <w:tc>
+          <w:tcPr>
+            <w:tcW w:w="5040" w:type="dxa"/>
+          </w:tcPr>
+          <w:p>
+            <w:pPr>
+              <w:spacing w:before="40" w:after="40"/>
+            </w:pPr>
+            <w:r>
+              <w:rPr>
+                <w:sz w:val="18"/>
+              </w:rPr>
+              <w:t xml:space="preserve">⚠️ Confirmed as an event; </w:t>
+            </w:r>
+            <w:r>
+              <w:rPr>
+                <w:b/>
+                <w:sz w:val="18"/>
+              </w:rPr>
+              <w:t xml:space="preserve">the reason is not disclosed</w:t>
+            </w:r>
+            <w:r>
+              <w:rPr>
+                <w:sz w:val="18"/>
+              </w:rPr>
+              <w:t xml:space="preserve"> and my reading of it as a reset is </w:t>
+            </w:r>
+            <w:r>
+              <w:rPr>
+                <w:rFonts w:ascii="Consolas" w:hAnsi="Consolas"/>
+                <w:sz w:val="18"/>
+              </w:rPr>
+              <w:t xml:space="preserve">[UNVERIFIED]</w:t>
+            </w:r>
+            <w:r>
+              <w:rPr>
+                <w:sz w:val="18"/>
+              </w:rPr>
+              <w:t xml:space="preserve">.</w:t>
+            </w:r>
+          </w:p>
+        </w:tc>
+      </w:tr>
+      <w:tr>
+        <w:tc>
+          <w:tcPr>
+            <w:tcW w:w="5040" w:type="dxa"/>
+          </w:tcPr>
+          <w:p>
+            <w:pPr>
+              <w:spacing w:before="40" w:after="40"/>
+            </w:pPr>
+            <w:r>
+              <w:rPr>
+                <w:b/>
+                <w:sz w:val="18"/>
+              </w:rPr>
+              <w:t xml:space="preserve">Degree-based vetting</w:t>
+            </w:r>
+          </w:p>
+        </w:tc>
+        <w:tc>
+          <w:tcPr>
+            <w:tcW w:w="5040" w:type="dxa"/>
+          </w:tcPr>
+          <w:p>
+            <w:pPr>
+              <w:spacing w:before="40" w:after="40"/>
+            </w:pPr>
+            <w:r>
+              <w:rPr>
+                <w:rFonts w:ascii="Consolas" w:hAnsi="Consolas"/>
+                <w:sz w:val="18"/>
+              </w:rPr>
+              <w:t xml:space="preserve">[UNVERIFIED]</w:t>
+            </w:r>
+            <w:r>
+              <w:rPr>
+                <w:sz w:val="18"/>
+              </w:rPr>
+              <w:t xml:space="preserve"> — no competitor does it and no research supports or refutes it.</w:t>
+            </w:r>
+          </w:p>
+        </w:tc>
+      </w:tr>
+      <w:tr>
+        <w:tc>
+          <w:tcPr>
+            <w:tcW w:w="5040" w:type="dxa"/>
+          </w:tcPr>
+          <w:p>
+            <w:pPr>
+              <w:spacing w:before="40" w:after="40"/>
+            </w:pPr>
+            <w:r>
+              <w:rPr>
+                <w:b/>
+                <w:sz w:val="18"/>
+              </w:rPr>
+              <w:t xml:space="preserve">VGen / Artconomy</w:t>
+            </w:r>
+          </w:p>
+        </w:tc>
+        <w:tc>
+          <w:tcPr>
+            <w:tcW w:w="5040" w:type="dxa"/>
+          </w:tcPr>
+          <w:p>
+            <w:pPr>
+              <w:spacing w:before="40" w:after="40"/>
+            </w:pPr>
+            <w:r>
+              <w:rPr>
+                <w:sz w:val="18"/>
+              </w:rPr>
+              <w:t xml:space="preserve">⚠️ Named as commission-workflow competitors but </w:t>
+            </w:r>
+            <w:r>
+              <w:rPr>
+                <w:b/>
+                <w:sz w:val="18"/>
+              </w:rPr>
+              <w:t xml:space="preserve">not researched</w:t>
+            </w:r>
+            <w:r>
+              <w:rPr>
+                <w:sz w:val="18"/>
+              </w:rPr>
+              <w:t xml:space="preserve"> — web-only, no App Store presence, and Reddit (where they're discussed) is blocked.</w:t>
+            </w:r>
+          </w:p>
+        </w:tc>
+      </w:tr>
+      <w:tr>
+        <w:tc>
+          <w:tcPr>
+            <w:tcW w:w="5040" w:type="dxa"/>
+          </w:tcPr>
+          <w:p>
+            <w:pPr>
+              <w:spacing w:before="40" w:after="40"/>
+            </w:pPr>
+            <w:r>
+              <w:rPr>
+                <w:b/>
+                <w:sz w:val="18"/>
+              </w:rPr>
+              <w:t xml:space="preserve">Reddit / G2 / Capterra</w:t>
+            </w:r>
+          </w:p>
+        </w:tc>
+        <w:tc>
+          <w:tcPr>
+            <w:tcW w:w="5040" w:type="dxa"/>
+          </w:tcPr>
+          <w:p>
+            <w:pPr>
+              <w:spacing w:before="40" w:after="40"/>
+            </w:pPr>
+            <w:r>
+              <w:rPr>
+                <w:sz w:val="18"/>
+              </w:rPr>
+              <w:t xml:space="preserve">❌ Reddit and G2 blocked; Capterra covers gallery-management software only.</w:t>
+            </w:r>
+          </w:p>
+        </w:tc>
+      </w:tr>
+      <w:tr>
+        <w:tc>
+          <w:tcPr>
+            <w:tcW w:w="5040" w:type="dxa"/>
+          </w:tcPr>
+          <w:p>
+            <w:pPr>
+              <w:spacing w:before="40" w:after="40"/>
+            </w:pPr>
+            <w:r>
+              <w:rPr>
+                <w:b/>
+                <w:sz w:val="18"/>
+              </w:rPr>
+              <w:t xml:space="preserve">Trustpilot samples</w:t>
+            </w:r>
+          </w:p>
+        </w:tc>
+        <w:tc>
+          <w:tcPr>
+            <w:tcW w:w="5040" w:type="dxa"/>
+          </w:tcPr>
+          <w:p>
+            <w:pPr>
+              <w:spacing w:before="40" w:after="40"/>
+            </w:pPr>
+            <w:r>
+              <w:rPr>
+                <w:sz w:val="18"/>
+              </w:rPr>
+              <w:t xml:space="preserve">⚠️ Self-selected. Etsy's 1.4★ across 21,264 reviews and Saatchi's 4.5★ across 10,491 cannot be compared like for like — different buyer populations and complaint cultures.</w:t>
             </w:r>
           </w:p>
         </w:tc>

</xml_diff>

<commit_message>
Add adversarial test of the AI art brief claim
Co-Authored-By: Claude Opus 5 <noreply@anthropic.com>
</commit_message>
<xml_diff>
--- a/10_ArtCommissionApp/ResearchAgents/ArtCommissionApp_Research.docx
+++ b/10_ArtCommissionApp/ResearchAgents/ArtCommissionApp_Research.docx
@@ -104,6 +104,17 @@
       </w:pPr>
       <w:r>
         <w:t xml:space="preserve">Section 4 — Bottom-Up Market Size: transaction model at a 15% take rate, with the completion problem, three cases and every assumption stated. *(Added Sept 22, 2026)*</w:t>
+      </w:r>
+    </w:p>
+    <w:p>
+      <w:pPr>
+        <w:numPr>
+          <w:ilvl w:val="0"/>
+          <w:numId w:val="1"/>
+        </w:numPr>
+      </w:pPr>
+      <w:r>
+        <w:t xml:space="preserve">Section 5 — Testing the "Newly Possible" Claim: evidence for and against, both counterarguments argued at full strength, and the narrowed claim that survives. *(Added Sept 22, 2026)*</w:t>
       </w:r>
     </w:p>
     <w:p>
@@ -14976,6 +14987,1828 @@
                 <w:sz w:val="18"/>
               </w:rPr>
               <w:t xml:space="preserve">❌ No population count published; excluded from the model despite being a plausible high-value segment.</w:t>
+            </w:r>
+          </w:p>
+        </w:tc>
+      </w:tr>
+    </w:tbl>
+    <w:p>
+      <w:pPr>
+        <w:spacing w:after="0"/>
+      </w:pPr>
+    </w:p>
+    <w:p>
+      <w:r>
+        <w:br w:type="page"/>
+      </w:r>
+    </w:p>
+    <w:p>
+      <w:pPr>
+        <w:pStyle w:val="Title"/>
+      </w:pPr>
+      <w:r>
+        <w:t xml:space="preserve">Testing the Claim: "AI-Generated Fine-Art Briefs Make This Newly Possible"</w:t>
+      </w:r>
+    </w:p>
+    <w:p>
+      <w:r>
+        <w:rPr>
+          <w:b/>
+        </w:rPr>
+        <w:t xml:space="preserve">Prepared:</w:t>
+      </w:r>
+      <w:r>
+        <w:t xml:space="preserve"> September 22, 2026</w:t>
+      </w:r>
+    </w:p>
+    <w:p>
+      <w:r>
+        <w:rPr>
+          <w:b/>
+        </w:rPr>
+        <w:t xml:space="preserve">Window searched:</w:t>
+      </w:r>
+      <w:r>
+        <w:t xml:space="preserve"> March 2025 – September 2026, plus the historical record needed to test counterargument 1.</w:t>
+      </w:r>
+    </w:p>
+    <w:p>
+      <w:pPr>
+        <w:pStyle w:val="Heading1"/>
+      </w:pPr>
+      <w:r>
+        <w:t xml:space="preserve">The claim, stated precisely</w:t>
+      </w:r>
+    </w:p>
+    <w:p>
+      <w:pPr>
+        <w:ind w:left="360"/>
+        <w:pBdr>
+          <w:left w:val="single" w:sz="18" w:space="8" w:color="9AA0A6"/>
+        </w:pBdr>
+      </w:pPr>
+      <w:r>
+        <w:t xml:space="preserve">An art commission app is </w:t>
+      </w:r>
+      <w:r>
+        <w:rPr>
+          <w:b/>
+        </w:rPr>
+        <w:t xml:space="preserve">newly possible</w:t>
+      </w:r>
+      <w:r>
+        <w:t xml:space="preserve"> because AI can generate a </w:t>
+      </w:r>
+      <w:r>
+        <w:rPr>
+          <w:b/>
+        </w:rPr>
+        <w:t xml:space="preserve">fine-art brief, in text</w:t>
+      </w:r>
+      <w:r>
+        <w:t xml:space="preserve">, describing what a customer may want, which the artist can then change in the final artwork.</w:t>
+      </w:r>
+    </w:p>
+    <w:p>
+      <w:r>
+        <w:rPr>
+          <w:b/>
+        </w:rPr>
+        <w:t xml:space="preserve">Verdict up front: a brief is words, and words have never been the constraint.</w:t>
+      </w:r>
+      <w:r>
+        <w:t xml:space="preserve"> Commission briefs have been collected by forms for fifteen years and compiled by paid professionals for decades. What *is* new is narrower — and, importantly, a January 2025 legal ruling makes your specific configuration the clean one. Stated at the end.</w:t>
+      </w:r>
+    </w:p>
+    <w:p>
+      <w:pPr>
+        <w:pBdr>
+          <w:bottom w:val="single" w:sz="6" w:space="6" w:color="C9CCD1"/>
+        </w:pBdr>
+      </w:pPr>
+    </w:p>
+    <w:p>
+      <w:pPr>
+        <w:pStyle w:val="Heading1"/>
+      </w:pPr>
+      <w:r>
+        <w:t xml:space="preserve">Part 1 — Evidence FOR</w:t>
+      </w:r>
+    </w:p>
+    <w:p>
+      <w:pPr>
+        <w:pStyle w:val="Heading2"/>
+      </w:pPr>
+      <w:r>
+        <w:t xml:space="preserve">1a. The visual half got cheap and consistent — August 2025</w:t>
+      </w:r>
+    </w:p>
+    <w:p>
+      <w:r>
+        <w:t xml:space="preserve">Google released </w:t>
+      </w:r>
+      <w:r>
+        <w:rPr>
+          <w:b/>
+        </w:rPr>
+        <w:t xml:space="preserve">Gemini 2.5 Flash Image ("nano banana") on August 26, 2025</w:t>
+      </w:r>
+      <w:r>
+        <w:t xml:space="preserve">: it holds a subject's appearance across multiple edits, performs targeted local edits by natural-language instruction, and </w:t>
+      </w:r>
+      <w:r>
+        <w:rPr>
+          <w:b/>
+        </w:rPr>
+        <w:t xml:space="preserve">fuses multiple input images</w:t>
+      </w:r>
+      <w:r>
+        <w:t xml:space="preserve"> — at roughly </w:t>
+      </w:r>
+      <w:r>
+        <w:rPr>
+          <w:b/>
+        </w:rPr>
+        <w:t xml:space="preserve">$0.039 per image</w:t>
+      </w:r>
+      <w:r>
+        <w:t xml:space="preserve">. (</w:t>
+      </w:r>
+      <w:hyperlink r:id="rHl22">
+        <w:r>
+          <w:rPr>
+            <w:rStyle w:val="Hyperlink"/>
+          </w:rPr>
+          <w:t xml:space="preserve">Google Developers Blog</w:t>
+        </w:r>
+      </w:hyperlink>
+      <w:r>
+        <w:t xml:space="preserve">)</w:t>
+      </w:r>
+    </w:p>
+    <w:p>
+      <w:r>
+        <w:t xml:space="preserve">Fusing a room photo with three inspiration uploads into a coherent visual reference was unreliable before mid-2025; edit-to-edit consistency was the specific failure mode. </w:t>
+      </w:r>
+      <w:r>
+        <w:rPr>
+          <w:b/>
+        </w:rPr>
+        <w:t xml:space="preserve">That is a real, dated capability change</w:t>
+      </w:r>
+      <w:r>
+        <w:t xml:space="preserve"> — though note it improves *images*, and your claim is about *text*.</w:t>
+      </w:r>
+    </w:p>
+    <w:p>
+      <w:pPr>
+        <w:pStyle w:val="Heading2"/>
+      </w:pPr>
+      <w:r>
+        <w:t xml:space="preserve">1b. The legal line drawn in January 2025 favors your exact design</w:t>
+      </w:r>
+    </w:p>
+    <w:p>
+      <w:r>
+        <w:t xml:space="preserve">On </w:t>
+      </w:r>
+      <w:r>
+        <w:rPr>
+          <w:b/>
+        </w:rPr>
+        <w:t xml:space="preserve">January 29, 2025</w:t>
+      </w:r>
+      <w:r>
+        <w:t xml:space="preserve">, the US Copyright Office concluded that </w:t>
+      </w:r>
+      <w:r>
+        <w:rPr>
+          <w:b/>
+        </w:rPr>
+        <w:t xml:space="preserve">prompting alone does not create authorship</w:t>
+      </w:r>
+      <w:r>
+        <w:t xml:space="preserve">, but works where AI is an </w:t>
+      </w:r>
+      <w:r>
+        <w:rPr>
+          <w:b/>
+        </w:rPr>
+        <w:t xml:space="preserve">assistive tool</w:t>
+      </w:r>
+      <w:r>
+        <w:t xml:space="preserve"> and a human supplies the expression </w:t>
+      </w:r>
+      <w:r>
+        <w:rPr>
+          <w:b/>
+        </w:rPr>
+        <w:t xml:space="preserve">are</w:t>
+      </w:r>
+      <w:r>
+        <w:t xml:space="preserve"> protectable. (</w:t>
+      </w:r>
+      <w:hyperlink r:id="rHl24">
+        <w:r>
+          <w:rPr>
+            <w:rStyle w:val="Hyperlink"/>
+          </w:rPr>
+          <w:t xml:space="preserve">Copyright Office</w:t>
+        </w:r>
+      </w:hyperlink>
+      <w:r>
+        <w:t xml:space="preserve">; </w:t>
+      </w:r>
+      <w:hyperlink r:id="rHl25">
+        <w:r>
+          <w:rPr>
+            <w:rStyle w:val="Hyperlink"/>
+          </w:rPr>
+          <w:t xml:space="preserve">Jones Day</w:t>
+        </w:r>
+      </w:hyperlink>
+      <w:r>
+        <w:t xml:space="preserve">)</w:t>
+      </w:r>
+    </w:p>
+    <w:p>
+      <w:r>
+        <w:rPr>
+          <w:b/>
+        </w:rPr>
+        <w:t xml:space="preserve">"AI writes the brief, the human paints the painting" lands squarely on the protectable side.</w:t>
+      </w:r>
+      <w:r>
+        <w:t xml:space="preserve"> This is the strongest single argument in the claim's favor, and it is dated, official and verifiable.</w:t>
+      </w:r>
+    </w:p>
+    <w:p>
+      <w:pPr>
+        <w:pStyle w:val="Heading2"/>
+      </w:pPr>
+      <w:r>
+        <w:t xml:space="preserve">1c. Your buyer-side channel already works this way</w:t>
+      </w:r>
+    </w:p>
+    <w:p>
+      <w:pPr>
+        <w:numPr>
+          <w:ilvl w:val="0"/>
+          <w:numId w:val="1"/>
+        </w:numPr>
+      </w:pPr>
+      <w:r>
+        <w:rPr>
+          <w:b/>
+        </w:rPr>
+        <w:t xml:space="preserve">83% of creative professionals</w:t>
+      </w:r>
+      <w:r>
+        <w:t xml:space="preserve"> use generative AI at work; </w:t>
+      </w:r>
+      <w:r>
+        <w:rPr>
+          <w:b/>
+        </w:rPr>
+        <w:t xml:space="preserve">72% of designers</w:t>
+      </w:r>
+      <w:r>
+        <w:t xml:space="preserve"> use it day to day; </w:t>
+      </w:r>
+      <w:r>
+        <w:rPr>
+          <w:b/>
+        </w:rPr>
+        <w:t xml:space="preserve">40% use it daily</w:t>
+      </w:r>
+      <w:r>
+        <w:t xml:space="preserve">; </w:t>
+      </w:r>
+      <w:r>
+        <w:rPr>
+          <w:b/>
+        </w:rPr>
+        <w:t xml:space="preserve">33% generate design assets</w:t>
+      </w:r>
+      <w:r>
+        <w:t xml:space="preserve"> with it. (</w:t>
+      </w:r>
+      <w:hyperlink r:id="rHl56">
+        <w:r>
+          <w:rPr>
+            <w:rStyle w:val="Hyperlink"/>
+          </w:rPr>
+          <w:t xml:space="preserve">Figma design statistics</w:t>
+        </w:r>
+      </w:hyperlink>
+      <w:r>
+        <w:t xml:space="preserve">; </w:t>
+      </w:r>
+      <w:hyperlink r:id="rHl57">
+        <w:r>
+          <w:rPr>
+            <w:rStyle w:val="Hyperlink"/>
+          </w:rPr>
+          <w:t xml:space="preserve">Envato State of AI in Creative Work 2026</w:t>
+        </w:r>
+      </w:hyperlink>
+      <w:r>
+        <w:t xml:space="preserve">)</w:t>
+      </w:r>
+    </w:p>
+    <w:p>
+      <w:pPr>
+        <w:numPr>
+          <w:ilvl w:val="0"/>
+          <w:numId w:val="1"/>
+        </w:numPr>
+      </w:pPr>
+      <w:r>
+        <w:t xml:space="preserve">Section 3 identified </w:t>
+      </w:r>
+      <w:r>
+        <w:rPr>
+          <w:b/>
+        </w:rPr>
+        <w:t xml:space="preserve">interior designers (87,100)</w:t>
+      </w:r>
+      <w:r>
+        <w:t xml:space="preserve"> as the most concentrated buyer. </w:t>
+      </w:r>
+      <w:r>
+        <w:rPr>
+          <w:b/>
+        </w:rPr>
+        <w:t xml:space="preserve">They are already AI-native.</w:t>
+      </w:r>
+      <w:r>
+        <w:t xml:space="preserve"> An AI-assisted brief is not a culture shock to them.</w:t>
+      </w:r>
+    </w:p>
+    <w:p>
+      <w:pPr>
+        <w:pStyle w:val="Heading2"/>
+      </w:pPr>
+      <w:r>
+        <w:t xml:space="preserve">1d. Buyer appetite for AI-adjacent art exists</w:t>
+      </w:r>
+    </w:p>
+    <w:p>
+      <w:r>
+        <w:rPr>
+          <w:b/>
+        </w:rPr>
+        <w:t xml:space="preserve">28% of emerging buyers have already purchased AI-generated art and 52% expect to.</w:t>
+      </w:r>
+      <w:r>
+        <w:t xml:space="preserve"> (</w:t>
+      </w:r>
+      <w:hyperlink r:id="rHl26">
+        <w:r>
+          <w:rPr>
+            <w:rStyle w:val="Hyperlink"/>
+          </w:rPr>
+          <w:t xml:space="preserve">Hiscox Art and AI Report 2024</w:t>
+        </w:r>
+      </w:hyperlink>
+      <w:r>
+        <w:t xml:space="preserve">)</w:t>
+      </w:r>
+    </w:p>
+    <w:p>
+      <w:pPr>
+        <w:pBdr>
+          <w:bottom w:val="single" w:sz="6" w:space="6" w:color="C9CCD1"/>
+        </w:pBdr>
+      </w:pPr>
+    </w:p>
+    <w:p>
+      <w:pPr>
+        <w:pStyle w:val="Heading1"/>
+      </w:pPr>
+      <w:r>
+        <w:t xml:space="preserve">Part 2 — Evidence AGAINST</w:t>
+      </w:r>
+    </w:p>
+    <w:p>
+      <w:pPr>
+        <w:pStyle w:val="Heading2"/>
+      </w:pPr>
+      <w:r>
+        <w:t xml:space="preserve">2a. The platforms where commission artists actually live ban AI involvement</w:t>
+      </w:r>
+    </w:p>
+    <w:tbl>
+      <w:tblPr>
+        <w:tblW w:w="10080" w:type="dxa"/>
+        <w:tblBorders>
+          <w:top w:val="single" w:sz="4" w:space="0" w:color="C9CCD1"/>
+          <w:left w:val="single" w:sz="4" w:space="0" w:color="C9CCD1"/>
+          <w:bottom w:val="single" w:sz="4" w:space="0" w:color="C9CCD1"/>
+          <w:right w:val="single" w:sz="4" w:space="0" w:color="C9CCD1"/>
+          <w:insideH w:val="single" w:sz="4" w:space="0" w:color="C9CCD1"/>
+          <w:insideV w:val="single" w:sz="4" w:space="0" w:color="C9CCD1"/>
+        </w:tblBorders>
+        <w:tblLayout w:type="fixed"/>
+      </w:tblPr>
+      <w:tblGrid>
+        <w:gridCol w:w="5040"/>
+        <w:gridCol w:w="5040"/>
+      </w:tblGrid>
+      <w:tr>
+        <w:trPr>
+          <w:tblHeader/>
+        </w:trPr>
+        <w:tc>
+          <w:tcPr>
+            <w:tcW w:w="5040" w:type="dxa"/>
+            <w:shd w:val="clear" w:color="auto" w:fill="EFF1F3"/>
+          </w:tcPr>
+          <w:p>
+            <w:pPr>
+              <w:spacing w:before="40" w:after="40"/>
+            </w:pPr>
+            <w:r>
+              <w:rPr>
+                <w:b/>
+                <w:sz w:val="18"/>
+              </w:rPr>
+              <w:t xml:space="preserve">Platform</w:t>
+            </w:r>
+          </w:p>
+        </w:tc>
+        <w:tc>
+          <w:tcPr>
+            <w:tcW w:w="5040" w:type="dxa"/>
+            <w:shd w:val="clear" w:color="auto" w:fill="EFF1F3"/>
+          </w:tcPr>
+          <w:p>
+            <w:pPr>
+              <w:spacing w:before="40" w:after="40"/>
+            </w:pPr>
+            <w:r>
+              <w:rPr>
+                <w:b/>
+                <w:sz w:val="18"/>
+              </w:rPr>
+              <w:t xml:space="preserve">Policy</w:t>
+            </w:r>
+          </w:p>
+        </w:tc>
+      </w:tr>
+      <w:tr>
+        <w:tc>
+          <w:tcPr>
+            <w:tcW w:w="5040" w:type="dxa"/>
+          </w:tcPr>
+          <w:p>
+            <w:pPr>
+              <w:spacing w:before="40" w:after="40"/>
+            </w:pPr>
+            <w:r>
+              <w:rPr>
+                <w:b/>
+                <w:sz w:val="18"/>
+              </w:rPr>
+              <w:t xml:space="preserve">VGen</w:t>
+            </w:r>
+            <w:r>
+              <w:rPr>
+                <w:sz w:val="18"/>
+              </w:rPr>
+              <w:t xml:space="preserve"> (commission marketplace, tagline "For the love of human creativity")</w:t>
+            </w:r>
+          </w:p>
+        </w:tc>
+        <w:tc>
+          <w:tcPr>
+            <w:tcW w:w="5040" w:type="dxa"/>
+          </w:tcPr>
+          <w:p>
+            <w:pPr>
+              <w:spacing w:before="40" w:after="40"/>
+            </w:pPr>
+            <w:r>
+              <w:rPr>
+                <w:b/>
+                <w:sz w:val="18"/>
+              </w:rPr>
+              <w:t xml:space="preserve">"Until generative AI is made with Consent, Credit, and Compensation, it is not welcome."</w:t>
+            </w:r>
+            <w:r>
+              <w:rPr>
+                <w:sz w:val="18"/>
+              </w:rPr>
+              <w:t xml:space="preserve"> Accounts using AI artwork, heavy tracing or stolen assets </w:t>
+            </w:r>
+            <w:r>
+              <w:rPr>
+                <w:b/>
+                <w:sz w:val="18"/>
+              </w:rPr>
+              <w:t xml:space="preserve">may be suspended</w:t>
+            </w:r>
+            <w:r>
+              <w:rPr>
+                <w:sz w:val="18"/>
+              </w:rPr>
+              <w:t xml:space="preserve"> (</w:t>
+            </w:r>
+            <w:hyperlink r:id="rHl58">
+              <w:r>
+                <w:rPr>
+                  <w:rStyle w:val="Hyperlink"/>
+                  <w:sz w:val="18"/>
+                </w:rPr>
+                <w:t xml:space="preserve">VGen AI Policy</w:t>
+              </w:r>
+            </w:hyperlink>
+            <w:r>
+              <w:rPr>
+                <w:sz w:val="18"/>
+              </w:rPr>
+              <w:t xml:space="preserve">)</w:t>
+            </w:r>
+          </w:p>
+        </w:tc>
+      </w:tr>
+      <w:tr>
+        <w:tc>
+          <w:tcPr>
+            <w:tcW w:w="5040" w:type="dxa"/>
+          </w:tcPr>
+          <w:p>
+            <w:pPr>
+              <w:spacing w:before="40" w:after="40"/>
+            </w:pPr>
+            <w:r>
+              <w:rPr>
+                <w:b/>
+                <w:sz w:val="18"/>
+              </w:rPr>
+              <w:t xml:space="preserve">Artfinder</w:t>
+            </w:r>
+          </w:p>
+        </w:tc>
+        <w:tc>
+          <w:tcPr>
+            <w:tcW w:w="5040" w:type="dxa"/>
+          </w:tcPr>
+          <w:p>
+            <w:pPr>
+              <w:spacing w:before="40" w:after="40"/>
+            </w:pPr>
+            <w:r>
+              <w:rPr>
+                <w:b/>
+                <w:sz w:val="18"/>
+              </w:rPr>
+              <w:t xml:space="preserve">AI-generated artwork explicitly prohibited</w:t>
+            </w:r>
+            <w:r>
+              <w:rPr>
+                <w:sz w:val="18"/>
+              </w:rPr>
+              <w:t xml:space="preserve"> (</w:t>
+            </w:r>
+            <w:hyperlink r:id="rHl47">
+              <w:r>
+                <w:rPr>
+                  <w:rStyle w:val="Hyperlink"/>
+                  <w:sz w:val="18"/>
+                </w:rPr>
+                <w:t xml:space="preserve">artfinder.com/sell</w:t>
+              </w:r>
+            </w:hyperlink>
+            <w:r>
+              <w:rPr>
+                <w:sz w:val="18"/>
+              </w:rPr>
+              <w:t xml:space="preserve">)</w:t>
+            </w:r>
+          </w:p>
+        </w:tc>
+      </w:tr>
+      <w:tr>
+        <w:tc>
+          <w:tcPr>
+            <w:tcW w:w="5040" w:type="dxa"/>
+          </w:tcPr>
+          <w:p>
+            <w:pPr>
+              <w:spacing w:before="40" w:after="40"/>
+            </w:pPr>
+            <w:r>
+              <w:rPr>
+                <w:b/>
+                <w:sz w:val="18"/>
+              </w:rPr>
+              <w:t xml:space="preserve">Cara</w:t>
+            </w:r>
+          </w:p>
+        </w:tc>
+        <w:tc>
+          <w:tcPr>
+            <w:tcW w:w="5040" w:type="dxa"/>
+          </w:tcPr>
+          <w:p>
+            <w:pPr>
+              <w:spacing w:before="40" w:after="40"/>
+            </w:pPr>
+            <w:r>
+              <w:rPr>
+                <w:sz w:val="18"/>
+              </w:rPr>
+              <w:t xml:space="preserve">Built on AI refusal; grew </w:t>
+            </w:r>
+            <w:r>
+              <w:rPr>
+                <w:b/>
+                <w:sz w:val="18"/>
+              </w:rPr>
+              <w:t xml:space="preserve">40,000 → 650,000+ users in one week</w:t>
+            </w:r>
+            <w:r>
+              <w:rPr>
+                <w:sz w:val="18"/>
+              </w:rPr>
+              <w:t xml:space="preserve"> (June 2024) after Meta's training announcement (</w:t>
+            </w:r>
+            <w:hyperlink r:id="rHl21">
+              <w:r>
+                <w:rPr>
+                  <w:rStyle w:val="Hyperlink"/>
+                  <w:sz w:val="18"/>
+                </w:rPr>
+                <w:t xml:space="preserve">TechCrunch</w:t>
+              </w:r>
+            </w:hyperlink>
+            <w:r>
+              <w:rPr>
+                <w:sz w:val="18"/>
+              </w:rPr>
+              <w:t xml:space="preserve">)</w:t>
+            </w:r>
+          </w:p>
+        </w:tc>
+      </w:tr>
+      <w:tr>
+        <w:tc>
+          <w:tcPr>
+            <w:tcW w:w="5040" w:type="dxa"/>
+          </w:tcPr>
+          <w:p>
+            <w:pPr>
+              <w:spacing w:before="40" w:after="40"/>
+            </w:pPr>
+            <w:r>
+              <w:rPr>
+                <w:b/>
+                <w:sz w:val="18"/>
+              </w:rPr>
+              <w:t xml:space="preserve">Artfol</w:t>
+            </w:r>
+          </w:p>
+        </w:tc>
+        <w:tc>
+          <w:tcPr>
+            <w:tcW w:w="5040" w:type="dxa"/>
+          </w:tcPr>
+          <w:p>
+            <w:pPr>
+              <w:spacing w:before="40" w:after="40"/>
+            </w:pPr>
+            <w:r>
+              <w:rPr>
+                <w:sz w:val="18"/>
+              </w:rPr>
+              <w:t xml:space="preserve">Brands itself "AI-Free Art Community"</w:t>
+            </w:r>
+          </w:p>
+        </w:tc>
+      </w:tr>
+      <w:tr>
+        <w:tc>
+          <w:tcPr>
+            <w:tcW w:w="5040" w:type="dxa"/>
+          </w:tcPr>
+          <w:p>
+            <w:pPr>
+              <w:spacing w:before="40" w:after="40"/>
+            </w:pPr>
+            <w:r>
+              <w:rPr>
+                <w:b/>
+                <w:sz w:val="18"/>
+              </w:rPr>
+              <w:t xml:space="preserve">Etsy</w:t>
+            </w:r>
+          </w:p>
+        </w:tc>
+        <w:tc>
+          <w:tcPr>
+            <w:tcW w:w="5040" w:type="dxa"/>
+          </w:tcPr>
+          <w:p>
+            <w:pPr>
+              <w:spacing w:before="40" w:after="40"/>
+            </w:pPr>
+            <w:r>
+              <w:rPr>
+                <w:sz w:val="18"/>
+              </w:rPr>
+              <w:t xml:space="preserve">Mandatory AI disclosure wherever AI touched the process</w:t>
+            </w:r>
+          </w:p>
+        </w:tc>
+      </w:tr>
+    </w:tbl>
+    <w:p>
+      <w:pPr>
+        <w:spacing w:after="0"/>
+      </w:pPr>
+    </w:p>
+    <w:p>
+      <w:r>
+        <w:rPr>
+          <w:b/>
+        </w:rPr>
+        <w:t xml:space="preserve">Your supply side is 347,000 people with a median art income of $20,000–$30,000 (Section 1), organised on platforms that suspend accounts for AI involvement.</w:t>
+      </w:r>
+      <w:r>
+        <w:t xml:space="preserve"> Capability is not what stands between you and this market.</w:t>
+      </w:r>
+    </w:p>
+    <w:p>
+      <w:pPr>
+        <w:pStyle w:val="Heading2"/>
+      </w:pPr>
+      <w:r>
+        <w:t xml:space="preserve">2b. Buyers want AI kept visible and priced lower</w:t>
+      </w:r>
+    </w:p>
+    <w:p>
+      <w:r>
+        <w:rPr>
+          <w:b/>
+        </w:rPr>
+        <w:t xml:space="preserve">82% of collectors want a clear distinction between AI-made and human-made art, and only 16% of seasoned collectors believe AI art will reach the value of human work.</w:t>
+      </w:r>
+      <w:r>
+        <w:t xml:space="preserve"> (</w:t>
+      </w:r>
+      <w:hyperlink r:id="rHl26">
+        <w:r>
+          <w:rPr>
+            <w:rStyle w:val="Hyperlink"/>
+          </w:rPr>
+          <w:t xml:space="preserve">Hiscox</w:t>
+        </w:r>
+      </w:hyperlink>
+      <w:r>
+        <w:t xml:space="preserve">) Your premise includes buyers who want </w:t>
+      </w:r>
+      <w:r>
+        <w:rPr>
+          <w:b/>
+        </w:rPr>
+        <w:t xml:space="preserve">art that appreciates</w:t>
+      </w:r>
+      <w:r>
+        <w:t xml:space="preserve"> — the same survey says those buyers discount anything AI-touched.</w:t>
+      </w:r>
+    </w:p>
+    <w:p>
+      <w:pPr>
+        <w:pStyle w:val="Heading2"/>
+      </w:pPr>
+      <w:r>
+        <w:t xml:space="preserve">2c. The tools that do this today are reviewed badly at exactly your feature</w:t>
+      </w:r>
+    </w:p>
+    <w:p>
+      <w:pPr>
+        <w:numPr>
+          <w:ilvl w:val="0"/>
+          <w:numId w:val="1"/>
+        </w:numPr>
+      </w:pPr>
+      <w:r>
+        <w:rPr>
+          <w:b/>
+        </w:rPr>
+        <w:t xml:space="preserve">Artist.ai, 1★, Sept 2 2026</w:t>
+      </w:r>
+      <w:r>
+        <w:t xml:space="preserve"> — bad at generating from </w:t>
+      </w:r>
+      <w:r>
+        <w:rPr>
+          <w:b/>
+        </w:rPr>
+        <w:t xml:space="preserve">reference images</w:t>
+      </w:r>
+      <w:r>
+        <w:t xml:space="preserve">, which is your inspiration-upload feature.</w:t>
+      </w:r>
+    </w:p>
+    <w:p>
+      <w:pPr>
+        <w:numPr>
+          <w:ilvl w:val="0"/>
+          <w:numId w:val="1"/>
+        </w:numPr>
+      </w:pPr>
+      <w:r>
+        <w:rPr>
+          <w:b/>
+        </w:rPr>
+        <w:t xml:space="preserve">Renovate AI, 1★, Jul 30 2026</w:t>
+      </w:r>
+      <w:r>
+        <w:t xml:space="preserve"> — the image </w:t>
+      </w:r>
+      <w:r>
+        <w:rPr>
+          <w:b/>
+        </w:rPr>
+        <w:t xml:space="preserve">degrades with every edit</w:t>
+      </w:r>
+      <w:r>
+        <w:t xml:space="preserve">.</w:t>
+      </w:r>
+    </w:p>
+    <w:p>
+      <w:pPr>
+        <w:numPr>
+          <w:ilvl w:val="0"/>
+          <w:numId w:val="1"/>
+        </w:numPr>
+      </w:pPr>
+      <w:r>
+        <w:rPr>
+          <w:b/>
+        </w:rPr>
+        <w:t xml:space="preserve">Home AI, 2★, Sept 18 2026</w:t>
+      </w:r>
+      <w:r>
+        <w:t xml:space="preserve"> — a free general assistant (Gemini) does the job better than the paid vertical app.</w:t>
+      </w:r>
+    </w:p>
+    <w:p>
+      <w:pPr>
+        <w:pStyle w:val="Heading2"/>
+      </w:pPr>
+      <w:r>
+        <w:t xml:space="preserve">2d. Nobody has ever measured whether an AI brief produces better art</w:t>
+      </w:r>
+    </w:p>
+    <w:p>
+      <w:r>
+        <w:t xml:space="preserve">I searched for benchmarks on brief quality, commission satisfaction or artist-output ratings from AI-assisted versus human-written briefs. </w:t>
+      </w:r>
+      <w:r>
+        <w:rPr>
+          <w:b/>
+        </w:rPr>
+        <w:t xml:space="preserve">None exists.</w:t>
+      </w:r>
+      <w:r>
+        <w:t xml:space="preserve"> Every AI benchmark in this space measures image generation, not briefing. </w:t>
+      </w:r>
+      <w:r>
+        <w:rPr>
+          <w:b/>
+        </w:rPr>
+        <w:t xml:space="preserve">The central premise of your claim is unmeasured — not disproven, unmeasured.</w:t>
+      </w:r>
+      <w:r>
+        <w:t xml:space="preserve"> </w:t>
+      </w:r>
+      <w:r>
+        <w:rPr>
+          <w:rFonts w:ascii="Consolas" w:hAnsi="Consolas"/>
+        </w:rPr>
+        <w:t xml:space="preserve">[UNVERIFIED — absence of evidence.]</w:t>
+      </w:r>
+    </w:p>
+    <w:p>
+      <w:pPr>
+        <w:pStyle w:val="Heading2"/>
+      </w:pPr>
+      <w:r>
+        <w:t xml:space="preserve">2e. The legal overhang has not cleared</w:t>
+      </w:r>
+    </w:p>
+    <w:p>
+      <w:r>
+        <w:rPr>
+          <w:b/>
+        </w:rPr>
+        <w:t xml:space="preserve">Andersen v. Stability AI</w:t>
+      </w:r>
+      <w:r>
+        <w:t xml:space="preserve"> — the visual artists' class action — had class-certification briefing completed in </w:t>
+      </w:r>
+      <w:r>
+        <w:rPr>
+          <w:b/>
+        </w:rPr>
+        <w:t xml:space="preserve">April 2026</w:t>
+      </w:r>
+      <w:r>
+        <w:t xml:space="preserve"> and remains active (</w:t>
+      </w:r>
+      <w:hyperlink r:id="rHl28">
+        <w:r>
+          <w:rPr>
+            <w:rStyle w:val="Hyperlink"/>
+          </w:rPr>
+          <w:t xml:space="preserve">BakerHostetler</w:t>
+        </w:r>
+      </w:hyperlink>
+      <w:r>
+        <w:t xml:space="preserve">). If any AI-generated *imagery* reaches the artist and is copied into the work, the Copyright Office framework leaves the protectability of that portion doubtful.</w:t>
+      </w:r>
+    </w:p>
+    <w:p>
+      <w:pPr>
+        <w:pBdr>
+          <w:bottom w:val="single" w:sz="6" w:space="6" w:color="C9CCD1"/>
+        </w:pBdr>
+      </w:pPr>
+    </w:p>
+    <w:p>
+      <w:pPr>
+        <w:pStyle w:val="Heading1"/>
+      </w:pPr>
+      <w:r>
+        <w:t xml:space="preserve">Part 3 — Counterargument 1, argued at full strength</w:t>
+      </w:r>
+    </w:p>
+    <w:p>
+      <w:pPr>
+        <w:pStyle w:val="Heading2"/>
+      </w:pPr>
+      <w:r>
+        <w:rPr>
+          <w:b/>
+        </w:rPr>
+        <w:t xml:space="preserve">"This was already possible five years ago."</w:t>
+      </w:r>
+    </w:p>
+    <w:p>
+      <w:r>
+        <w:rPr>
+          <w:b/>
+        </w:rPr>
+        <w:t xml:space="preserve">A brief is a piece of writing. Buyers have been writing them since patrons wrote to painters.</w:t>
+      </w:r>
+    </w:p>
+    <w:p>
+      <w:r>
+        <w:rPr>
+          <w:b/>
+        </w:rPr>
+        <w:t xml:space="preserve">The form existed:</w:t>
+      </w:r>
+      <w:r>
+        <w:t xml:space="preserve"> Fiverr launched in 2010 with brief-driven ordering, revisions and escrow; Etsy custom orders have collected buyer specifications for years; DeviantArt-era commission sheets and VGen's structured commission forms do the same. </w:t>
+      </w:r>
+      <w:r>
+        <w:rPr>
+          <w:b/>
+        </w:rPr>
+        <w:t xml:space="preserve">Size, palette, subject, deadline, reference images — these are form fields, and they have been form fields for fifteen years.</w:t>
+      </w:r>
+    </w:p>
+    <w:p>
+      <w:r>
+        <w:rPr>
+          <w:b/>
+        </w:rPr>
+        <w:t xml:space="preserve">The inspiration upload existed:</w:t>
+      </w:r>
+      <w:r>
+        <w:t xml:space="preserve"> Pinterest launched in 2010. </w:t>
+      </w:r>
+      <w:r>
+        <w:rPr>
+          <w:b/>
+        </w:rPr>
+        <w:t xml:space="preserve">The mood board is sixteen years old</w:t>
+      </w:r>
+      <w:r>
+        <w:t xml:space="preserve"> and remains the default way buyers communicate taste.</w:t>
+      </w:r>
+    </w:p>
+    <w:p>
+      <w:r>
+        <w:rPr>
+          <w:b/>
+        </w:rPr>
+        <w:t xml:space="preserve">The professional version existed and was priced:</w:t>
+      </w:r>
+      <w:r>
+        <w:t xml:space="preserve"> art advisors and consultants have compiled briefs from a client's space, taste and budget for decades, at </w:t>
+      </w:r>
+      <w:r>
+        <w:rPr>
+          <w:b/>
+        </w:rPr>
+        <w:t xml:space="preserve">5–20% of the artwork</w:t>
+      </w:r>
+      <w:r>
+        <w:t xml:space="preserve"> (Section 2). Art buyers and art producers do it on salary at </w:t>
+      </w:r>
+      <w:r>
+        <w:rPr>
+          <w:b/>
+        </w:rPr>
+        <w:t xml:space="preserve">$74,000–$81,000/yr</w:t>
+      </w:r>
+      <w:r>
+        <w:t xml:space="preserve">. </w:t>
+      </w:r>
+      <w:r>
+        <w:rPr>
+          <w:b/>
+        </w:rPr>
+        <w:t xml:space="preserve">This is not an unsolved problem; it is a solved problem with a price.</w:t>
+      </w:r>
+    </w:p>
+    <w:p>
+      <w:r>
+        <w:rPr>
+          <w:b/>
+        </w:rPr>
+        <w:t xml:space="preserve">And the visualization existed:</w:t>
+      </w:r>
+      <w:r>
+        <w:t xml:space="preserve"> wall-preview apps — Smartist, Artrooms, ArtStage, iArtView — have let buyers see art at size on a photographed wall since roughly 2020, with thousands of ratings each.</w:t>
+      </w:r>
+    </w:p>
+    <w:p>
+      <w:r>
+        <w:rPr>
+          <w:b/>
+        </w:rPr>
+        <w:t xml:space="preserve">The strong form:</w:t>
+      </w:r>
+      <w:r>
+        <w:t xml:space="preserve"> every component you describe shipped before 2021. What you are adding is that an LLM drafts the paragraph instead of the buyer typing it or the consultant writing it. </w:t>
+      </w:r>
+      <w:r>
+        <w:rPr>
+          <w:b/>
+        </w:rPr>
+        <w:t xml:space="preserve">That is a convenience improvement on a form field — not an enabling condition.</w:t>
+      </w:r>
+      <w:r>
+        <w:t xml:space="preserve"> And the market's failure was never that briefs were hard to write; it was that commissioning is high-friction, high-trust and hard to complete (Section 2).</w:t>
+      </w:r>
+    </w:p>
+    <w:p>
+      <w:r>
+        <w:rPr>
+          <w:b/>
+        </w:rPr>
+        <w:t xml:space="preserve">Where this argument is weakest:</w:t>
+      </w:r>
+      <w:r>
+        <w:t xml:space="preserve"> pre-LLM briefs required the buyer to already possess the vocabulary. Most people cannot say "a muted ochre palette with impasto texture at 48×36 to balance a north-facing wall" — they can only say "something warm, I guess." </w:t>
+      </w:r>
+      <w:r>
+        <w:rPr>
+          <w:b/>
+        </w:rPr>
+        <w:t xml:space="preserve">Turning a room photograph and three saved images into artist-usable specification language is genuinely new</w:t>
+      </w:r>
+      <w:r>
+        <w:t xml:space="preserve">, and it is the one part of your claim that survives this counterargument.</w:t>
+      </w:r>
+    </w:p>
+    <w:p>
+      <w:pPr>
+        <w:pBdr>
+          <w:bottom w:val="single" w:sz="6" w:space="6" w:color="C9CCD1"/>
+        </w:pBdr>
+      </w:pPr>
+    </w:p>
+    <w:p>
+      <w:pPr>
+        <w:pStyle w:val="Heading1"/>
+      </w:pPr>
+      <w:r>
+        <w:t xml:space="preserve">Part 4 — Counterargument 2, argued at full strength</w:t>
+      </w:r>
+    </w:p>
+    <w:p>
+      <w:pPr>
+        <w:pStyle w:val="Heading2"/>
+      </w:pPr>
+      <w:r>
+        <w:rPr>
+          <w:b/>
+        </w:rPr>
+        <w:t xml:space="preserve">"This still is not possible."</w:t>
+      </w:r>
+    </w:p>
+    <w:p>
+      <w:r>
+        <w:rPr>
+          <w:b/>
+        </w:rPr>
+        <w:t xml:space="preserve">1. The supply side has pre-emptively banned you.</w:t>
+      </w:r>
+      <w:r>
+        <w:t xml:space="preserve"> VGen suspends accounts for AI involvement. Artfinder prohibits AI art. Cara and Artfol exist as refusals. You are proposing an AI-mediated product to the single most AI-hostile professional community in the economy, and your model requires them to accept briefs from it.</w:t>
+      </w:r>
+    </w:p>
+    <w:p>
+      <w:r>
+        <w:rPr>
+          <w:b/>
+        </w:rPr>
+        <w:t xml:space="preserve">2. The buyer premise contradicts itself.</w:t>
+      </w:r>
+      <w:r>
+        <w:t xml:space="preserve"> Your premise wants art that </w:t>
+      </w:r>
+      <w:r>
+        <w:rPr>
+          <w:b/>
+        </w:rPr>
+        <w:t xml:space="preserve">appreciates in value</w:t>
+      </w:r>
+      <w:r>
+        <w:t xml:space="preserve">. 82% of collectors want AI involvement disclosed and only 16% of seasoned collectors think AI-touched work will hold value. </w:t>
+      </w:r>
+      <w:r>
+        <w:rPr>
+          <w:b/>
+        </w:rPr>
+        <w:t xml:space="preserve">Disclosing AI involvement in the brief plausibly reduces the appreciation the buyer came for.</w:t>
+      </w:r>
+      <w:r>
+        <w:t xml:space="preserve"> </w:t>
+      </w:r>
+      <w:r>
+        <w:rPr>
+          <w:rFonts w:ascii="Consolas" w:hAnsi="Consolas"/>
+        </w:rPr>
+        <w:t xml:space="preserve">[Inference — no study isolates the effect of an AI-written *brief*, as opposed to AI-generated art, on resale value. Nobody has measured it.]</w:t>
+      </w:r>
+    </w:p>
+    <w:p>
+      <w:r>
+        <w:rPr>
+          <w:b/>
+        </w:rPr>
+        <w:t xml:space="preserve">3. The premise misdiagnoses the artist's problem.</w:t>
+      </w:r>
+      <w:r>
+        <w:t xml:space="preserve"> "Artist's block" is offered as a driver. Section 1 found artists' measured constraints are </w:t>
+      </w:r>
+      <w:r>
+        <w:rPr>
+          <w:b/>
+        </w:rPr>
+        <w:t xml:space="preserve">income ($20–30k median), instability (80%+ report unstable earnings), and reach</w:t>
+      </w:r>
+      <w:r>
+        <w:t xml:space="preserve"> — not a shortage of ideas. </w:t>
+      </w:r>
+      <w:r>
+        <w:rPr>
+          <w:b/>
+        </w:rPr>
+        <w:t xml:space="preserve">You are solving the problem the artists don't have and not solving the one they do.</w:t>
+      </w:r>
+    </w:p>
+    <w:p>
+      <w:r>
+        <w:rPr>
+          <w:b/>
+        </w:rPr>
+        <w:t xml:space="preserve">4. The real failure mode is completion, not briefing.</w:t>
+      </w:r>
+      <w:r>
+        <w:t xml:space="preserve"> Section 2: 14% of complaints in this category are trust and scams; a Fiverr buyer lost $600 to a vetted, highly-rated seller. Section 4: at a 15% take on completed transactions you'd absorb ~1,200 failed commissions a year. </w:t>
+      </w:r>
+      <w:r>
+        <w:rPr>
+          <w:b/>
+        </w:rPr>
+        <w:t xml:space="preserve">A better brief does not make a stranger finish a painting.</w:t>
+      </w:r>
+    </w:p>
+    <w:p>
+      <w:r>
+        <w:rPr>
+          <w:b/>
+        </w:rPr>
+        <w:t xml:space="preserve">5. Nothing has been measured.</w:t>
+      </w:r>
+      <w:r>
+        <w:t xml:space="preserve"> No benchmark, study or product exists demonstrating that AI-assisted briefs produce better commissioned art, higher completion rates or happier buyers.</w:t>
+      </w:r>
+    </w:p>
+    <w:p>
+      <w:r>
+        <w:rPr>
+          <w:b/>
+        </w:rPr>
+        <w:t xml:space="preserve">Where this argument is weakest:</w:t>
+      </w:r>
+      <w:r>
+        <w:t xml:space="preserve"> it attacks *AI-generated imagery* and *AI involvement in the artwork*. </w:t>
+      </w:r>
+      <w:r>
+        <w:rPr>
+          <w:b/>
+        </w:rPr>
+        <w:t xml:space="preserve">It does not defeat a text-only brief generator that never produces an image.</w:t>
+      </w:r>
+      <w:r>
+        <w:t xml:space="preserve"> VGen's objection is to AI *art*; Artfinder prohibits AI *artwork*. A tool that writes a specification in words — and can prove no generated image touched the piece — is arguably outside every one of those policies. </w:t>
+      </w:r>
+      <w:r>
+        <w:rPr>
+          <w:rFonts w:ascii="Consolas" w:hAnsi="Consolas"/>
+        </w:rPr>
+        <w:t xml:space="preserve">[UNVERIFIED — none of the policies I read explicitly addresses AI-written briefs. That ambiguity is a risk, not a permission.]</w:t>
+      </w:r>
+    </w:p>
+    <w:p>
+      <w:pPr>
+        <w:pBdr>
+          <w:bottom w:val="single" w:sz="6" w:space="6" w:color="C9CCD1"/>
+        </w:pBdr>
+      </w:pPr>
+    </w:p>
+    <w:p>
+      <w:pPr>
+        <w:pStyle w:val="Heading1"/>
+      </w:pPr>
+      <w:r>
+        <w:t xml:space="preserve">Part 5 — What survives</w:t>
+      </w:r>
+    </w:p>
+    <w:p>
+      <w:r>
+        <w:t xml:space="preserve">The claim overstates novelty and understates the obstacle. Here is the version that survives:</w:t>
+      </w:r>
+    </w:p>
+    <w:p>
+      <w:pPr>
+        <w:ind w:left="360"/>
+        <w:pBdr>
+          <w:left w:val="single" w:sz="18" w:space="8" w:color="9AA0A6"/>
+        </w:pBdr>
+      </w:pPr>
+      <w:r>
+        <w:rPr>
+          <w:b/>
+        </w:rPr>
+        <w:t xml:space="preserve">Not newly possible — newly legible, and newly legally clean.</w:t>
+      </w:r>
+      <w:r>
+        <w:t xml:space="preserve"> Briefs are as old as patronage and have been form fields since 2010. Two things changed. </w:t>
+      </w:r>
+      <w:r>
+        <w:rPr>
+          <w:b/>
+        </w:rPr>
+        <w:t xml:space="preserve">(1) Legibility:</w:t>
+      </w:r>
+      <w:r>
+        <w:t xml:space="preserve"> since mid-2025, a room photograph plus a few inspiration images can be turned into structured specification language — palette, scale, texture, theme — at about four cents, which non-experts could never write themselves. </w:t>
+      </w:r>
+      <w:r>
+        <w:rPr>
+          <w:b/>
+        </w:rPr>
+        <w:t xml:space="preserve">(2) Legal position:</w:t>
+      </w:r>
+      <w:r>
+        <w:t xml:space="preserve"> the Copyright Office's January 29, 2025 framework makes "AI assists, human authors" the protectable configuration, so a text brief followed by a human-painted work is the clean way to build this. </w:t>
+      </w:r>
+      <w:r>
+        <w:rPr>
+          <w:b/>
+        </w:rPr>
+        <w:t xml:space="preserve">What has not changed is that the artists you need have banned AI involvement, that collectors discount AI-touched work, and that commissions fail on trust and completion rather than on briefing.</w:t>
+      </w:r>
+      <w:r>
+        <w:t xml:space="preserve"> The product that survives generates </w:t>
+      </w:r>
+      <w:r>
+        <w:rPr>
+          <w:b/>
+        </w:rPr>
+        <w:t xml:space="preserve">text only, never imagery</w:t>
+      </w:r>
+      <w:r>
+        <w:t xml:space="preserve">, says so publicly, and sells to interior designers — who already use AI daily — rather than to artists, who don't.</w:t>
+      </w:r>
+    </w:p>
+    <w:p>
+      <w:pPr>
+        <w:pStyle w:val="Heading2"/>
+      </w:pPr>
+      <w:r>
+        <w:t xml:space="preserve">Four tests that would falsify this — cheapest first</w:t>
+      </w:r>
+    </w:p>
+    <w:p>
+      <w:r>
+        <w:t xml:space="preserve">1. </w:t>
+      </w:r>
+      <w:r>
+        <w:rPr>
+          <w:b/>
+        </w:rPr>
+        <w:t xml:space="preserve">The VGen test (free, one week).</w:t>
+      </w:r>
+      <w:r>
+        <w:t xml:space="preserve"> Ask 20 working commission artists: *does an AI-written brief disqualify you or your work from platforms you use?* If a meaningful share say yes, </w:t>
+      </w:r>
+      <w:r>
+        <w:rPr>
+          <w:b/>
+        </w:rPr>
+        <w:t xml:space="preserve">your supply side is gated before you build anything.</w:t>
+      </w:r>
+    </w:p>
+    <w:p>
+      <w:r>
+        <w:t xml:space="preserve">2. </w:t>
+      </w:r>
+      <w:r>
+        <w:rPr>
+          <w:b/>
+        </w:rPr>
+        <w:t xml:space="preserve">The blind brief test.</w:t>
+      </w:r>
+      <w:r>
+        <w:t xml:space="preserve"> Give 10 artists AI-written briefs and 10 human-written briefs, blinded, and have buyers rate the resulting work. </w:t>
+      </w:r>
+      <w:r>
+        <w:rPr>
+          <w:b/>
+        </w:rPr>
+        <w:t xml:space="preserve">Nobody has run this. It is the central premise of your claim and it is unmeasured.</w:t>
+      </w:r>
+    </w:p>
+    <w:p>
+      <w:r>
+        <w:t xml:space="preserve">3. </w:t>
+      </w:r>
+      <w:r>
+        <w:rPr>
+          <w:b/>
+        </w:rPr>
+        <w:t xml:space="preserve">The no-image test.</w:t>
+      </w:r>
+      <w:r>
+        <w:t xml:space="preserve"> Build it text-only. If the value proposition collapses without generated imagery, you are an AI art product wearing a commission app's coat — and every policy in Part 2 applies to you.</w:t>
+      </w:r>
+    </w:p>
+    <w:p>
+      <w:r>
+        <w:t xml:space="preserve">4. </w:t>
+      </w:r>
+      <w:r>
+        <w:rPr>
+          <w:b/>
+        </w:rPr>
+        <w:t xml:space="preserve">The designer test.</w:t>
+      </w:r>
+      <w:r>
+        <w:t xml:space="preserve"> Ask 20 interior designers what they actually want: a brief generator, or a vetted artist roster with a delivery guarantee? Sections 2 and 4 both say their pain is </w:t>
+      </w:r>
+      <w:r>
+        <w:rPr>
+          <w:b/>
+        </w:rPr>
+        <w:t xml:space="preserve">completion</w:t>
+      </w:r>
+      <w:r>
+        <w:t xml:space="preserve">, not briefing.</w:t>
+      </w:r>
+    </w:p>
+    <w:p>
+      <w:pPr>
+        <w:pBdr>
+          <w:bottom w:val="single" w:sz="6" w:space="6" w:color="C9CCD1"/>
+        </w:pBdr>
+      </w:pPr>
+    </w:p>
+    <w:p>
+      <w:pPr>
+        <w:pStyle w:val="Heading1"/>
+      </w:pPr>
+      <w:r>
+        <w:t xml:space="preserve">Flags</w:t>
+      </w:r>
+    </w:p>
+    <w:tbl>
+      <w:tblPr>
+        <w:tblW w:w="10080" w:type="dxa"/>
+        <w:tblBorders>
+          <w:top w:val="single" w:sz="4" w:space="0" w:color="C9CCD1"/>
+          <w:left w:val="single" w:sz="4" w:space="0" w:color="C9CCD1"/>
+          <w:bottom w:val="single" w:sz="4" w:space="0" w:color="C9CCD1"/>
+          <w:right w:val="single" w:sz="4" w:space="0" w:color="C9CCD1"/>
+          <w:insideH w:val="single" w:sz="4" w:space="0" w:color="C9CCD1"/>
+          <w:insideV w:val="single" w:sz="4" w:space="0" w:color="C9CCD1"/>
+        </w:tblBorders>
+        <w:tblLayout w:type="fixed"/>
+      </w:tblPr>
+      <w:tblGrid>
+        <w:gridCol w:w="5040"/>
+        <w:gridCol w:w="5040"/>
+      </w:tblGrid>
+      <w:tr>
+        <w:trPr>
+          <w:tblHeader/>
+        </w:trPr>
+        <w:tc>
+          <w:tcPr>
+            <w:tcW w:w="5040" w:type="dxa"/>
+            <w:shd w:val="clear" w:color="auto" w:fill="EFF1F3"/>
+          </w:tcPr>
+          <w:p>
+            <w:pPr>
+              <w:spacing w:before="40" w:after="40"/>
+            </w:pPr>
+            <w:r>
+              <w:rPr>
+                <w:b/>
+                <w:sz w:val="18"/>
+              </w:rPr>
+              <w:t xml:space="preserve">Item</w:t>
+            </w:r>
+          </w:p>
+        </w:tc>
+        <w:tc>
+          <w:tcPr>
+            <w:tcW w:w="5040" w:type="dxa"/>
+            <w:shd w:val="clear" w:color="auto" w:fill="EFF1F3"/>
+          </w:tcPr>
+          <w:p>
+            <w:pPr>
+              <w:spacing w:before="40" w:after="40"/>
+            </w:pPr>
+            <w:r>
+              <w:rPr>
+                <w:b/>
+                <w:sz w:val="18"/>
+              </w:rPr>
+              <w:t xml:space="preserve">Status</w:t>
+            </w:r>
+          </w:p>
+        </w:tc>
+      </w:tr>
+      <w:tr>
+        <w:tc>
+          <w:tcPr>
+            <w:tcW w:w="5040" w:type="dxa"/>
+          </w:tcPr>
+          <w:p>
+            <w:pPr>
+              <w:spacing w:before="40" w:after="40"/>
+            </w:pPr>
+            <w:r>
+              <w:rPr>
+                <w:sz w:val="18"/>
+              </w:rPr>
+              <w:t xml:space="preserve">"No benchmark exists for brief quality"</w:t>
+            </w:r>
+          </w:p>
+        </w:tc>
+        <w:tc>
+          <w:tcPr>
+            <w:tcW w:w="5040" w:type="dxa"/>
+          </w:tcPr>
+          <w:p>
+            <w:pPr>
+              <w:spacing w:before="40" w:after="40"/>
+            </w:pPr>
+            <w:r>
+              <w:rPr>
+                <w:rFonts w:ascii="Consolas" w:hAnsi="Consolas"/>
+                <w:sz w:val="18"/>
+              </w:rPr>
+              <w:t xml:space="preserve">[UNVERIFIED — absence of evidence]</w:t>
+            </w:r>
+            <w:r>
+              <w:rPr>
+                <w:sz w:val="18"/>
+              </w:rPr>
+              <w:t xml:space="preserve">. I searched; I found none. It may exist unpublished or behind a paywall.</w:t>
+            </w:r>
+          </w:p>
+        </w:tc>
+      </w:tr>
+      <w:tr>
+        <w:tc>
+          <w:tcPr>
+            <w:tcW w:w="5040" w:type="dxa"/>
+          </w:tcPr>
+          <w:p>
+            <w:pPr>
+              <w:spacing w:before="40" w:after="40"/>
+            </w:pPr>
+            <w:r>
+              <w:rPr>
+                <w:sz w:val="18"/>
+              </w:rPr>
+              <w:t xml:space="preserve">Effect of an AI-written *brief* on resale value</w:t>
+            </w:r>
+          </w:p>
+        </w:tc>
+        <w:tc>
+          <w:tcPr>
+            <w:tcW w:w="5040" w:type="dxa"/>
+          </w:tcPr>
+          <w:p>
+            <w:pPr>
+              <w:spacing w:before="40" w:after="40"/>
+            </w:pPr>
+            <w:r>
+              <w:rPr>
+                <w:rFonts w:ascii="Consolas" w:hAnsi="Consolas"/>
+                <w:sz w:val="18"/>
+              </w:rPr>
+              <w:t xml:space="preserve">[UNVERIFIED]</w:t>
+            </w:r>
+            <w:r>
+              <w:rPr>
+                <w:sz w:val="18"/>
+              </w:rPr>
+              <w:t xml:space="preserve"> — the Hiscox findings concern AI-*generated art*, not AI-assisted briefing. I extended the inference and have marked it.</w:t>
+            </w:r>
+          </w:p>
+        </w:tc>
+      </w:tr>
+      <w:tr>
+        <w:tc>
+          <w:tcPr>
+            <w:tcW w:w="5040" w:type="dxa"/>
+          </w:tcPr>
+          <w:p>
+            <w:pPr>
+              <w:spacing w:before="40" w:after="40"/>
+            </w:pPr>
+            <w:r>
+              <w:rPr>
+                <w:sz w:val="18"/>
+              </w:rPr>
+              <w:t xml:space="preserve">Whether AI-brief tools fall outside platform AI bans</w:t>
+            </w:r>
+          </w:p>
+        </w:tc>
+        <w:tc>
+          <w:tcPr>
+            <w:tcW w:w="5040" w:type="dxa"/>
+          </w:tcPr>
+          <w:p>
+            <w:pPr>
+              <w:spacing w:before="40" w:after="40"/>
+            </w:pPr>
+            <w:r>
+              <w:rPr>
+                <w:rFonts w:ascii="Consolas" w:hAnsi="Consolas"/>
+                <w:sz w:val="18"/>
+              </w:rPr>
+              <w:t xml:space="preserve">[UNVERIFIED]</w:t>
+            </w:r>
+            <w:r>
+              <w:rPr>
+                <w:sz w:val="18"/>
+              </w:rPr>
+              <w:t xml:space="preserve"> — VGen's and Artfinder's policies address AI artwork; neither text I read addresses AI-written briefs. </w:t>
+            </w:r>
+            <w:r>
+              <w:rPr>
+                <w:b/>
+                <w:sz w:val="18"/>
+              </w:rPr>
+              <w:t xml:space="preserve">Ambiguity, not permission.</w:t>
+            </w:r>
+          </w:p>
+        </w:tc>
+      </w:tr>
+      <w:tr>
+        <w:tc>
+          <w:tcPr>
+            <w:tcW w:w="5040" w:type="dxa"/>
+          </w:tcPr>
+          <w:p>
+            <w:pPr>
+              <w:spacing w:before="40" w:after="40"/>
+            </w:pPr>
+            <w:r>
+              <w:rPr>
+                <w:sz w:val="18"/>
+              </w:rPr>
+              <w:t xml:space="preserve">Creative-AI adoption statistics (72–86%)</w:t>
+            </w:r>
+          </w:p>
+        </w:tc>
+        <w:tc>
+          <w:tcPr>
+            <w:tcW w:w="5040" w:type="dxa"/>
+          </w:tcPr>
+          <w:p>
+            <w:pPr>
+              <w:spacing w:before="40" w:after="40"/>
+            </w:pPr>
+            <w:r>
+              <w:rPr>
+                <w:sz w:val="18"/>
+              </w:rPr>
+              <w:t xml:space="preserve">⚠️ Vendor-published surveys (Figma, Envato, Luma) of self-selected creative professionals — directionally consistent, not independent.</w:t>
+            </w:r>
+          </w:p>
+        </w:tc>
+      </w:tr>
+      <w:tr>
+        <w:tc>
+          <w:tcPr>
+            <w:tcW w:w="5040" w:type="dxa"/>
+          </w:tcPr>
+          <w:p>
+            <w:pPr>
+              <w:spacing w:before="40" w:after="40"/>
+            </w:pPr>
+            <w:r>
+              <w:rPr>
+                <w:sz w:val="18"/>
+              </w:rPr>
+              <w:t xml:space="preserve">Hiscox Art &amp; AI figures</w:t>
+            </w:r>
+          </w:p>
+        </w:tc>
+        <w:tc>
+          <w:tcPr>
+            <w:tcW w:w="5040" w:type="dxa"/>
+          </w:tcPr>
+          <w:p>
+            <w:pPr>
+              <w:spacing w:before="40" w:after="40"/>
+            </w:pPr>
+            <w:r>
+              <w:rPr>
+                <w:sz w:val="18"/>
+              </w:rPr>
+              <w:t xml:space="preserve">⚠️ 400+ self-selected respondents, 2024; no later edition found.</w:t>
+            </w:r>
+          </w:p>
+        </w:tc>
+      </w:tr>
+      <w:tr>
+        <w:tc>
+          <w:tcPr>
+            <w:tcW w:w="5040" w:type="dxa"/>
+          </w:tcPr>
+          <w:p>
+            <w:pPr>
+              <w:spacing w:before="40" w:after="40"/>
+            </w:pPr>
+            <w:r>
+              <w:rPr>
+                <w:sz w:val="18"/>
+              </w:rPr>
+              <w:t xml:space="preserve">Saatchi 40%, Etsy/Fiverr fees</w:t>
+            </w:r>
+          </w:p>
+        </w:tc>
+        <w:tc>
+          <w:tcPr>
+            <w:tcW w:w="5040" w:type="dxa"/>
+          </w:tcPr>
+          <w:p>
+            <w:pPr>
+              <w:spacing w:before="40" w:after="40"/>
+            </w:pPr>
+            <w:r>
+              <w:rPr>
+                <w:sz w:val="18"/>
+              </w:rPr>
+              <w:t xml:space="preserve">⚠️ Primary pages 403 to this tool throughout this dossier; figures from agreeing secondary sources.</w:t>
+            </w:r>
+          </w:p>
+        </w:tc>
+      </w:tr>
+      <w:tr>
+        <w:tc>
+          <w:tcPr>
+            <w:tcW w:w="5040" w:type="dxa"/>
+          </w:tcPr>
+          <w:p>
+            <w:pPr>
+              <w:spacing w:before="40" w:after="40"/>
+            </w:pPr>
+            <w:r>
+              <w:rPr>
+                <w:sz w:val="18"/>
+              </w:rPr>
+              <w:t xml:space="preserve">Andersen v. Stability status</w:t>
+            </w:r>
+          </w:p>
+        </w:tc>
+        <w:tc>
+          <w:tcPr>
+            <w:tcW w:w="5040" w:type="dxa"/>
+          </w:tcPr>
+          <w:p>
+            <w:pPr>
+              <w:spacing w:before="40" w:after="40"/>
+            </w:pPr>
+            <w:r>
+              <w:rPr>
+                <w:sz w:val="18"/>
+              </w:rPr>
+              <w:t xml:space="preserve">⚠️ From a law-firm litigation tracker, not the docket.</w:t>
+            </w:r>
+          </w:p>
+        </w:tc>
+      </w:tr>
+      <w:tr>
+        <w:tc>
+          <w:tcPr>
+            <w:tcW w:w="5040" w:type="dxa"/>
+          </w:tcPr>
+          <w:p>
+            <w:pPr>
+              <w:spacing w:before="40" w:after="40"/>
+            </w:pPr>
+            <w:r>
+              <w:rPr>
+                <w:b/>
+                <w:sz w:val="18"/>
+              </w:rPr>
+              <w:t xml:space="preserve">Reddit</w:t>
+            </w:r>
+          </w:p>
+        </w:tc>
+        <w:tc>
+          <w:tcPr>
+            <w:tcW w:w="5040" w:type="dxa"/>
+          </w:tcPr>
+          <w:p>
+            <w:pPr>
+              <w:spacing w:before="40" w:after="40"/>
+            </w:pPr>
+            <w:r>
+              <w:rPr>
+                <w:sz w:val="18"/>
+              </w:rPr>
+              <w:t xml:space="preserve">❌ Blocked throughout — and artist sentiment on AI briefs is discussed there more than anywhere I can reach. </w:t>
+            </w:r>
+            <w:r>
+              <w:rPr>
+                <w:b/>
+                <w:sz w:val="18"/>
+              </w:rPr>
+              <w:t xml:space="preserve">The single biggest evidence gap in this dossier.</w:t>
+            </w:r>
+          </w:p>
+        </w:tc>
+      </w:tr>
+      <w:tr>
+        <w:tc>
+          <w:tcPr>
+            <w:tcW w:w="5040" w:type="dxa"/>
+          </w:tcPr>
+          <w:p>
+            <w:pPr>
+              <w:spacing w:before="40" w:after="40"/>
+            </w:pPr>
+            <w:r>
+              <w:rPr>
+                <w:sz w:val="18"/>
+              </w:rPr>
+              <w:t xml:space="preserve">Gemini 2.5 Flash Image capabilities</w:t>
+            </w:r>
+          </w:p>
+        </w:tc>
+        <w:tc>
+          <w:tcPr>
+            <w:tcW w:w="5040" w:type="dxa"/>
+          </w:tcPr>
+          <w:p>
+            <w:pPr>
+              <w:spacing w:before="40" w:after="40"/>
+            </w:pPr>
+            <w:r>
+              <w:rPr>
+                <w:sz w:val="18"/>
+              </w:rPr>
+              <w:t xml:space="preserve">⚠️ Vendor-stated at launch; I did not test them.</w:t>
             </w:r>
           </w:p>
         </w:tc>

</xml_diff>